<commit_message>
Plan: add two-path overview figure to section 5
Co-Authored-By: Claude Opus 5.5 <noreply@anthropic.com>
</commit_message>
<xml_diff>
--- a/docs/dsp-poc-plan-2026-10-28.docx
+++ b/docs/dsp-poc-plan-2026-10-28.docx
@@ -1501,7 +1501,7 @@
       </w:tr>
     </w:tbl>
     <w:bookmarkEnd w:id="23"/>
-    <w:bookmarkStart w:id="24" w:name="what-the-poc-is"/>
+    <w:bookmarkStart w:id="27" w:name="what-the-poc-is"/>
     <w:p>
       <w:pPr>
         <w:pStyle w:val="Heading2"/>
@@ -1516,6 +1516,61 @@
       </w:pPr>
       <w:r>
         <w:t xml:space="preserve">One pipeline, one transform, two writers.</w:t>
+      </w:r>
+    </w:p>
+    <w:p>
+      <w:pPr>
+        <w:pStyle w:val="CaptionedFigure"/>
+      </w:pPr>
+      <w:r>
+        <w:drawing>
+          <wp:inline>
+            <wp:extent cx="5334000" cy="2531389"/>
+            <wp:effectExtent b="0" l="0" r="0" t="0"/>
+            <wp:docPr descr="One transform, two outputs. Solid: Path A, the deliverable. Dashed: Path B, the time-boxed S3 Tables trial. Nothing on Path A reads from Path B." title="" id="25" name="Picture"/>
+            <a:graphic>
+              <a:graphicData uri="http://schemas.openxmlformats.org/drawingml/2006/picture">
+                <pic:pic>
+                  <pic:nvPicPr>
+                    <pic:cNvPr descr="diagrams/dsp-poc-two-paths-2026-10-28.png" id="26" name="Picture"/>
+                    <pic:cNvPicPr>
+                      <a:picLocks noChangeArrowheads="1" noChangeAspect="1"/>
+                    </pic:cNvPicPr>
+                  </pic:nvPicPr>
+                  <pic:blipFill>
+                    <a:blip r:embed="rId24"/>
+                    <a:stretch>
+                      <a:fillRect/>
+                    </a:stretch>
+                  </pic:blipFill>
+                  <pic:spPr bwMode="auto">
+                    <a:xfrm>
+                      <a:off x="0" y="0"/>
+                      <a:ext cx="5334000" cy="2531389"/>
+                    </a:xfrm>
+                    <a:prstGeom prst="rect">
+                      <a:avLst/>
+                    </a:prstGeom>
+                    <a:noFill/>
+                    <a:ln w="9525">
+                      <a:noFill/>
+                      <a:headEnd/>
+                      <a:tailEnd/>
+                    </a:ln>
+                  </pic:spPr>
+                </pic:pic>
+              </a:graphicData>
+            </a:graphic>
+          </wp:inline>
+        </w:drawing>
+      </w:r>
+    </w:p>
+    <w:p>
+      <w:pPr>
+        <w:pStyle w:val="ImageCaption"/>
+      </w:pPr>
+      <w:r>
+        <w:t xml:space="preserve">One transform, two outputs. Solid: Path A, the deliverable. Dashed: Path B, the time-boxed S3 Tables trial. Nothing on Path A reads from Path B.</w:t>
       </w:r>
     </w:p>
     <w:p>
@@ -1624,8 +1679,8 @@
         <w:t xml:space="preserve">.</w:t>
       </w:r>
     </w:p>
-    <w:bookmarkEnd w:id="24"/>
-    <w:bookmarkStart w:id="26" w:name="why-these-two-paths"/>
+    <w:bookmarkEnd w:id="27"/>
+    <w:bookmarkStart w:id="29" w:name="why-these-two-paths"/>
     <w:p>
       <w:pPr>
         <w:pStyle w:val="Heading2"/>
@@ -1805,7 +1860,7 @@
         <w:t xml:space="preserve">.</w:t>
       </w:r>
     </w:p>
-    <w:bookmarkStart w:id="25" w:name="alternatives-considered"/>
+    <w:bookmarkStart w:id="28" w:name="alternatives-considered"/>
     <w:p>
       <w:pPr>
         <w:pStyle w:val="Heading3"/>
@@ -2002,9 +2057,9 @@
         </w:tc>
       </w:tr>
     </w:tbl>
-    <w:bookmarkEnd w:id="25"/>
-    <w:bookmarkEnd w:id="26"/>
-    <w:bookmarkStart w:id="28" w:name="addressing-the-concerns-up-front"/>
+    <w:bookmarkEnd w:id="28"/>
+    <w:bookmarkEnd w:id="29"/>
+    <w:bookmarkStart w:id="31" w:name="addressing-the-concerns-up-front"/>
     <w:p>
       <w:pPr>
         <w:pStyle w:val="Heading2"/>
@@ -2247,7 +2302,7 @@
         </w:tc>
       </w:tr>
     </w:tbl>
-    <w:bookmarkStart w:id="27" w:name="what-transfers-and-what-doesnt"/>
+    <w:bookmarkStart w:id="30" w:name="what-transfers-and-what-doesnt"/>
     <w:p>
       <w:pPr>
         <w:pStyle w:val="Heading3"/>
@@ -2484,9 +2539,9 @@
         <w:t xml:space="preserve">Not covered by the template: streaming feeds such as the new DSP’s full avails stream, which Scott expects to get its own streaming solution.</w:t>
       </w:r>
     </w:p>
-    <w:bookmarkEnd w:id="27"/>
-    <w:bookmarkEnd w:id="28"/>
-    <w:bookmarkStart w:id="29" w:name="assumptions"/>
+    <w:bookmarkEnd w:id="30"/>
+    <w:bookmarkEnd w:id="31"/>
+    <w:bookmarkStart w:id="32" w:name="assumptions"/>
     <w:p>
       <w:pPr>
         <w:pStyle w:val="Heading2"/>
@@ -2854,8 +2909,8 @@
         </w:tc>
       </w:tr>
     </w:tbl>
-    <w:bookmarkEnd w:id="29"/>
-    <w:bookmarkStart w:id="30" w:name="path-a-the-parquet-contract"/>
+    <w:bookmarkEnd w:id="32"/>
+    <w:bookmarkStart w:id="33" w:name="path-a-the-parquet-contract"/>
     <w:p>
       <w:pPr>
         <w:pStyle w:val="Heading2"/>
@@ -3043,8 +3098,8 @@
         <w:t xml:space="preserve">Path A fails if the contract can’t be produced reliably by 11/07: wrong or missing files, non-repeatable reruns, or runtime the hourly cadence can’t absorb. Fallback: the same transform runs from the Node heartbeat on the EC2 (Jesse OK’d that route on 10/23), so the contract still ships.</w:t>
       </w:r>
     </w:p>
-    <w:bookmarkEnd w:id="30"/>
-    <w:bookmarkStart w:id="31" w:name="path-b-the-s3-tables-trial"/>
+    <w:bookmarkEnd w:id="33"/>
+    <w:bookmarkStart w:id="34" w:name="path-b-the-s3-tables-trial"/>
     <w:p>
       <w:pPr>
         <w:pStyle w:val="Heading2"/>
@@ -3497,8 +3552,8 @@
         <w:t xml:space="preserve">Proposed rule: if B isn’t writing rows that match A by end of day Thu 10/29, it comes out of Monday’s demo, A ships alone, and B resumes only after 11/07 if Scott and Jesse want it.</w:t>
       </w:r>
     </w:p>
-    <w:bookmarkEnd w:id="31"/>
-    <w:bookmarkStart w:id="32" w:name="why-its-worth-doing"/>
+    <w:bookmarkEnd w:id="34"/>
+    <w:bookmarkStart w:id="35" w:name="why-its-worth-doing"/>
     <w:p>
       <w:pPr>
         <w:pStyle w:val="Heading2"/>
@@ -3636,8 +3691,8 @@
         <w:t xml:space="preserve">[TBD: AWS estimate. Expected to be small at POC volume: about 14 scheduled runs a day (sandbox hours, weekdays), a few GB in S3; the sandbox already stops nightly.]</w:t>
       </w:r>
     </w:p>
-    <w:bookmarkEnd w:id="32"/>
-    <w:bookmarkStart w:id="33" w:name="not-in-scope-for-monday"/>
+    <w:bookmarkEnd w:id="35"/>
+    <w:bookmarkStart w:id="36" w:name="not-in-scope-for-monday"/>
     <w:p>
       <w:pPr>
         <w:pStyle w:val="Heading2"/>
@@ -3751,8 +3806,8 @@
         <w:t xml:space="preserve">Anything for the new DSP (AdKernel) or its avails stream</w:t>
       </w:r>
     </w:p>
-    <w:bookmarkEnd w:id="33"/>
-    <w:bookmarkStart w:id="34" w:name="decisions-made-and-open-questions"/>
+    <w:bookmarkEnd w:id="36"/>
+    <w:bookmarkStart w:id="37" w:name="decisions-made-and-open-questions"/>
     <w:p>
       <w:pPr>
         <w:pStyle w:val="Heading2"/>
@@ -4082,8 +4137,8 @@
         </w:tc>
       </w:tr>
     </w:tbl>
-    <w:bookmarkEnd w:id="34"/>
-    <w:bookmarkStart w:id="35" w:name="next-steps-after-the-demo"/>
+    <w:bookmarkEnd w:id="37"/>
+    <w:bookmarkStart w:id="38" w:name="next-steps-after-the-demo"/>
     <w:p>
       <w:pPr>
         <w:pStyle w:val="Heading2"/>
@@ -4158,8 +4213,8 @@
         <w:t xml:space="preserve">hand over, with the runbook, and point the warehouse at the contract output.</w:t>
       </w:r>
     </w:p>
-    <w:bookmarkEnd w:id="35"/>
-    <w:bookmarkStart w:id="36" w:name="appendix-sources"/>
+    <w:bookmarkEnd w:id="38"/>
+    <w:bookmarkStart w:id="39" w:name="appendix-sources"/>
     <w:p>
       <w:pPr>
         <w:pStyle w:val="Heading2"/>
@@ -4288,7 +4343,7 @@
         <w:t xml:space="preserve">.</w:t>
       </w:r>
     </w:p>
-    <w:bookmarkEnd w:id="36"/>
+    <w:bookmarkEnd w:id="39"/>
     <w:sectPr>
       <w:pgMar w:bottom="720" w:footer="432" w:gutter="0" w:header="432" w:left="720" w:right="720" w:top="720"/>
     </w:sectPr>

</xml_diff>

<commit_message>
Plan: 'Jesse and team' as reviewers/owners; queue Cillian's lock answer
Co-Authored-By: Claude Opus 5.5 <noreply@anthropic.com>
</commit_message>
<xml_diff>
--- a/docs/dsp-poc-plan-2026-10-28.docx
+++ b/docs/dsp-poc-plan-2026-10-28.docx
@@ -3002,7 +3002,7 @@
           <w:b/>
           <w:bCs/>
         </w:rPr>
-        <w:t xml:space="preserve">[TBD: output schema draft, for Jesse’s review]</w:t>
+        <w:t xml:space="preserve">[TBD: output schema draft, for Jesse and team to review]</w:t>
       </w:r>
       <w:r>
         <w:t xml:space="preserve">. Empty hours produce an empty file, not a missing one.</w:t>
@@ -3710,7 +3710,7 @@
         </w:numPr>
       </w:pPr>
       <w:r>
-        <w:t xml:space="preserve">Node heartbeat change (the POC uses a scheduler stand-in; the change comes after Jesse’s review)</w:t>
+        <w:t xml:space="preserve">Node heartbeat change (the POC uses a scheduler stand-in; the change comes after Jesse and team review it)</w:t>
       </w:r>
     </w:p>
     <w:p>
@@ -3923,7 +3923,7 @@
               <w:jc w:val="left"/>
             </w:pPr>
             <w:r>
-              <w:t xml:space="preserve">Jesse</w:t>
+              <w:t xml:space="preserve">Jesse and team</w:t>
             </w:r>
           </w:p>
         </w:tc>
@@ -3949,7 +3949,7 @@
               <w:jc w:val="left"/>
             </w:pPr>
             <w:r>
-              <w:t xml:space="preserve">Jesse</w:t>
+              <w:t xml:space="preserve">Jesse and team</w:t>
             </w:r>
           </w:p>
         </w:tc>
@@ -3975,7 +3975,7 @@
               <w:jc w:val="left"/>
             </w:pPr>
             <w:r>
-              <w:t xml:space="preserve">Jesse</w:t>
+              <w:t xml:space="preserve">Jesse and team</w:t>
             </w:r>
           </w:p>
         </w:tc>
@@ -4001,7 +4001,7 @@
               <w:jc w:val="left"/>
             </w:pPr>
             <w:r>
-              <w:t xml:space="preserve">Jesse, Cillian</w:t>
+              <w:t xml:space="preserve">Jesse and team (Cillian)</w:t>
             </w:r>
           </w:p>
         </w:tc>
@@ -4027,7 +4027,7 @@
               <w:jc w:val="left"/>
             </w:pPr>
             <w:r>
-              <w:t xml:space="preserve">Jesse, Cillian</w:t>
+              <w:t xml:space="preserve">Jesse and team (Cillian)</w:t>
             </w:r>
           </w:p>
         </w:tc>
@@ -4053,7 +4053,7 @@
               <w:jc w:val="left"/>
             </w:pPr>
             <w:r>
-              <w:t xml:space="preserve">Jesse</w:t>
+              <w:t xml:space="preserve">Jesse and team</w:t>
             </w:r>
           </w:p>
         </w:tc>
@@ -4105,7 +4105,7 @@
               <w:jc w:val="left"/>
             </w:pPr>
             <w:r>
-              <w:t xml:space="preserve">Jesse</w:t>
+              <w:t xml:space="preserve">Jesse and team</w:t>
             </w:r>
           </w:p>
         </w:tc>
@@ -4131,7 +4131,7 @@
               <w:jc w:val="left"/>
             </w:pPr>
             <w:r>
-              <w:t xml:space="preserve">Jesse</w:t>
+              <w:t xml:space="preserve">Jesse and team</w:t>
             </w:r>
           </w:p>
         </w:tc>

</xml_diff>

<commit_message>
Plan: compare POC lock with Cillian's Glue job pattern
Co-Authored-By: Claude Opus 5.5 <noreply@anthropic.com>
</commit_message>
<xml_diff>
--- a/docs/dsp-poc-plan-2026-10-28.docx
+++ b/docs/dsp-poc-plan-2026-10-28.docx
@@ -1153,19 +1153,19 @@
               <w:jc w:val="left"/>
             </w:pPr>
             <w:r>
-              <w:t xml:space="preserve">Step Function handles the lock; discard if still running (Cillian’s Glue pattern)</w:t>
-            </w:r>
-          </w:p>
-        </w:tc>
-        <w:tc>
-          <w:tcPr/>
-          <w:p>
-            <w:pPr>
-              <w:pStyle w:val="Compact"/>
-              <w:jc w:val="left"/>
-            </w:pPr>
-            <w:r>
-              <w:t xml:space="preserve">Jesse, 10/23</w:t>
+              <w:t xml:space="preserve">Step Function handles the lock: one run at a time, as Cillian’s Glue jobs do</w:t>
+            </w:r>
+          </w:p>
+        </w:tc>
+        <w:tc>
+          <w:tcPr/>
+          <w:p>
+            <w:pPr>
+              <w:pStyle w:val="Compact"/>
+              <w:jc w:val="left"/>
+            </w:pPr>
+            <w:r>
+              <w:t xml:space="preserve">Jesse, 10/23; Cillian, 10/28</w:t>
             </w:r>
           </w:p>
         </w:tc>
@@ -1186,7 +1186,7 @@
               <w:t xml:space="preserve"> </w:t>
             </w:r>
             <w:r>
-              <w:t xml:space="preserve">state, 25-minute timeout</w:t>
+              <w:t xml:space="preserve">state, 25-minute timeout (section 5)</w:t>
             </w:r>
           </w:p>
         </w:tc>
@@ -1501,7 +1501,7 @@
       </w:tr>
     </w:tbl>
     <w:bookmarkEnd w:id="23"/>
-    <w:bookmarkStart w:id="27" w:name="what-the-poc-is"/>
+    <w:bookmarkStart w:id="28" w:name="what-the-poc-is"/>
     <w:p>
       <w:pPr>
         <w:pStyle w:val="Heading2"/>
@@ -1679,14 +1679,13 @@
         <w:t xml:space="preserve">.</w:t>
       </w:r>
     </w:p>
-    <w:bookmarkEnd w:id="27"/>
-    <w:bookmarkStart w:id="29" w:name="why-these-two-paths"/>
-    <w:p>
-      <w:pPr>
-        <w:pStyle w:val="Heading2"/>
-      </w:pPr>
-      <w:r>
-        <w:t xml:space="preserve">6. Why these two paths</w:t>
+    <w:bookmarkStart w:id="27" w:name="Xdf11a57172ef883eaf3536ee93015573cf78546"/>
+    <w:p>
+      <w:pPr>
+        <w:pStyle w:val="Heading3"/>
+      </w:pPr>
+      <w:r>
+        <w:t xml:space="preserve">How the lock works, compared with Cillian’s Glue jobs</w:t>
       </w:r>
     </w:p>
     <w:p>
@@ -1694,860 +1693,7 @@
         <w:pStyle w:val="FirstParagraph"/>
       </w:pPr>
       <w:r>
-        <w:rPr>
-          <w:b/>
-          <w:bCs/>
-        </w:rPr>
-        <w:t xml:space="preserve">Path A is the</w:t>
-      </w:r>
-      <w:r>
-        <w:rPr>
-          <w:b/>
-          <w:bCs/>
-        </w:rPr>
-        <w:t xml:space="preserve"> </w:t>
-      </w:r>
-      <w:r>
-        <w:rPr>
-          <w:b/>
-          <w:bCs/>
-        </w:rPr>
-        <w:t xml:space="preserve">“</w:t>
-      </w:r>
-      <w:r>
-        <w:rPr>
-          <w:b/>
-          <w:bCs/>
-        </w:rPr>
-        <w:t xml:space="preserve">do it easy</w:t>
-      </w:r>
-      <w:r>
-        <w:rPr>
-          <w:b/>
-          <w:bCs/>
-        </w:rPr>
-        <w:t xml:space="preserve">”</w:t>
-      </w:r>
-      <w:r>
-        <w:rPr>
-          <w:b/>
-          <w:bCs/>
-        </w:rPr>
-        <w:t xml:space="preserve"> </w:t>
-      </w:r>
-      <w:r>
-        <w:rPr>
-          <w:b/>
-          <w:bCs/>
-        </w:rPr>
-        <w:t xml:space="preserve">path.</w:t>
-      </w:r>
-      <w:r>
-        <w:t xml:space="preserve"> </w:t>
-      </w:r>
-      <w:r>
-        <w:t xml:space="preserve">It is file in, file out, Parquet, whole-file replacement: the shape the warehouse already reads. Jesse’s caution on 10/26 (</w:t>
-      </w:r>
-      <w:r>
-        <w:t xml:space="preserve">“</w:t>
-      </w:r>
-      <w:r>
-        <w:t xml:space="preserve">be intentional with where we experiment … do we just do it easy?</w:t>
-      </w:r>
-      <w:r>
-        <w:t xml:space="preserve">”</w:t>
-      </w:r>
-      <w:r>
-        <w:t xml:space="preserve">) is exactly why A stands on its own.</w:t>
-      </w:r>
-    </w:p>
-    <w:p>
-      <w:pPr>
-        <w:pStyle w:val="BodyText"/>
-      </w:pPr>
-      <w:r>
-        <w:rPr>
-          <w:b/>
-          <w:bCs/>
-        </w:rPr>
-        <w:t xml:space="preserve">Path B is evidence for a decision the team already plans to make.</w:t>
-      </w:r>
-      <w:r>
-        <w:t xml:space="preserve"> </w:t>
-      </w:r>
-      <w:r>
-        <w:t xml:space="preserve">Jesse said on 10/20 that there will be a data lake, and the choice between S3 Tables, Iceberg managed in-house, or Snowflake is a conversation for</w:t>
-      </w:r>
-      <w:r>
-        <w:t xml:space="preserve"> </w:t>
-      </w:r>
-      <w:r>
-        <w:t xml:space="preserve">“</w:t>
-      </w:r>
-      <w:r>
-        <w:t xml:space="preserve">after you guys build your first couple pipelines</w:t>
-      </w:r>
-      <w:r>
-        <w:t xml:space="preserve">”</w:t>
-      </w:r>
-      <w:r>
-        <w:t xml:space="preserve">. Path B gives that conversation real numbers. Because the transform is shared, B costs one extra writer, not a second pipeline.</w:t>
-      </w:r>
-    </w:p>
-    <w:p>
-      <w:pPr>
-        <w:pStyle w:val="BodyText"/>
-      </w:pPr>
-      <w:r>
-        <w:rPr>
-          <w:b/>
-          <w:bCs/>
-        </w:rPr>
-        <w:t xml:space="preserve">Why build them together.</w:t>
-      </w:r>
-      <w:r>
-        <w:t xml:space="preserve"> </w:t>
-      </w:r>
-      <w:r>
-        <w:t xml:space="preserve">The comparison is only fair if both sides get identical input and logic. Building B later would mean re-running the transform and arguing about differences that have nothing to do with storage.</w:t>
-      </w:r>
-    </w:p>
-    <w:p>
-      <w:pPr>
-        <w:pStyle w:val="BodyText"/>
-      </w:pPr>
-      <w:r>
-        <w:rPr>
-          <w:b/>
-          <w:bCs/>
-        </w:rPr>
-        <w:t xml:space="preserve">Why serverless (Step Functions + Lambda).</w:t>
-      </w:r>
-      <w:r>
-        <w:t xml:space="preserve"> </w:t>
-      </w:r>
-      <w:r>
-        <w:t xml:space="preserve">The work is a bounded, repeatable unit (one file-hour) on a schedule with no state between runs. Step Functions gives the lock, retries and run history that would otherwise be hand-built, and a backfill fans out without a cluster. It also fits the direction Jesse set on 10/23: after this pipeline,</w:t>
-      </w:r>
-      <w:r>
-        <w:t xml:space="preserve"> </w:t>
-      </w:r>
-      <w:r>
-        <w:t xml:space="preserve">“</w:t>
-      </w:r>
-      <w:r>
-        <w:t xml:space="preserve">get off the single node runtime</w:t>
-      </w:r>
-      <w:r>
-        <w:t xml:space="preserve">”</w:t>
-      </w:r>
-      <w:r>
-        <w:t xml:space="preserve">; the monolith</w:t>
-      </w:r>
-      <w:r>
-        <w:t xml:space="preserve"> </w:t>
-      </w:r>
-      <w:r>
-        <w:t xml:space="preserve">“</w:t>
-      </w:r>
-      <w:r>
-        <w:t xml:space="preserve">can’t stay a monolith forever</w:t>
-      </w:r>
-      <w:r>
-        <w:t xml:space="preserve">”</w:t>
-      </w:r>
-      <w:r>
-        <w:t xml:space="preserve">.</w:t>
-      </w:r>
-    </w:p>
-    <w:bookmarkStart w:id="28" w:name="alternatives-considered"/>
-    <w:p>
-      <w:pPr>
-        <w:pStyle w:val="Heading3"/>
-      </w:pPr>
-      <w:r>
-        <w:t xml:space="preserve">Alternatives considered</w:t>
-      </w:r>
-    </w:p>
-    <w:tbl>
-      <w:tblPr>
-        <w:tblStyle w:val="Table"/>
-        <w:tblW w:type="pct" w:w="5000"/>
-        <w:jc w:val="left"/>
-        <w:tblLayout w:type="fixed"/>
-        <w:tblLook w:firstRow="1" w:lastRow="0" w:firstColumn="0" w:lastColumn="0" w:noHBand="0" w:noVBand="0" w:val="0020"/>
-      </w:tblPr>
-      <w:tblGrid>
-        <w:gridCol w:w="3960"/>
-        <w:gridCol w:w="3960"/>
-      </w:tblGrid>
-      <w:tr>
-        <w:trPr>
-          <w:tblHeader w:val="on"/>
-        </w:trPr>
-        <w:tc>
-          <w:tcPr/>
-          <w:p>
-            <w:pPr>
-              <w:pStyle w:val="Compact"/>
-              <w:jc w:val="left"/>
-            </w:pPr>
-            <w:r>
-              <w:t xml:space="preserve">Option</w:t>
-            </w:r>
-          </w:p>
-        </w:tc>
-        <w:tc>
-          <w:tcPr/>
-          <w:p>
-            <w:pPr>
-              <w:pStyle w:val="Compact"/>
-              <w:jc w:val="left"/>
-            </w:pPr>
-            <w:r>
-              <w:t xml:space="preserve">Why not (for this POC)</w:t>
-            </w:r>
-          </w:p>
-        </w:tc>
-      </w:tr>
-      <w:tr>
-        <w:tc>
-          <w:tcPr/>
-          <w:p>
-            <w:pPr>
-              <w:pStyle w:val="Compact"/>
-              <w:jc w:val="left"/>
-            </w:pPr>
-            <w:r>
-              <w:t xml:space="preserve">Node heartbeat shells out to DuckDB on the EC2</w:t>
-            </w:r>
-          </w:p>
-        </w:tc>
-        <w:tc>
-          <w:tcPr/>
-          <w:p>
-            <w:pPr>
-              <w:pStyle w:val="Compact"/>
-              <w:jc w:val="left"/>
-            </w:pPr>
-            <w:r>
-              <w:t xml:space="preserve">Fastest to stand up, and Jesse said the EC2 has room. But the lock, retries and run history would be hand-built, and it ties the work to the single node.</w:t>
-            </w:r>
-            <w:r>
-              <w:t xml:space="preserve"> </w:t>
-            </w:r>
-            <w:r>
-              <w:rPr>
-                <w:b/>
-                <w:bCs/>
-              </w:rPr>
-              <w:t xml:space="preserve">Kept as the fallback</w:t>
-            </w:r>
-            <w:r>
-              <w:t xml:space="preserve"> </w:t>
-            </w:r>
-            <w:r>
-              <w:t xml:space="preserve">(section 9).</w:t>
-            </w:r>
-          </w:p>
-        </w:tc>
-      </w:tr>
-      <w:tr>
-        <w:tc>
-          <w:tcPr/>
-          <w:p>
-            <w:pPr>
-              <w:pStyle w:val="Compact"/>
-              <w:jc w:val="left"/>
-            </w:pPr>
-            <w:r>
-              <w:t xml:space="preserve">MWAA (managed Airflow)</w:t>
-            </w:r>
-          </w:p>
-        </w:tc>
-        <w:tc>
-          <w:tcPr/>
-          <w:p>
-            <w:pPr>
-              <w:pStyle w:val="Compact"/>
-              <w:jc w:val="left"/>
-            </w:pPr>
-            <w:r>
-              <w:t xml:space="preserve">Jesse: conflicts with the current cron runner.</w:t>
-            </w:r>
-          </w:p>
-        </w:tc>
-      </w:tr>
-      <w:tr>
-        <w:tc>
-          <w:tcPr/>
-          <w:p>
-            <w:pPr>
-              <w:pStyle w:val="Compact"/>
-              <w:jc w:val="left"/>
-            </w:pPr>
-            <w:r>
-              <w:t xml:space="preserve">Airflow first</w:t>
-            </w:r>
-          </w:p>
-        </w:tc>
-        <w:tc>
-          <w:tcPr/>
-          <w:p>
-            <w:pPr>
-              <w:pStyle w:val="Compact"/>
-              <w:jc w:val="left"/>
-            </w:pPr>
-            <w:r>
-              <w:t xml:space="preserve">Orchestration is the part that affects everyone; it shouldn’t lead (Jesse to David, 10/26-27). This POC plugs into the existing heartbeat instead of replacing it.</w:t>
-            </w:r>
-          </w:p>
-        </w:tc>
-      </w:tr>
-      <w:tr>
-        <w:tc>
-          <w:tcPr/>
-          <w:p>
-            <w:pPr>
-              <w:pStyle w:val="Compact"/>
-              <w:jc w:val="left"/>
-            </w:pPr>
-            <w:r>
-              <w:t xml:space="preserve">dbt</w:t>
-            </w:r>
-          </w:p>
-        </w:tc>
-        <w:tc>
-          <w:tcPr/>
-          <w:p>
-            <w:pPr>
-              <w:pStyle w:val="Compact"/>
-              <w:jc w:val="left"/>
-            </w:pPr>
-            <w:r>
-              <w:t xml:space="preserve">A model graph for warehouse-side SQL; it doesn’t handle the trigger, lock, manifest or quarantine. Fits downstream, not here.</w:t>
-            </w:r>
-          </w:p>
-        </w:tc>
-      </w:tr>
-      <w:tr>
-        <w:tc>
-          <w:tcPr/>
-          <w:p>
-            <w:pPr>
-              <w:pStyle w:val="Compact"/>
-              <w:jc w:val="left"/>
-            </w:pPr>
-            <w:r>
-              <w:t xml:space="preserve">Glue / Spark</w:t>
-            </w:r>
-          </w:p>
-        </w:tc>
-        <w:tc>
-          <w:tcPr/>
-          <w:p>
-            <w:pPr>
-              <w:pStyle w:val="Compact"/>
-              <w:jc w:val="left"/>
-            </w:pPr>
-            <w:r>
-              <w:t xml:space="preserve">More machinery than hourly files of this size need.</w:t>
-            </w:r>
-          </w:p>
-        </w:tc>
-      </w:tr>
-    </w:tbl>
-    <w:bookmarkEnd w:id="28"/>
-    <w:bookmarkEnd w:id="29"/>
-    <w:bookmarkStart w:id="31" w:name="addressing-the-concerns-up-front"/>
-    <w:p>
-      <w:pPr>
-        <w:pStyle w:val="Heading2"/>
-      </w:pPr>
-      <w:r>
-        <w:t xml:space="preserve">7. Addressing the concerns up front</w:t>
-      </w:r>
-    </w:p>
-    <w:tbl>
-      <w:tblPr>
-        <w:tblStyle w:val="Table"/>
-        <w:tblW w:type="pct" w:w="5000"/>
-        <w:jc w:val="left"/>
-        <w:tblLayout w:type="fixed"/>
-        <w:tblLook w:firstRow="1" w:lastRow="0" w:firstColumn="0" w:lastColumn="0" w:noHBand="0" w:noVBand="0" w:val="0020"/>
-      </w:tblPr>
-      <w:tblGrid>
-        <w:gridCol w:w="3960"/>
-        <w:gridCol w:w="3960"/>
-      </w:tblGrid>
-      <w:tr>
-        <w:trPr>
-          <w:tblHeader w:val="on"/>
-        </w:trPr>
-        <w:tc>
-          <w:tcPr/>
-          <w:p>
-            <w:pPr>
-              <w:pStyle w:val="Compact"/>
-              <w:jc w:val="left"/>
-            </w:pPr>
-            <w:r>
-              <w:t xml:space="preserve">Concern</w:t>
-            </w:r>
-          </w:p>
-        </w:tc>
-        <w:tc>
-          <w:tcPr/>
-          <w:p>
-            <w:pPr>
-              <w:pStyle w:val="Compact"/>
-              <w:jc w:val="left"/>
-            </w:pPr>
-            <w:r>
-              <w:t xml:space="preserve">Answer</w:t>
-            </w:r>
-          </w:p>
-        </w:tc>
-      </w:tr>
-      <w:tr>
-        <w:tc>
-          <w:tcPr/>
-          <w:p>
-            <w:pPr>
-              <w:pStyle w:val="Compact"/>
-              <w:jc w:val="left"/>
-            </w:pPr>
-            <w:r>
-              <w:t xml:space="preserve">“</w:t>
-            </w:r>
-            <w:r>
-              <w:t xml:space="preserve">File in, file out; you’re not building a data lake</w:t>
-            </w:r>
-            <w:r>
-              <w:t xml:space="preserve">”</w:t>
-            </w:r>
-            <w:r>
-              <w:t xml:space="preserve"> </w:t>
-            </w:r>
-            <w:r>
-              <w:t xml:space="preserve">(Jesse, 10/23)</w:t>
-            </w:r>
-          </w:p>
-        </w:tc>
-        <w:tc>
-          <w:tcPr/>
-          <w:p>
-            <w:pPr>
-              <w:pStyle w:val="Compact"/>
-              <w:jc w:val="left"/>
-            </w:pPr>
-            <w:r>
-              <w:t xml:space="preserve">Path A is file in, file out. Path B is a separate, time-boxed trial branch that A never reads from.</w:t>
-            </w:r>
-          </w:p>
-        </w:tc>
-      </w:tr>
-      <w:tr>
-        <w:tc>
-          <w:tcPr/>
-          <w:p>
-            <w:pPr>
-              <w:pStyle w:val="Compact"/>
-              <w:jc w:val="left"/>
-            </w:pPr>
-            <w:r>
-              <w:t xml:space="preserve">“</w:t>
-            </w:r>
-            <w:r>
-              <w:t xml:space="preserve">Be intentional with where we experiment</w:t>
-            </w:r>
-            <w:r>
-              <w:t xml:space="preserve">”</w:t>
-            </w:r>
-            <w:r>
-              <w:t xml:space="preserve"> </w:t>
-            </w:r>
-            <w:r>
-              <w:t xml:space="preserve">(Jesse, 10/26)</w:t>
-            </w:r>
-          </w:p>
-        </w:tc>
-        <w:tc>
-          <w:tcPr/>
-          <w:p>
-            <w:pPr>
-              <w:pStyle w:val="Compact"/>
-              <w:jc w:val="left"/>
-            </w:pPr>
-            <w:r>
-              <w:t xml:space="preserve">The experiment is one writer with a time-box and a stop rule. Dropping it costs A nothing.</w:t>
-            </w:r>
-          </w:p>
-        </w:tc>
-      </w:tr>
-      <w:tr>
-        <w:tc>
-          <w:tcPr/>
-          <w:p>
-            <w:pPr>
-              <w:pStyle w:val="Compact"/>
-              <w:jc w:val="left"/>
-            </w:pPr>
-            <w:r>
-              <w:t xml:space="preserve">“</w:t>
-            </w:r>
-            <w:r>
-              <w:t xml:space="preserve">What you’re working on now will not transfer</w:t>
-            </w:r>
-            <w:r>
-              <w:t xml:space="preserve">”</w:t>
-            </w:r>
-            <w:r>
-              <w:t xml:space="preserve"> </w:t>
-            </w:r>
-            <w:r>
-              <w:t xml:space="preserve">to the new DSP (Jesse, 10/21)</w:t>
-            </w:r>
-          </w:p>
-        </w:tc>
-        <w:tc>
-          <w:tcPr/>
-          <w:p>
-            <w:pPr>
-              <w:pStyle w:val="Compact"/>
-              <w:jc w:val="left"/>
-            </w:pPr>
-            <w:r>
-              <w:t xml:space="preserve">Agreed for the DSP-specific parts: parsing, cleanup, key rules and schema are for the current feed only, and nothing in the POC anticipates AdKernel. What can transfer is the mechanism around the transform (table below), for the team’s other scheduled, file-based feeds.</w:t>
-            </w:r>
-          </w:p>
-        </w:tc>
-      </w:tr>
-      <w:tr>
-        <w:tc>
-          <w:tcPr/>
-          <w:p>
-            <w:pPr>
-              <w:pStyle w:val="Compact"/>
-              <w:jc w:val="left"/>
-            </w:pPr>
-            <w:r>
-              <w:t xml:space="preserve">Iceberg’s benefits show up at terabyte scale with upserts, not on 4 MB files (Jesse, 10/27)</w:t>
-            </w:r>
-          </w:p>
-        </w:tc>
-        <w:tc>
-          <w:tcPr/>
-          <w:p>
-            <w:pPr>
-              <w:pStyle w:val="Compact"/>
-              <w:jc w:val="left"/>
-            </w:pPr>
-            <w:r>
-              <w:t xml:space="preserve">Agreed. B isn’t about speed at today’s size. It’s the first real evidence on S3 Tables for our batch pipelines, one input into the data-lake decision, not the decision itself.</w:t>
-            </w:r>
-          </w:p>
-        </w:tc>
-      </w:tr>
-      <w:tr>
-        <w:tc>
-          <w:tcPr/>
-          <w:p>
-            <w:pPr>
-              <w:pStyle w:val="Compact"/>
-              <w:jc w:val="left"/>
-            </w:pPr>
-            <w:r>
-              <w:t xml:space="preserve">Like-for-like: single-digit shifts in the top metrics are a big business change (Jesse, 10/27)</w:t>
-            </w:r>
-          </w:p>
-        </w:tc>
-        <w:tc>
-          <w:tcPr/>
-          <w:p>
-            <w:pPr>
-              <w:pStyle w:val="Compact"/>
-              <w:jc w:val="left"/>
-            </w:pPr>
-            <w:r>
-              <w:t xml:space="preserve">A passes data through: no NPI filtering for 1.5, no bot filtering. A success criterion is that A’s row counts reconcile with the raw files, with every difference explained by a quarantine reason or a documented drop rule.</w:t>
-            </w:r>
-          </w:p>
-        </w:tc>
-      </w:tr>
-      <w:tr>
-        <w:tc>
-          <w:tcPr/>
-          <w:p>
-            <w:pPr>
-              <w:pStyle w:val="Compact"/>
-              <w:jc w:val="left"/>
-            </w:pPr>
-            <w:r>
-              <w:t xml:space="preserve">Orchestration affects everyone</w:t>
-            </w:r>
-          </w:p>
-        </w:tc>
-        <w:tc>
-          <w:tcPr/>
-          <w:p>
-            <w:pPr>
-              <w:pStyle w:val="Compact"/>
-              <w:jc w:val="left"/>
-            </w:pPr>
-            <w:r>
-              <w:t xml:space="preserve">The POC fits the existing heartbeat and reuses the team’s manifest, quarantine format and lock pattern. Adopting it as a template is the team’s decision; the POC provides the evidence.</w:t>
-            </w:r>
-          </w:p>
-        </w:tc>
-      </w:tr>
-    </w:tbl>
-    <w:bookmarkStart w:id="30" w:name="what-transfers-and-what-doesnt"/>
-    <w:p>
-      <w:pPr>
-        <w:pStyle w:val="Heading3"/>
-      </w:pPr>
-      <w:r>
-        <w:t xml:space="preserve">What transfers and what doesn’t</w:t>
-      </w:r>
-    </w:p>
-    <w:tbl>
-      <w:tblPr>
-        <w:tblStyle w:val="Table"/>
-        <w:tblW w:type="pct" w:w="5000"/>
-        <w:jc w:val="left"/>
-        <w:tblLayout w:type="fixed"/>
-        <w:tblLook w:firstRow="1" w:lastRow="0" w:firstColumn="0" w:lastColumn="0" w:noHBand="0" w:noVBand="0" w:val="0020"/>
-      </w:tblPr>
-      <w:tblGrid>
-        <w:gridCol w:w="3960"/>
-        <w:gridCol w:w="3960"/>
-      </w:tblGrid>
-      <w:tr>
-        <w:trPr>
-          <w:tblHeader w:val="on"/>
-        </w:trPr>
-        <w:tc>
-          <w:tcPr/>
-          <w:p>
-            <w:pPr>
-              <w:pStyle w:val="Compact"/>
-              <w:jc w:val="left"/>
-            </w:pPr>
-            <w:r>
-              <w:t xml:space="preserve">Transfers (candidate template for scheduled, file-based feeds)</w:t>
-            </w:r>
-          </w:p>
-        </w:tc>
-        <w:tc>
-          <w:tcPr/>
-          <w:p>
-            <w:pPr>
-              <w:pStyle w:val="Compact"/>
-              <w:jc w:val="left"/>
-            </w:pPr>
-            <w:r>
-              <w:t xml:space="preserve">Doesn’t transfer (DSP-specific, inside the transform or its config)</w:t>
-            </w:r>
-          </w:p>
-        </w:tc>
-      </w:tr>
-      <w:tr>
-        <w:tc>
-          <w:tcPr/>
-          <w:p>
-            <w:pPr>
-              <w:pStyle w:val="Compact"/>
-              <w:jc w:val="left"/>
-            </w:pPr>
-            <w:r>
-              <w:t xml:space="preserve">Trigger from the heartbeat / scheduler</w:t>
-            </w:r>
-          </w:p>
-        </w:tc>
-        <w:tc>
-          <w:tcPr/>
-          <w:p>
-            <w:pPr>
-              <w:pStyle w:val="Compact"/>
-              <w:jc w:val="left"/>
-            </w:pPr>
-            <w:r>
-              <w:t xml:space="preserve">File parsing and header validation</w:t>
-            </w:r>
-          </w:p>
-        </w:tc>
-      </w:tr>
-      <w:tr>
-        <w:tc>
-          <w:tcPr/>
-          <w:p>
-            <w:pPr>
-              <w:pStyle w:val="Compact"/>
-              <w:jc w:val="left"/>
-            </w:pPr>
-            <w:r>
-              <w:t xml:space="preserve">Lock and timeout</w:t>
-            </w:r>
-          </w:p>
-        </w:tc>
-        <w:tc>
-          <w:tcPr/>
-          <w:p>
-            <w:pPr>
-              <w:pStyle w:val="Compact"/>
-              <w:jc w:val="left"/>
-            </w:pPr>
-            <w:r>
-              <w:t xml:space="preserve">Cleanup rules</w:t>
-            </w:r>
-          </w:p>
-        </w:tc>
-      </w:tr>
-      <w:tr>
-        <w:tc>
-          <w:tcPr/>
-          <w:p>
-            <w:pPr>
-              <w:pStyle w:val="Compact"/>
-              <w:jc w:val="left"/>
-            </w:pPr>
-            <w:r>
-              <w:t xml:space="preserve">Find work from output files + manifest</w:t>
-            </w:r>
-          </w:p>
-        </w:tc>
-        <w:tc>
-          <w:tcPr/>
-          <w:p>
-            <w:pPr>
-              <w:pStyle w:val="Compact"/>
-              <w:jc w:val="left"/>
-            </w:pPr>
-            <w:r>
-              <w:t xml:space="preserve">Publisher mapping (9 labels to 6)</w:t>
-            </w:r>
-          </w:p>
-        </w:tc>
-      </w:tr>
-      <w:tr>
-        <w:tc>
-          <w:tcPr/>
-          <w:p>
-            <w:pPr>
-              <w:pStyle w:val="Compact"/>
-              <w:jc w:val="left"/>
-            </w:pPr>
-            <w:r>
-              <w:t xml:space="preserve">Fan-out, one unit of work per invocation</w:t>
-            </w:r>
-          </w:p>
-        </w:tc>
-        <w:tc>
-          <w:tcPr/>
-          <w:p>
-            <w:pPr>
-              <w:pStyle w:val="Compact"/>
-              <w:jc w:val="left"/>
-            </w:pPr>
-            <w:r>
-              <w:t xml:space="preserve">Key rules (D1-D12) and the id ledger contents</w:t>
-            </w:r>
-          </w:p>
-        </w:tc>
-      </w:tr>
-      <w:tr>
-        <w:tc>
-          <w:tcPr/>
-          <w:p>
-            <w:pPr>
-              <w:pStyle w:val="Compact"/>
-              <w:jc w:val="left"/>
-            </w:pPr>
-            <w:r>
-              <w:t xml:space="preserve">Safe writes (temp key, then final key) and whole-file replays</w:t>
-            </w:r>
-          </w:p>
-        </w:tc>
-        <w:tc>
-          <w:tcPr/>
-          <w:p>
-            <w:pPr>
-              <w:pStyle w:val="Compact"/>
-              <w:jc w:val="left"/>
-            </w:pPr>
-            <w:r>
-              <w:t xml:space="preserve">Output schema</w:t>
-            </w:r>
-          </w:p>
-        </w:tc>
-      </w:tr>
-      <w:tr>
-        <w:tc>
-          <w:tcPr/>
-          <w:p>
-            <w:pPr>
-              <w:pStyle w:val="Compact"/>
-              <w:jc w:val="left"/>
-            </w:pPr>
-            <w:r>
-              <w:t xml:space="preserve">Manifest and quarantine in the team’s format</w:t>
-            </w:r>
-          </w:p>
-        </w:tc>
-        <w:tc>
-          <w:tcPr/>
-          <w:p>
-            <w:pPr>
-              <w:pStyle w:val="Compact"/>
-              <w:jc w:val="left"/>
-            </w:pPr>
-            <w:r>
-              <w:t xml:space="preserve">Which checks apply</w:t>
-            </w:r>
-          </w:p>
-        </w:tc>
-      </w:tr>
-      <w:tr>
-        <w:tc>
-          <w:tcPr/>
-          <w:p>
-            <w:pPr>
-              <w:pStyle w:val="Compact"/>
-              <w:jc w:val="left"/>
-            </w:pPr>
-            <w:r>
-              <w:t xml:space="preserve">Storage comparison results (Parquet vs S3 Tables) for batch feeds</w:t>
-            </w:r>
-          </w:p>
-        </w:tc>
-        <w:tc>
-          <w:tcPr/>
-          <w:p>
-            <w:pPr>
-              <w:pStyle w:val="Compact"/>
-            </w:pPr>
-          </w:p>
-        </w:tc>
-      </w:tr>
-    </w:tbl>
-    <w:p>
-      <w:pPr>
-        <w:pStyle w:val="BodyText"/>
-      </w:pPr>
-      <w:r>
-        <w:t xml:space="preserve">Not covered by the template: streaming feeds such as the new DSP’s full avails stream, which Scott expects to get its own streaming solution.</w:t>
-      </w:r>
-    </w:p>
-    <w:bookmarkEnd w:id="30"/>
-    <w:bookmarkEnd w:id="31"/>
-    <w:bookmarkStart w:id="32" w:name="assumptions"/>
-    <w:p>
-      <w:pPr>
-        <w:pStyle w:val="Heading2"/>
-      </w:pPr>
-      <w:r>
-        <w:t xml:space="preserve">8. Assumptions</w:t>
+        <w:t xml:space="preserve">Both make sure only one run works at a time. Cillian’s Glue jobs do it with two settings (Cillian, Slack, 10/28): the Glue job’s maximum concurrency is 1, so Glue rejects a second run, and the Step Function retries on that error (every 60 seconds, doubling, up to 20 tries) until the first run finishes. The POC follows the same rule. The difference is what a second run does when one is already going.</w:t>
       </w:r>
     </w:p>
     <w:tbl>
@@ -2572,6 +1718,1214 @@
           <w:p>
             <w:pPr>
               <w:pStyle w:val="Compact"/>
+            </w:pPr>
+          </w:p>
+        </w:tc>
+        <w:tc>
+          <w:tcPr/>
+          <w:p>
+            <w:pPr>
+              <w:pStyle w:val="Compact"/>
+              <w:jc w:val="left"/>
+            </w:pPr>
+            <w:r>
+              <w:t xml:space="preserve">Cillian’s Glue jobs</w:t>
+            </w:r>
+          </w:p>
+        </w:tc>
+        <w:tc>
+          <w:tcPr/>
+          <w:p>
+            <w:pPr>
+              <w:pStyle w:val="Compact"/>
+              <w:jc w:val="left"/>
+            </w:pPr>
+            <w:r>
+              <w:t xml:space="preserve">This POC</w:t>
+            </w:r>
+          </w:p>
+        </w:tc>
+      </w:tr>
+      <w:tr>
+        <w:tc>
+          <w:tcPr/>
+          <w:p>
+            <w:pPr>
+              <w:pStyle w:val="Compact"/>
+              <w:jc w:val="left"/>
+            </w:pPr>
+            <w:r>
+              <w:t xml:space="preserve">Rule</w:t>
+            </w:r>
+          </w:p>
+        </w:tc>
+        <w:tc>
+          <w:tcPr/>
+          <w:p>
+            <w:pPr>
+              <w:pStyle w:val="Compact"/>
+              <w:jc w:val="left"/>
+            </w:pPr>
+            <w:r>
+              <w:t xml:space="preserve">One run at a time</w:t>
+            </w:r>
+          </w:p>
+        </w:tc>
+        <w:tc>
+          <w:tcPr/>
+          <w:p>
+            <w:pPr>
+              <w:pStyle w:val="Compact"/>
+              <w:jc w:val="left"/>
+            </w:pPr>
+            <w:r>
+              <w:t xml:space="preserve">Same</w:t>
+            </w:r>
+          </w:p>
+        </w:tc>
+      </w:tr>
+      <w:tr>
+        <w:tc>
+          <w:tcPr/>
+          <w:p>
+            <w:pPr>
+              <w:pStyle w:val="Compact"/>
+              <w:jc w:val="left"/>
+            </w:pPr>
+            <w:r>
+              <w:t xml:space="preserve">Where it’s enforced</w:t>
+            </w:r>
+          </w:p>
+        </w:tc>
+        <w:tc>
+          <w:tcPr/>
+          <w:p>
+            <w:pPr>
+              <w:pStyle w:val="Compact"/>
+              <w:jc w:val="left"/>
+            </w:pPr>
+            <w:r>
+              <w:t xml:space="preserve">Glue job setting: maximum concurrency 1</w:t>
+            </w:r>
+          </w:p>
+        </w:tc>
+        <w:tc>
+          <w:tcPr/>
+          <w:p>
+            <w:pPr>
+              <w:pStyle w:val="Compact"/>
+              <w:jc w:val="left"/>
+            </w:pPr>
+            <w:r>
+              <w:t xml:space="preserve">Step Function</w:t>
+            </w:r>
+            <w:r>
+              <w:t xml:space="preserve"> </w:t>
+            </w:r>
+            <w:r>
+              <w:rPr>
+                <w:rStyle w:val="VerbatimChar"/>
+              </w:rPr>
+              <w:t xml:space="preserve">CheckLock</w:t>
+            </w:r>
+            <w:r>
+              <w:t xml:space="preserve"> </w:t>
+            </w:r>
+            <w:r>
+              <w:t xml:space="preserve">state: looks for another running execution</w:t>
+            </w:r>
+          </w:p>
+        </w:tc>
+      </w:tr>
+      <w:tr>
+        <w:tc>
+          <w:tcPr/>
+          <w:p>
+            <w:pPr>
+              <w:pStyle w:val="Compact"/>
+              <w:jc w:val="left"/>
+            </w:pPr>
+            <w:r>
+              <w:t xml:space="preserve">If a run is already going</w:t>
+            </w:r>
+          </w:p>
+        </w:tc>
+        <w:tc>
+          <w:tcPr/>
+          <w:p>
+            <w:pPr>
+              <w:pStyle w:val="Compact"/>
+              <w:jc w:val="left"/>
+            </w:pPr>
+            <w:r>
+              <w:t xml:space="preserve">The new run waits and retries (60 s, doubling, up to 20 tries)</w:t>
+            </w:r>
+          </w:p>
+        </w:tc>
+        <w:tc>
+          <w:tcPr/>
+          <w:p>
+            <w:pPr>
+              <w:pStyle w:val="Compact"/>
+              <w:jc w:val="left"/>
+            </w:pPr>
+            <w:r>
+              <w:t xml:space="preserve">The new run ends at once as</w:t>
+            </w:r>
+            <w:r>
+              <w:t xml:space="preserve"> </w:t>
+            </w:r>
+            <w:r>
+              <w:rPr>
+                <w:rStyle w:val="VerbatimChar"/>
+              </w:rPr>
+              <w:t xml:space="preserve">SkippedAlreadyRunning</w:t>
+            </w:r>
+          </w:p>
+        </w:tc>
+      </w:tr>
+      <w:tr>
+        <w:tc>
+          <w:tcPr/>
+          <w:p>
+            <w:pPr>
+              <w:pStyle w:val="Compact"/>
+              <w:jc w:val="left"/>
+            </w:pPr>
+            <w:r>
+              <w:t xml:space="preserve">What happens to its work</w:t>
+            </w:r>
+          </w:p>
+        </w:tc>
+        <w:tc>
+          <w:tcPr/>
+          <w:p>
+            <w:pPr>
+              <w:pStyle w:val="Compact"/>
+              <w:jc w:val="left"/>
+            </w:pPr>
+            <w:r>
+              <w:t xml:space="preserve">Done when the earlier run finishes</w:t>
+            </w:r>
+          </w:p>
+        </w:tc>
+        <w:tc>
+          <w:tcPr/>
+          <w:p>
+            <w:pPr>
+              <w:pStyle w:val="Compact"/>
+              <w:jc w:val="left"/>
+            </w:pPr>
+            <w:r>
+              <w:t xml:space="preserve">Picked up by the next hourly run, because</w:t>
+            </w:r>
+            <w:r>
+              <w:t xml:space="preserve"> </w:t>
+            </w:r>
+            <w:r>
+              <w:rPr>
+                <w:rStyle w:val="VerbatimChar"/>
+              </w:rPr>
+              <w:t xml:space="preserve">FindWork</w:t>
+            </w:r>
+            <w:r>
+              <w:t xml:space="preserve"> </w:t>
+            </w:r>
+            <w:r>
+              <w:t xml:space="preserve">looks for every hour not yet done</w:t>
+            </w:r>
+          </w:p>
+        </w:tc>
+      </w:tr>
+      <w:tr>
+        <w:tc>
+          <w:tcPr/>
+          <w:p>
+            <w:pPr>
+              <w:pStyle w:val="Compact"/>
+              <w:jc w:val="left"/>
+            </w:pPr>
+            <w:r>
+              <w:t xml:space="preserve">A stuck run</w:t>
+            </w:r>
+          </w:p>
+        </w:tc>
+        <w:tc>
+          <w:tcPr/>
+          <w:p>
+            <w:pPr>
+              <w:pStyle w:val="Compact"/>
+              <w:jc w:val="left"/>
+            </w:pPr>
+            <w:r>
+              <w:t xml:space="preserve">Glue job’s own timeout (value not checked)</w:t>
+            </w:r>
+          </w:p>
+        </w:tc>
+        <w:tc>
+          <w:tcPr/>
+          <w:p>
+            <w:pPr>
+              <w:pStyle w:val="Compact"/>
+              <w:jc w:val="left"/>
+            </w:pPr>
+            <w:r>
+              <w:t xml:space="preserve">25-minute state-machine timeout, so it can’t hold the lock past the next heartbeat</w:t>
+            </w:r>
+          </w:p>
+        </w:tc>
+      </w:tr>
+      <w:tr>
+        <w:tc>
+          <w:tcPr/>
+          <w:p>
+            <w:pPr>
+              <w:pStyle w:val="Compact"/>
+              <w:jc w:val="left"/>
+            </w:pPr>
+            <w:r>
+              <w:t xml:space="preserve">Where you see it</w:t>
+            </w:r>
+          </w:p>
+        </w:tc>
+        <w:tc>
+          <w:tcPr/>
+          <w:p>
+            <w:pPr>
+              <w:pStyle w:val="Compact"/>
+              <w:jc w:val="left"/>
+            </w:pPr>
+            <w:r>
+              <w:t xml:space="preserve">Step Functions retries, Glue run history</w:t>
+            </w:r>
+          </w:p>
+        </w:tc>
+        <w:tc>
+          <w:tcPr/>
+          <w:p>
+            <w:pPr>
+              <w:pStyle w:val="Compact"/>
+              <w:jc w:val="left"/>
+            </w:pPr>
+            <w:r>
+              <w:t xml:space="preserve">Step Functions run history; skipped runs end in a named state</w:t>
+            </w:r>
+          </w:p>
+        </w:tc>
+      </w:tr>
+    </w:tbl>
+    <w:p>
+      <w:pPr>
+        <w:pStyle w:val="BodyText"/>
+      </w:pPr>
+      <w:r>
+        <w:rPr>
+          <w:b/>
+          <w:bCs/>
+        </w:rPr>
+        <w:t xml:space="preserve">Why skip instead of wait.</w:t>
+      </w:r>
+      <w:r>
+        <w:t xml:space="preserve"> </w:t>
+      </w:r>
+      <w:r>
+        <w:t xml:space="preserve">Each run here works out for itself which hours are still missing, so a skipped run loses nothing, and waiting would only queue runs behind a slow one. For a job that processes only the work it was started for, waiting is the right choice, which is why Cillian’s jobs retry. One small edge: two runs started at the same instant could each see the other and both skip. At an hourly cadence that only delays the work by an hour, and the next run catches it.</w:t>
+      </w:r>
+    </w:p>
+    <w:bookmarkEnd w:id="27"/>
+    <w:bookmarkEnd w:id="28"/>
+    <w:bookmarkStart w:id="30" w:name="why-these-two-paths"/>
+    <w:p>
+      <w:pPr>
+        <w:pStyle w:val="Heading2"/>
+      </w:pPr>
+      <w:r>
+        <w:t xml:space="preserve">6. Why these two paths</w:t>
+      </w:r>
+    </w:p>
+    <w:p>
+      <w:pPr>
+        <w:pStyle w:val="FirstParagraph"/>
+      </w:pPr>
+      <w:r>
+        <w:rPr>
+          <w:b/>
+          <w:bCs/>
+        </w:rPr>
+        <w:t xml:space="preserve">Path A is the</w:t>
+      </w:r>
+      <w:r>
+        <w:rPr>
+          <w:b/>
+          <w:bCs/>
+        </w:rPr>
+        <w:t xml:space="preserve"> </w:t>
+      </w:r>
+      <w:r>
+        <w:rPr>
+          <w:b/>
+          <w:bCs/>
+        </w:rPr>
+        <w:t xml:space="preserve">“</w:t>
+      </w:r>
+      <w:r>
+        <w:rPr>
+          <w:b/>
+          <w:bCs/>
+        </w:rPr>
+        <w:t xml:space="preserve">do it easy</w:t>
+      </w:r>
+      <w:r>
+        <w:rPr>
+          <w:b/>
+          <w:bCs/>
+        </w:rPr>
+        <w:t xml:space="preserve">”</w:t>
+      </w:r>
+      <w:r>
+        <w:rPr>
+          <w:b/>
+          <w:bCs/>
+        </w:rPr>
+        <w:t xml:space="preserve"> </w:t>
+      </w:r>
+      <w:r>
+        <w:rPr>
+          <w:b/>
+          <w:bCs/>
+        </w:rPr>
+        <w:t xml:space="preserve">path.</w:t>
+      </w:r>
+      <w:r>
+        <w:t xml:space="preserve"> </w:t>
+      </w:r>
+      <w:r>
+        <w:t xml:space="preserve">It is file in, file out, Parquet, whole-file replacement: the shape the warehouse already reads. Jesse’s caution on 10/26 (</w:t>
+      </w:r>
+      <w:r>
+        <w:t xml:space="preserve">“</w:t>
+      </w:r>
+      <w:r>
+        <w:t xml:space="preserve">be intentional with where we experiment … do we just do it easy?</w:t>
+      </w:r>
+      <w:r>
+        <w:t xml:space="preserve">”</w:t>
+      </w:r>
+      <w:r>
+        <w:t xml:space="preserve">) is exactly why A stands on its own.</w:t>
+      </w:r>
+    </w:p>
+    <w:p>
+      <w:pPr>
+        <w:pStyle w:val="BodyText"/>
+      </w:pPr>
+      <w:r>
+        <w:rPr>
+          <w:b/>
+          <w:bCs/>
+        </w:rPr>
+        <w:t xml:space="preserve">Path B is evidence for a decision the team already plans to make.</w:t>
+      </w:r>
+      <w:r>
+        <w:t xml:space="preserve"> </w:t>
+      </w:r>
+      <w:r>
+        <w:t xml:space="preserve">Jesse said on 10/20 that there will be a data lake, and the choice between S3 Tables, Iceberg managed in-house, or Snowflake is a conversation for</w:t>
+      </w:r>
+      <w:r>
+        <w:t xml:space="preserve"> </w:t>
+      </w:r>
+      <w:r>
+        <w:t xml:space="preserve">“</w:t>
+      </w:r>
+      <w:r>
+        <w:t xml:space="preserve">after you guys build your first couple pipelines</w:t>
+      </w:r>
+      <w:r>
+        <w:t xml:space="preserve">”</w:t>
+      </w:r>
+      <w:r>
+        <w:t xml:space="preserve">. Path B gives that conversation real numbers. Because the transform is shared, B costs one extra writer, not a second pipeline.</w:t>
+      </w:r>
+    </w:p>
+    <w:p>
+      <w:pPr>
+        <w:pStyle w:val="BodyText"/>
+      </w:pPr>
+      <w:r>
+        <w:rPr>
+          <w:b/>
+          <w:bCs/>
+        </w:rPr>
+        <w:t xml:space="preserve">Why build them together.</w:t>
+      </w:r>
+      <w:r>
+        <w:t xml:space="preserve"> </w:t>
+      </w:r>
+      <w:r>
+        <w:t xml:space="preserve">The comparison is only fair if both sides get identical input and logic. Building B later would mean re-running the transform and arguing about differences that have nothing to do with storage.</w:t>
+      </w:r>
+    </w:p>
+    <w:p>
+      <w:pPr>
+        <w:pStyle w:val="BodyText"/>
+      </w:pPr>
+      <w:r>
+        <w:rPr>
+          <w:b/>
+          <w:bCs/>
+        </w:rPr>
+        <w:t xml:space="preserve">Why serverless (Step Functions + Lambda).</w:t>
+      </w:r>
+      <w:r>
+        <w:t xml:space="preserve"> </w:t>
+      </w:r>
+      <w:r>
+        <w:t xml:space="preserve">The work is a bounded, repeatable unit (one file-hour) on a schedule with no state between runs. Step Functions gives the lock, retries and run history that would otherwise be hand-built, and a backfill fans out without a cluster. It also fits the direction Jesse set on 10/23: after this pipeline,</w:t>
+      </w:r>
+      <w:r>
+        <w:t xml:space="preserve"> </w:t>
+      </w:r>
+      <w:r>
+        <w:t xml:space="preserve">“</w:t>
+      </w:r>
+      <w:r>
+        <w:t xml:space="preserve">get off the single node runtime</w:t>
+      </w:r>
+      <w:r>
+        <w:t xml:space="preserve">”</w:t>
+      </w:r>
+      <w:r>
+        <w:t xml:space="preserve">; the monolith</w:t>
+      </w:r>
+      <w:r>
+        <w:t xml:space="preserve"> </w:t>
+      </w:r>
+      <w:r>
+        <w:t xml:space="preserve">“</w:t>
+      </w:r>
+      <w:r>
+        <w:t xml:space="preserve">can’t stay a monolith forever</w:t>
+      </w:r>
+      <w:r>
+        <w:t xml:space="preserve">”</w:t>
+      </w:r>
+      <w:r>
+        <w:t xml:space="preserve">.</w:t>
+      </w:r>
+    </w:p>
+    <w:bookmarkStart w:id="29" w:name="alternatives-considered"/>
+    <w:p>
+      <w:pPr>
+        <w:pStyle w:val="Heading3"/>
+      </w:pPr>
+      <w:r>
+        <w:t xml:space="preserve">Alternatives considered</w:t>
+      </w:r>
+    </w:p>
+    <w:tbl>
+      <w:tblPr>
+        <w:tblStyle w:val="Table"/>
+        <w:tblW w:type="pct" w:w="5000"/>
+        <w:jc w:val="left"/>
+        <w:tblLayout w:type="fixed"/>
+        <w:tblLook w:firstRow="1" w:lastRow="0" w:firstColumn="0" w:lastColumn="0" w:noHBand="0" w:noVBand="0" w:val="0020"/>
+      </w:tblPr>
+      <w:tblGrid>
+        <w:gridCol w:w="3960"/>
+        <w:gridCol w:w="3960"/>
+      </w:tblGrid>
+      <w:tr>
+        <w:trPr>
+          <w:tblHeader w:val="on"/>
+        </w:trPr>
+        <w:tc>
+          <w:tcPr/>
+          <w:p>
+            <w:pPr>
+              <w:pStyle w:val="Compact"/>
+              <w:jc w:val="left"/>
+            </w:pPr>
+            <w:r>
+              <w:t xml:space="preserve">Option</w:t>
+            </w:r>
+          </w:p>
+        </w:tc>
+        <w:tc>
+          <w:tcPr/>
+          <w:p>
+            <w:pPr>
+              <w:pStyle w:val="Compact"/>
+              <w:jc w:val="left"/>
+            </w:pPr>
+            <w:r>
+              <w:t xml:space="preserve">Why not (for this POC)</w:t>
+            </w:r>
+          </w:p>
+        </w:tc>
+      </w:tr>
+      <w:tr>
+        <w:tc>
+          <w:tcPr/>
+          <w:p>
+            <w:pPr>
+              <w:pStyle w:val="Compact"/>
+              <w:jc w:val="left"/>
+            </w:pPr>
+            <w:r>
+              <w:t xml:space="preserve">Node heartbeat shells out to DuckDB on the EC2</w:t>
+            </w:r>
+          </w:p>
+        </w:tc>
+        <w:tc>
+          <w:tcPr/>
+          <w:p>
+            <w:pPr>
+              <w:pStyle w:val="Compact"/>
+              <w:jc w:val="left"/>
+            </w:pPr>
+            <w:r>
+              <w:t xml:space="preserve">Fastest to stand up, and Jesse said the EC2 has room. But the lock, retries and run history would be hand-built, and it ties the work to the single node.</w:t>
+            </w:r>
+            <w:r>
+              <w:t xml:space="preserve"> </w:t>
+            </w:r>
+            <w:r>
+              <w:rPr>
+                <w:b/>
+                <w:bCs/>
+              </w:rPr>
+              <w:t xml:space="preserve">Kept as the fallback</w:t>
+            </w:r>
+            <w:r>
+              <w:t xml:space="preserve"> </w:t>
+            </w:r>
+            <w:r>
+              <w:t xml:space="preserve">(section 9).</w:t>
+            </w:r>
+          </w:p>
+        </w:tc>
+      </w:tr>
+      <w:tr>
+        <w:tc>
+          <w:tcPr/>
+          <w:p>
+            <w:pPr>
+              <w:pStyle w:val="Compact"/>
+              <w:jc w:val="left"/>
+            </w:pPr>
+            <w:r>
+              <w:t xml:space="preserve">MWAA (managed Airflow)</w:t>
+            </w:r>
+          </w:p>
+        </w:tc>
+        <w:tc>
+          <w:tcPr/>
+          <w:p>
+            <w:pPr>
+              <w:pStyle w:val="Compact"/>
+              <w:jc w:val="left"/>
+            </w:pPr>
+            <w:r>
+              <w:t xml:space="preserve">Jesse: conflicts with the current cron runner.</w:t>
+            </w:r>
+          </w:p>
+        </w:tc>
+      </w:tr>
+      <w:tr>
+        <w:tc>
+          <w:tcPr/>
+          <w:p>
+            <w:pPr>
+              <w:pStyle w:val="Compact"/>
+              <w:jc w:val="left"/>
+            </w:pPr>
+            <w:r>
+              <w:t xml:space="preserve">Airflow first</w:t>
+            </w:r>
+          </w:p>
+        </w:tc>
+        <w:tc>
+          <w:tcPr/>
+          <w:p>
+            <w:pPr>
+              <w:pStyle w:val="Compact"/>
+              <w:jc w:val="left"/>
+            </w:pPr>
+            <w:r>
+              <w:t xml:space="preserve">Orchestration is the part that affects everyone; it shouldn’t lead (Jesse to David, 10/26-27). This POC plugs into the existing heartbeat instead of replacing it.</w:t>
+            </w:r>
+          </w:p>
+        </w:tc>
+      </w:tr>
+      <w:tr>
+        <w:tc>
+          <w:tcPr/>
+          <w:p>
+            <w:pPr>
+              <w:pStyle w:val="Compact"/>
+              <w:jc w:val="left"/>
+            </w:pPr>
+            <w:r>
+              <w:t xml:space="preserve">dbt</w:t>
+            </w:r>
+          </w:p>
+        </w:tc>
+        <w:tc>
+          <w:tcPr/>
+          <w:p>
+            <w:pPr>
+              <w:pStyle w:val="Compact"/>
+              <w:jc w:val="left"/>
+            </w:pPr>
+            <w:r>
+              <w:t xml:space="preserve">A model graph for warehouse-side SQL; it doesn’t handle the trigger, lock, manifest or quarantine. Fits downstream, not here.</w:t>
+            </w:r>
+          </w:p>
+        </w:tc>
+      </w:tr>
+      <w:tr>
+        <w:tc>
+          <w:tcPr/>
+          <w:p>
+            <w:pPr>
+              <w:pStyle w:val="Compact"/>
+              <w:jc w:val="left"/>
+            </w:pPr>
+            <w:r>
+              <w:t xml:space="preserve">Glue / Spark</w:t>
+            </w:r>
+          </w:p>
+        </w:tc>
+        <w:tc>
+          <w:tcPr/>
+          <w:p>
+            <w:pPr>
+              <w:pStyle w:val="Compact"/>
+              <w:jc w:val="left"/>
+            </w:pPr>
+            <w:r>
+              <w:t xml:space="preserve">More machinery than hourly files of this size need.</w:t>
+            </w:r>
+          </w:p>
+        </w:tc>
+      </w:tr>
+    </w:tbl>
+    <w:bookmarkEnd w:id="29"/>
+    <w:bookmarkEnd w:id="30"/>
+    <w:bookmarkStart w:id="32" w:name="addressing-the-concerns-up-front"/>
+    <w:p>
+      <w:pPr>
+        <w:pStyle w:val="Heading2"/>
+      </w:pPr>
+      <w:r>
+        <w:t xml:space="preserve">7. Addressing the concerns up front</w:t>
+      </w:r>
+    </w:p>
+    <w:tbl>
+      <w:tblPr>
+        <w:tblStyle w:val="Table"/>
+        <w:tblW w:type="pct" w:w="5000"/>
+        <w:jc w:val="left"/>
+        <w:tblLayout w:type="fixed"/>
+        <w:tblLook w:firstRow="1" w:lastRow="0" w:firstColumn="0" w:lastColumn="0" w:noHBand="0" w:noVBand="0" w:val="0020"/>
+      </w:tblPr>
+      <w:tblGrid>
+        <w:gridCol w:w="3960"/>
+        <w:gridCol w:w="3960"/>
+      </w:tblGrid>
+      <w:tr>
+        <w:trPr>
+          <w:tblHeader w:val="on"/>
+        </w:trPr>
+        <w:tc>
+          <w:tcPr/>
+          <w:p>
+            <w:pPr>
+              <w:pStyle w:val="Compact"/>
+              <w:jc w:val="left"/>
+            </w:pPr>
+            <w:r>
+              <w:t xml:space="preserve">Concern</w:t>
+            </w:r>
+          </w:p>
+        </w:tc>
+        <w:tc>
+          <w:tcPr/>
+          <w:p>
+            <w:pPr>
+              <w:pStyle w:val="Compact"/>
+              <w:jc w:val="left"/>
+            </w:pPr>
+            <w:r>
+              <w:t xml:space="preserve">Answer</w:t>
+            </w:r>
+          </w:p>
+        </w:tc>
+      </w:tr>
+      <w:tr>
+        <w:tc>
+          <w:tcPr/>
+          <w:p>
+            <w:pPr>
+              <w:pStyle w:val="Compact"/>
+              <w:jc w:val="left"/>
+            </w:pPr>
+            <w:r>
+              <w:t xml:space="preserve">“</w:t>
+            </w:r>
+            <w:r>
+              <w:t xml:space="preserve">File in, file out; you’re not building a data lake</w:t>
+            </w:r>
+            <w:r>
+              <w:t xml:space="preserve">”</w:t>
+            </w:r>
+            <w:r>
+              <w:t xml:space="preserve"> </w:t>
+            </w:r>
+            <w:r>
+              <w:t xml:space="preserve">(Jesse, 10/23)</w:t>
+            </w:r>
+          </w:p>
+        </w:tc>
+        <w:tc>
+          <w:tcPr/>
+          <w:p>
+            <w:pPr>
+              <w:pStyle w:val="Compact"/>
+              <w:jc w:val="left"/>
+            </w:pPr>
+            <w:r>
+              <w:t xml:space="preserve">Path A is file in, file out. Path B is a separate, time-boxed trial branch that A never reads from.</w:t>
+            </w:r>
+          </w:p>
+        </w:tc>
+      </w:tr>
+      <w:tr>
+        <w:tc>
+          <w:tcPr/>
+          <w:p>
+            <w:pPr>
+              <w:pStyle w:val="Compact"/>
+              <w:jc w:val="left"/>
+            </w:pPr>
+            <w:r>
+              <w:t xml:space="preserve">“</w:t>
+            </w:r>
+            <w:r>
+              <w:t xml:space="preserve">Be intentional with where we experiment</w:t>
+            </w:r>
+            <w:r>
+              <w:t xml:space="preserve">”</w:t>
+            </w:r>
+            <w:r>
+              <w:t xml:space="preserve"> </w:t>
+            </w:r>
+            <w:r>
+              <w:t xml:space="preserve">(Jesse, 10/26)</w:t>
+            </w:r>
+          </w:p>
+        </w:tc>
+        <w:tc>
+          <w:tcPr/>
+          <w:p>
+            <w:pPr>
+              <w:pStyle w:val="Compact"/>
+              <w:jc w:val="left"/>
+            </w:pPr>
+            <w:r>
+              <w:t xml:space="preserve">The experiment is one writer with a time-box and a stop rule. Dropping it costs A nothing.</w:t>
+            </w:r>
+          </w:p>
+        </w:tc>
+      </w:tr>
+      <w:tr>
+        <w:tc>
+          <w:tcPr/>
+          <w:p>
+            <w:pPr>
+              <w:pStyle w:val="Compact"/>
+              <w:jc w:val="left"/>
+            </w:pPr>
+            <w:r>
+              <w:t xml:space="preserve">“</w:t>
+            </w:r>
+            <w:r>
+              <w:t xml:space="preserve">What you’re working on now will not transfer</w:t>
+            </w:r>
+            <w:r>
+              <w:t xml:space="preserve">”</w:t>
+            </w:r>
+            <w:r>
+              <w:t xml:space="preserve"> </w:t>
+            </w:r>
+            <w:r>
+              <w:t xml:space="preserve">to the new DSP (Jesse, 10/21)</w:t>
+            </w:r>
+          </w:p>
+        </w:tc>
+        <w:tc>
+          <w:tcPr/>
+          <w:p>
+            <w:pPr>
+              <w:pStyle w:val="Compact"/>
+              <w:jc w:val="left"/>
+            </w:pPr>
+            <w:r>
+              <w:t xml:space="preserve">Agreed for the DSP-specific parts: parsing, cleanup, key rules and schema are for the current feed only, and nothing in the POC anticipates AdKernel. What can transfer is the mechanism around the transform (table below), for the team’s other scheduled, file-based feeds.</w:t>
+            </w:r>
+          </w:p>
+        </w:tc>
+      </w:tr>
+      <w:tr>
+        <w:tc>
+          <w:tcPr/>
+          <w:p>
+            <w:pPr>
+              <w:pStyle w:val="Compact"/>
+              <w:jc w:val="left"/>
+            </w:pPr>
+            <w:r>
+              <w:t xml:space="preserve">Iceberg’s benefits show up at terabyte scale with upserts, not on 4 MB files (Jesse, 10/27)</w:t>
+            </w:r>
+          </w:p>
+        </w:tc>
+        <w:tc>
+          <w:tcPr/>
+          <w:p>
+            <w:pPr>
+              <w:pStyle w:val="Compact"/>
+              <w:jc w:val="left"/>
+            </w:pPr>
+            <w:r>
+              <w:t xml:space="preserve">Agreed. B isn’t about speed at today’s size. It’s the first real evidence on S3 Tables for our batch pipelines, one input into the data-lake decision, not the decision itself.</w:t>
+            </w:r>
+          </w:p>
+        </w:tc>
+      </w:tr>
+      <w:tr>
+        <w:tc>
+          <w:tcPr/>
+          <w:p>
+            <w:pPr>
+              <w:pStyle w:val="Compact"/>
+              <w:jc w:val="left"/>
+            </w:pPr>
+            <w:r>
+              <w:t xml:space="preserve">Like-for-like: single-digit shifts in the top metrics are a big business change (Jesse, 10/27)</w:t>
+            </w:r>
+          </w:p>
+        </w:tc>
+        <w:tc>
+          <w:tcPr/>
+          <w:p>
+            <w:pPr>
+              <w:pStyle w:val="Compact"/>
+              <w:jc w:val="left"/>
+            </w:pPr>
+            <w:r>
+              <w:t xml:space="preserve">A passes data through: no NPI filtering for 1.5, no bot filtering. A success criterion is that A’s row counts reconcile with the raw files, with every difference explained by a quarantine reason or a documented drop rule.</w:t>
+            </w:r>
+          </w:p>
+        </w:tc>
+      </w:tr>
+      <w:tr>
+        <w:tc>
+          <w:tcPr/>
+          <w:p>
+            <w:pPr>
+              <w:pStyle w:val="Compact"/>
+              <w:jc w:val="left"/>
+            </w:pPr>
+            <w:r>
+              <w:t xml:space="preserve">Orchestration affects everyone</w:t>
+            </w:r>
+          </w:p>
+        </w:tc>
+        <w:tc>
+          <w:tcPr/>
+          <w:p>
+            <w:pPr>
+              <w:pStyle w:val="Compact"/>
+              <w:jc w:val="left"/>
+            </w:pPr>
+            <w:r>
+              <w:t xml:space="preserve">The POC fits the existing heartbeat and reuses the team’s manifest, quarantine format and one-run-at-a-time rule (as in Cillian’s Glue jobs). Adopting it as a template is the team’s decision; the POC provides the evidence.</w:t>
+            </w:r>
+          </w:p>
+        </w:tc>
+      </w:tr>
+    </w:tbl>
+    <w:bookmarkStart w:id="31" w:name="what-transfers-and-what-doesnt"/>
+    <w:p>
+      <w:pPr>
+        <w:pStyle w:val="Heading3"/>
+      </w:pPr>
+      <w:r>
+        <w:t xml:space="preserve">What transfers and what doesn’t</w:t>
+      </w:r>
+    </w:p>
+    <w:tbl>
+      <w:tblPr>
+        <w:tblStyle w:val="Table"/>
+        <w:tblW w:type="pct" w:w="5000"/>
+        <w:jc w:val="left"/>
+        <w:tblLayout w:type="fixed"/>
+        <w:tblLook w:firstRow="1" w:lastRow="0" w:firstColumn="0" w:lastColumn="0" w:noHBand="0" w:noVBand="0" w:val="0020"/>
+      </w:tblPr>
+      <w:tblGrid>
+        <w:gridCol w:w="3960"/>
+        <w:gridCol w:w="3960"/>
+      </w:tblGrid>
+      <w:tr>
+        <w:trPr>
+          <w:tblHeader w:val="on"/>
+        </w:trPr>
+        <w:tc>
+          <w:tcPr/>
+          <w:p>
+            <w:pPr>
+              <w:pStyle w:val="Compact"/>
+              <w:jc w:val="left"/>
+            </w:pPr>
+            <w:r>
+              <w:t xml:space="preserve">Transfers (candidate template for scheduled, file-based feeds)</w:t>
+            </w:r>
+          </w:p>
+        </w:tc>
+        <w:tc>
+          <w:tcPr/>
+          <w:p>
+            <w:pPr>
+              <w:pStyle w:val="Compact"/>
+              <w:jc w:val="left"/>
+            </w:pPr>
+            <w:r>
+              <w:t xml:space="preserve">Doesn’t transfer (DSP-specific, inside the transform or its config)</w:t>
+            </w:r>
+          </w:p>
+        </w:tc>
+      </w:tr>
+      <w:tr>
+        <w:tc>
+          <w:tcPr/>
+          <w:p>
+            <w:pPr>
+              <w:pStyle w:val="Compact"/>
+              <w:jc w:val="left"/>
+            </w:pPr>
+            <w:r>
+              <w:t xml:space="preserve">Trigger from the heartbeat / scheduler</w:t>
+            </w:r>
+          </w:p>
+        </w:tc>
+        <w:tc>
+          <w:tcPr/>
+          <w:p>
+            <w:pPr>
+              <w:pStyle w:val="Compact"/>
+              <w:jc w:val="left"/>
+            </w:pPr>
+            <w:r>
+              <w:t xml:space="preserve">File parsing and header validation</w:t>
+            </w:r>
+          </w:p>
+        </w:tc>
+      </w:tr>
+      <w:tr>
+        <w:tc>
+          <w:tcPr/>
+          <w:p>
+            <w:pPr>
+              <w:pStyle w:val="Compact"/>
+              <w:jc w:val="left"/>
+            </w:pPr>
+            <w:r>
+              <w:t xml:space="preserve">Lock and timeout</w:t>
+            </w:r>
+          </w:p>
+        </w:tc>
+        <w:tc>
+          <w:tcPr/>
+          <w:p>
+            <w:pPr>
+              <w:pStyle w:val="Compact"/>
+              <w:jc w:val="left"/>
+            </w:pPr>
+            <w:r>
+              <w:t xml:space="preserve">Cleanup rules</w:t>
+            </w:r>
+          </w:p>
+        </w:tc>
+      </w:tr>
+      <w:tr>
+        <w:tc>
+          <w:tcPr/>
+          <w:p>
+            <w:pPr>
+              <w:pStyle w:val="Compact"/>
+              <w:jc w:val="left"/>
+            </w:pPr>
+            <w:r>
+              <w:t xml:space="preserve">Find work from output files + manifest</w:t>
+            </w:r>
+          </w:p>
+        </w:tc>
+        <w:tc>
+          <w:tcPr/>
+          <w:p>
+            <w:pPr>
+              <w:pStyle w:val="Compact"/>
+              <w:jc w:val="left"/>
+            </w:pPr>
+            <w:r>
+              <w:t xml:space="preserve">Publisher mapping (9 labels to 6)</w:t>
+            </w:r>
+          </w:p>
+        </w:tc>
+      </w:tr>
+      <w:tr>
+        <w:tc>
+          <w:tcPr/>
+          <w:p>
+            <w:pPr>
+              <w:pStyle w:val="Compact"/>
+              <w:jc w:val="left"/>
+            </w:pPr>
+            <w:r>
+              <w:t xml:space="preserve">Fan-out, one unit of work per invocation</w:t>
+            </w:r>
+          </w:p>
+        </w:tc>
+        <w:tc>
+          <w:tcPr/>
+          <w:p>
+            <w:pPr>
+              <w:pStyle w:val="Compact"/>
+              <w:jc w:val="left"/>
+            </w:pPr>
+            <w:r>
+              <w:t xml:space="preserve">Key rules (D1-D12) and the id ledger contents</w:t>
+            </w:r>
+          </w:p>
+        </w:tc>
+      </w:tr>
+      <w:tr>
+        <w:tc>
+          <w:tcPr/>
+          <w:p>
+            <w:pPr>
+              <w:pStyle w:val="Compact"/>
+              <w:jc w:val="left"/>
+            </w:pPr>
+            <w:r>
+              <w:t xml:space="preserve">Safe writes (temp key, then final key) and whole-file replays</w:t>
+            </w:r>
+          </w:p>
+        </w:tc>
+        <w:tc>
+          <w:tcPr/>
+          <w:p>
+            <w:pPr>
+              <w:pStyle w:val="Compact"/>
+              <w:jc w:val="left"/>
+            </w:pPr>
+            <w:r>
+              <w:t xml:space="preserve">Output schema</w:t>
+            </w:r>
+          </w:p>
+        </w:tc>
+      </w:tr>
+      <w:tr>
+        <w:tc>
+          <w:tcPr/>
+          <w:p>
+            <w:pPr>
+              <w:pStyle w:val="Compact"/>
+              <w:jc w:val="left"/>
+            </w:pPr>
+            <w:r>
+              <w:t xml:space="preserve">Manifest and quarantine in the team’s format</w:t>
+            </w:r>
+          </w:p>
+        </w:tc>
+        <w:tc>
+          <w:tcPr/>
+          <w:p>
+            <w:pPr>
+              <w:pStyle w:val="Compact"/>
+              <w:jc w:val="left"/>
+            </w:pPr>
+            <w:r>
+              <w:t xml:space="preserve">Which checks apply</w:t>
+            </w:r>
+          </w:p>
+        </w:tc>
+      </w:tr>
+      <w:tr>
+        <w:tc>
+          <w:tcPr/>
+          <w:p>
+            <w:pPr>
+              <w:pStyle w:val="Compact"/>
+              <w:jc w:val="left"/>
+            </w:pPr>
+            <w:r>
+              <w:t xml:space="preserve">Storage comparison results (Parquet vs S3 Tables) for batch feeds</w:t>
+            </w:r>
+          </w:p>
+        </w:tc>
+        <w:tc>
+          <w:tcPr/>
+          <w:p>
+            <w:pPr>
+              <w:pStyle w:val="Compact"/>
+            </w:pPr>
+          </w:p>
+        </w:tc>
+      </w:tr>
+    </w:tbl>
+    <w:p>
+      <w:pPr>
+        <w:pStyle w:val="BodyText"/>
+      </w:pPr>
+      <w:r>
+        <w:t xml:space="preserve">Not covered by the template: streaming feeds such as the new DSP’s full avails stream, which Scott expects to get its own streaming solution.</w:t>
+      </w:r>
+    </w:p>
+    <w:bookmarkEnd w:id="31"/>
+    <w:bookmarkEnd w:id="32"/>
+    <w:bookmarkStart w:id="33" w:name="assumptions"/>
+    <w:p>
+      <w:pPr>
+        <w:pStyle w:val="Heading2"/>
+      </w:pPr>
+      <w:r>
+        <w:t xml:space="preserve">8. Assumptions</w:t>
+      </w:r>
+    </w:p>
+    <w:tbl>
+      <w:tblPr>
+        <w:tblStyle w:val="Table"/>
+        <w:tblW w:type="pct" w:w="5000"/>
+        <w:jc w:val="left"/>
+        <w:tblLayout w:type="fixed"/>
+        <w:tblLook w:firstRow="1" w:lastRow="0" w:firstColumn="0" w:lastColumn="0" w:noHBand="0" w:noVBand="0" w:val="0020"/>
+      </w:tblPr>
+      <w:tblGrid>
+        <w:gridCol w:w="2640"/>
+        <w:gridCol w:w="2640"/>
+        <w:gridCol w:w="2640"/>
+      </w:tblGrid>
+      <w:tr>
+        <w:trPr>
+          <w:tblHeader w:val="on"/>
+        </w:trPr>
+        <w:tc>
+          <w:tcPr/>
+          <w:p>
+            <w:pPr>
+              <w:pStyle w:val="Compact"/>
               <w:jc w:val="left"/>
             </w:pPr>
             <w:r>
@@ -2909,8 +3263,8 @@
         </w:tc>
       </w:tr>
     </w:tbl>
-    <w:bookmarkEnd w:id="32"/>
-    <w:bookmarkStart w:id="33" w:name="path-a-the-parquet-contract"/>
+    <w:bookmarkEnd w:id="33"/>
+    <w:bookmarkStart w:id="34" w:name="path-a-the-parquet-contract"/>
     <w:p>
       <w:pPr>
         <w:pStyle w:val="Heading2"/>
@@ -3098,8 +3452,8 @@
         <w:t xml:space="preserve">Path A fails if the contract can’t be produced reliably by 11/07: wrong or missing files, non-repeatable reruns, or runtime the hourly cadence can’t absorb. Fallback: the same transform runs from the Node heartbeat on the EC2 (Jesse OK’d that route on 10/23), so the contract still ships.</w:t>
       </w:r>
     </w:p>
-    <w:bookmarkEnd w:id="33"/>
-    <w:bookmarkStart w:id="34" w:name="path-b-the-s3-tables-trial"/>
+    <w:bookmarkEnd w:id="34"/>
+    <w:bookmarkStart w:id="35" w:name="path-b-the-s3-tables-trial"/>
     <w:p>
       <w:pPr>
         <w:pStyle w:val="Heading2"/>
@@ -3552,8 +3906,8 @@
         <w:t xml:space="preserve">Proposed rule: if B isn’t writing rows that match A by end of day Thu 10/29, it comes out of Monday’s demo, A ships alone, and B resumes only after 11/07 if Scott and Jesse want it.</w:t>
       </w:r>
     </w:p>
-    <w:bookmarkEnd w:id="34"/>
-    <w:bookmarkStart w:id="35" w:name="why-its-worth-doing"/>
+    <w:bookmarkEnd w:id="35"/>
+    <w:bookmarkStart w:id="36" w:name="why-its-worth-doing"/>
     <w:p>
       <w:pPr>
         <w:pStyle w:val="Heading2"/>
@@ -3662,7 +4016,7 @@
         <w:t xml:space="preserve"> </w:t>
       </w:r>
       <w:r>
-        <w:t xml:space="preserve">the manifest format, the quarantine format, Cillian’s lock pattern, the 21-day lookback and the heartbeat.</w:t>
+        <w:t xml:space="preserve">the manifest format, the quarantine format, the one-run-at-a-time rule from Cillian’s Glue jobs, the 21-day lookback and the heartbeat.</w:t>
       </w:r>
     </w:p>
     <w:p>
@@ -3691,8 +4045,8 @@
         <w:t xml:space="preserve">[TBD: AWS estimate. Expected to be small at POC volume: about 14 scheduled runs a day (sandbox hours, weekdays), a few GB in S3; the sandbox already stops nightly.]</w:t>
       </w:r>
     </w:p>
-    <w:bookmarkEnd w:id="35"/>
-    <w:bookmarkStart w:id="36" w:name="not-in-scope-for-monday"/>
+    <w:bookmarkEnd w:id="36"/>
+    <w:bookmarkStart w:id="37" w:name="not-in-scope-for-monday"/>
     <w:p>
       <w:pPr>
         <w:pStyle w:val="Heading2"/>
@@ -3806,8 +4160,8 @@
         <w:t xml:space="preserve">Anything for the new DSP (AdKernel) or its avails stream</w:t>
       </w:r>
     </w:p>
-    <w:bookmarkEnd w:id="36"/>
-    <w:bookmarkStart w:id="37" w:name="decisions-made-and-open-questions"/>
+    <w:bookmarkEnd w:id="37"/>
+    <w:bookmarkStart w:id="38" w:name="decisions-made-and-open-questions"/>
     <w:p>
       <w:pPr>
         <w:pStyle w:val="Heading2"/>
@@ -4137,8 +4491,8 @@
         </w:tc>
       </w:tr>
     </w:tbl>
-    <w:bookmarkEnd w:id="37"/>
-    <w:bookmarkStart w:id="38" w:name="next-steps-after-the-demo"/>
+    <w:bookmarkEnd w:id="38"/>
+    <w:bookmarkStart w:id="39" w:name="next-steps-after-the-demo"/>
     <w:p>
       <w:pPr>
         <w:pStyle w:val="Heading2"/>
@@ -4213,8 +4567,8 @@
         <w:t xml:space="preserve">hand over, with the runbook, and point the warehouse at the contract output.</w:t>
       </w:r>
     </w:p>
-    <w:bookmarkEnd w:id="38"/>
-    <w:bookmarkStart w:id="39" w:name="appendix-sources"/>
+    <w:bookmarkEnd w:id="39"/>
+    <w:bookmarkStart w:id="40" w:name="appendix-sources"/>
     <w:p>
       <w:pPr>
         <w:pStyle w:val="Heading2"/>
@@ -4232,19 +4586,7 @@
         </w:numPr>
       </w:pPr>
       <w:r>
-        <w:t xml:space="preserve">Meeting transcripts: standups 2026-10-20, 10-23, 10-26, 10-27; Scott 1:1s 2026-10-20 and 10-27; Jesse’s email of 2026-10-21 (</w:t>
-      </w:r>
-      <w:r>
-        <w:t xml:space="preserve">“</w:t>
-      </w:r>
-      <w:r>
-        <w:t xml:space="preserve">Programmatic DSP Timeline</w:t>
-      </w:r>
-      <w:r>
-        <w:t xml:space="preserve">”</w:t>
-      </w:r>
-      <w:r>
-        <w:t xml:space="preserve">). Quote-by-quote notes with times:</w:t>
+        <w:t xml:space="preserve">Cillian Kennedy, Slack 2026-10-28 ~11:10: Step Functions</w:t>
       </w:r>
       <w:r>
         <w:t xml:space="preserve"> </w:t>
@@ -4253,10 +4595,28 @@
         <w:rPr>
           <w:rStyle w:val="VerbatimChar"/>
         </w:rPr>
-        <w:t xml:space="preserve">dsp-poc-proposal-evidence-2026-10-28.md</w:t>
-      </w:r>
-      <w:r>
-        <w:t xml:space="preserve">.</w:t>
+        <w:t xml:space="preserve">Retry</w:t>
+      </w:r>
+      <w:r>
+        <w:t xml:space="preserve"> </w:t>
+      </w:r>
+      <w:r>
+        <w:t xml:space="preserve">on</w:t>
+      </w:r>
+      <w:r>
+        <w:t xml:space="preserve"> </w:t>
+      </w:r>
+      <w:r>
+        <w:rPr>
+          <w:rStyle w:val="VerbatimChar"/>
+        </w:rPr>
+        <w:t xml:space="preserve">Glue.ConcurrentRunsExceededException</w:t>
+      </w:r>
+      <w:r>
+        <w:t xml:space="preserve"> </w:t>
+      </w:r>
+      <w:r>
+        <w:t xml:space="preserve">(IntervalSeconds 60, MaxAttempts 20, BackoffRate 2) and Glue job maximum concurrency = 1 (screenshot).</w:t>
       </w:r>
     </w:p>
     <w:p>
@@ -4268,37 +4628,28 @@
         </w:numPr>
       </w:pPr>
       <w:r>
-        <w:t xml:space="preserve">Data: DSP row key specification (</w:t>
+        <w:t xml:space="preserve">Meeting transcripts: standups 2026-10-20, 10-23, 10-26, 10-27; Scott 1:1s 2026-10-20 and 10-27; Jesse’s email of 2026-10-21 (</w:t>
+      </w:r>
+      <w:r>
+        <w:t xml:space="preserve">“</w:t>
+      </w:r>
+      <w:r>
+        <w:t xml:space="preserve">Programmatic DSP Timeline</w:t>
+      </w:r>
+      <w:r>
+        <w:t xml:space="preserve">”</w:t>
+      </w:r>
+      <w:r>
+        <w:t xml:space="preserve">). Quote-by-quote notes with times:</w:t>
+      </w:r>
+      <w:r>
+        <w:t xml:space="preserve"> </w:t>
       </w:r>
       <w:r>
         <w:rPr>
           <w:rStyle w:val="VerbatimChar"/>
         </w:rPr>
-        <w:t xml:space="preserve">dsp-key-spec-2026-10-27</w:t>
-      </w:r>
-      <w:r>
-        <w:t xml:space="preserve">, DTE-132), queries K1-K2;</w:t>
-      </w:r>
-      <w:r>
-        <w:t xml:space="preserve"> </w:t>
-      </w:r>
-      <w:r>
-        <w:rPr>
-          <w:rStyle w:val="VerbatimChar"/>
-        </w:rPr>
-        <w:t xml:space="preserve">transaction-id-verdict-2026-10-20</w:t>
-      </w:r>
-      <w:r>
-        <w:t xml:space="preserve">;</w:t>
-      </w:r>
-      <w:r>
-        <w:t xml:space="preserve"> </w:t>
-      </w:r>
-      <w:r>
-        <w:rPr>
-          <w:rStyle w:val="VerbatimChar"/>
-        </w:rPr>
-        <w:t xml:space="preserve">status-followups-2026-10-21</w:t>
+        <w:t xml:space="preserve">dsp-poc-proposal-evidence-2026-10-28.md</w:t>
       </w:r>
       <w:r>
         <w:t xml:space="preserve">.</w:t>
@@ -4313,6 +4664,51 @@
         </w:numPr>
       </w:pPr>
       <w:r>
+        <w:t xml:space="preserve">Data: DSP row key specification (</w:t>
+      </w:r>
+      <w:r>
+        <w:rPr>
+          <w:rStyle w:val="VerbatimChar"/>
+        </w:rPr>
+        <w:t xml:space="preserve">dsp-key-spec-2026-10-27</w:t>
+      </w:r>
+      <w:r>
+        <w:t xml:space="preserve">, DTE-132), queries K1-K2;</w:t>
+      </w:r>
+      <w:r>
+        <w:t xml:space="preserve"> </w:t>
+      </w:r>
+      <w:r>
+        <w:rPr>
+          <w:rStyle w:val="VerbatimChar"/>
+        </w:rPr>
+        <w:t xml:space="preserve">transaction-id-verdict-2026-10-20</w:t>
+      </w:r>
+      <w:r>
+        <w:t xml:space="preserve">;</w:t>
+      </w:r>
+      <w:r>
+        <w:t xml:space="preserve"> </w:t>
+      </w:r>
+      <w:r>
+        <w:rPr>
+          <w:rStyle w:val="VerbatimChar"/>
+        </w:rPr>
+        <w:t xml:space="preserve">status-followups-2026-10-21</w:t>
+      </w:r>
+      <w:r>
+        <w:t xml:space="preserve">.</w:t>
+      </w:r>
+    </w:p>
+    <w:p>
+      <w:pPr>
+        <w:pStyle w:val="Compact"/>
+        <w:numPr>
+          <w:ilvl w:val="0"/>
+          <w:numId w:val="1007"/>
+        </w:numPr>
+      </w:pPr>
+      <w:r>
         <w:t xml:space="preserve">Design:</w:t>
       </w:r>
       <w:r>
@@ -4343,7 +4739,7 @@
         <w:t xml:space="preserve">.</w:t>
       </w:r>
     </w:p>
-    <w:bookmarkEnd w:id="39"/>
+    <w:bookmarkEnd w:id="40"/>
     <w:sectPr>
       <w:pgMar w:bottom="720" w:footer="432" w:gutter="0" w:header="432" w:left="720" w:right="720" w:top="720"/>
     </w:sectPr>

</xml_diff>

<commit_message>
Plan: lock wording 'runs never overlap'
Co-Authored-By: Claude Opus 5.5 <noreply@anthropic.com>
</commit_message>
<xml_diff>
--- a/docs/dsp-poc-plan-2026-10-28.docx
+++ b/docs/dsp-poc-plan-2026-10-28.docx
@@ -1153,7 +1153,7 @@
               <w:jc w:val="left"/>
             </w:pPr>
             <w:r>
-              <w:t xml:space="preserve">Step Function handles the lock: one run at a time, as Cillian’s Glue jobs do</w:t>
+              <w:t xml:space="preserve">Step Function handles the lock: runs never overlap, as in Cillian’s Glue jobs</w:t>
             </w:r>
           </w:p>
         </w:tc>
@@ -1693,7 +1693,7 @@
         <w:pStyle w:val="FirstParagraph"/>
       </w:pPr>
       <w:r>
-        <w:t xml:space="preserve">Both make sure only one run works at a time. Cillian’s Glue jobs do it with two settings (Cillian, Slack, 10/28): the Glue job’s maximum concurrency is 1, so Glue rejects a second run, and the Step Function retries on that error (every 60 seconds, doubling, up to 20 tries) until the first run finishes. The POC follows the same rule. The difference is what a second run does when one is already going.</w:t>
+        <w:t xml:space="preserve">Both make sure two runs never overlap. Cillian’s Glue jobs do it with two settings (Cillian, Slack, 10/28): the Glue job’s maximum concurrency is 1, so Glue rejects a second run, and the Step Function retries on that error (every 60 seconds, doubling, up to 20 tries) until the first run finishes. The POC follows the same rule. The difference is what a second run does when one is already going.</w:t>
       </w:r>
     </w:p>
     <w:tbl>
@@ -1767,7 +1767,7 @@
               <w:jc w:val="left"/>
             </w:pPr>
             <w:r>
-              <w:t xml:space="preserve">One run at a time</w:t>
+              <w:t xml:space="preserve">Runs never overlap</w:t>
             </w:r>
           </w:p>
         </w:tc>
@@ -1858,7 +1858,7 @@
               <w:jc w:val="left"/>
             </w:pPr>
             <w:r>
-              <w:t xml:space="preserve">The new run waits and retries (60 s, doubling, up to 20 tries)</w:t>
+              <w:t xml:space="preserve">The new run waits and retries (60 s, doubling, up to 20 tries), so runs happen sequentially</w:t>
             </w:r>
           </w:p>
         </w:tc>
@@ -2650,7 +2650,7 @@
               <w:jc w:val="left"/>
             </w:pPr>
             <w:r>
-              <w:t xml:space="preserve">The POC fits the existing heartbeat and reuses the team’s manifest, quarantine format and one-run-at-a-time rule (as in Cillian’s Glue jobs). Adopting it as a template is the team’s decision; the POC provides the evidence.</w:t>
+              <w:t xml:space="preserve">The POC fits the existing heartbeat and reuses the team’s manifest, quarantine format and no-overlapping-runs rule (as in Cillian’s Glue jobs). Adopting it as a template is the team’s decision; the POC provides the evidence.</w:t>
             </w:r>
           </w:p>
         </w:tc>
@@ -4016,7 +4016,7 @@
         <w:t xml:space="preserve"> </w:t>
       </w:r>
       <w:r>
-        <w:t xml:space="preserve">the manifest format, the quarantine format, the one-run-at-a-time rule from Cillian’s Glue jobs, the 21-day lookback and the heartbeat.</w:t>
+        <w:t xml:space="preserve">the manifest format, the quarantine format, the no-overlapping-runs rule from Cillian’s Glue jobs, the 21-day lookback and the heartbeat.</w:t>
       </w:r>
     </w:p>
     <w:p>

</xml_diff>

<commit_message>
Plan: explain ticket references in plain words; narrow assumptions # column
Co-Authored-By: Claude Opus 5.5 <noreply@anthropic.com>
</commit_message>
<xml_diff>
--- a/docs/dsp-poc-plan-2026-10-28.docx
+++ b/docs/dsp-poc-plan-2026-10-28.docx
@@ -2913,9 +2913,9 @@
         <w:tblLook w:firstRow="1" w:lastRow="0" w:firstColumn="0" w:lastColumn="0" w:noHBand="0" w:noVBand="0" w:val="0020"/>
       </w:tblPr>
       <w:tblGrid>
-        <w:gridCol w:w="2640"/>
-        <w:gridCol w:w="2640"/>
-        <w:gridCol w:w="2640"/>
+        <w:gridCol w:w="386"/>
+        <w:gridCol w:w="4636"/>
+        <w:gridCol w:w="2897"/>
       </w:tblGrid>
       <w:tr>
         <w:trPr>
@@ -3017,19 +3017,47 @@
               <w:jc w:val="left"/>
             </w:pPr>
             <w:r>
-              <w:t xml:space="preserve">Key spec D1-D12 holds (DTE-132, awaiting Jesse’s sign-off).</w:t>
-            </w:r>
-          </w:p>
-        </w:tc>
-        <w:tc>
-          <w:tcPr/>
-          <w:p>
-            <w:pPr>
-              <w:pStyle w:val="Compact"/>
-              <w:jc w:val="left"/>
-            </w:pPr>
-            <w:r>
-              <w:t xml:space="preserve">Rule changes are edits inside the transform.</w:t>
+              <w:t xml:space="preserve">The row-key rules hold as written up on 10/27 (key spec, Jira DTE-132). They record Jesse’s decisions from 10/14 to 10/27: the key is the publisher plus the vendor’s</w:t>
+            </w:r>
+            <w:r>
+              <w:t xml:space="preserve"> </w:t>
+            </w:r>
+            <w:r>
+              <w:rPr>
+                <w:rStyle w:val="VerbatimChar"/>
+              </w:rPr>
+              <w:t xml:space="preserve">transaction_id</w:t>
+            </w:r>
+            <w:r>
+              <w:t xml:space="preserve">; only exact duplicates are collapsed; an id reused with different data, or seen under two publishers, is quarantined; Test Account and blank-publisher rows are dropped; no bot, NPI or restatement handling yet; a replay replaces the whole file.</w:t>
+            </w:r>
+            <w:r>
+              <w:t xml:space="preserve"> </w:t>
+            </w:r>
+            <w:r>
+              <w:rPr>
+                <w:b/>
+                <w:bCs/>
+              </w:rPr>
+              <w:t xml:space="preserve">Waiting on:</w:t>
+            </w:r>
+            <w:r>
+              <w:t xml:space="preserve"> </w:t>
+            </w:r>
+            <w:r>
+              <w:t xml:space="preserve">Jesse to confirm the write-up matches what he decided.</w:t>
+            </w:r>
+          </w:p>
+        </w:tc>
+        <w:tc>
+          <w:tcPr/>
+          <w:p>
+            <w:pPr>
+              <w:pStyle w:val="Compact"/>
+              <w:jc w:val="left"/>
+            </w:pPr>
+            <w:r>
+              <w:t xml:space="preserve">If a rule changes, it’s an edit inside the transform; nothing around it changes.</w:t>
             </w:r>
           </w:p>
         </w:tc>
@@ -3169,19 +3197,19 @@
               <w:jc w:val="left"/>
             </w:pPr>
             <w:r>
-              <w:t xml:space="preserve">The POC reads a curated copy of the DSP files in the sandbox until cross-account access (DTE-147) is granted.</w:t>
-            </w:r>
-          </w:p>
-        </w:tc>
-        <w:tc>
-          <w:tcPr/>
-          <w:p>
-            <w:pPr>
-              <w:pStyle w:val="Compact"/>
-              <w:jc w:val="left"/>
-            </w:pPr>
-            <w:r>
-              <w:t xml:space="preserve">A true end to end waits on DTE-147; everything else is unaffected.</w:t>
+              <w:t xml:space="preserve">The POC reads a curated copy of the DSP files in the sandbox until it is granted read access to the live DSP files in the source account (Jira DTE-147).</w:t>
+            </w:r>
+          </w:p>
+        </w:tc>
+        <w:tc>
+          <w:tcPr/>
+          <w:p>
+            <w:pPr>
+              <w:pStyle w:val="Compact"/>
+              <w:jc w:val="left"/>
+            </w:pPr>
+            <w:r>
+              <w:t xml:space="preserve">A true end-to-end run waits on that access; everything else is unaffected.</w:t>
             </w:r>
           </w:p>
         </w:tc>
@@ -4265,6 +4293,32 @@
               <w:jc w:val="left"/>
             </w:pPr>
             <w:r>
+              <w:t xml:space="preserve">Do the row-key rules in A2 match what you decided?</w:t>
+            </w:r>
+          </w:p>
+        </w:tc>
+        <w:tc>
+          <w:tcPr/>
+          <w:p>
+            <w:pPr>
+              <w:pStyle w:val="Compact"/>
+              <w:jc w:val="left"/>
+            </w:pPr>
+            <w:r>
+              <w:t xml:space="preserve">Jesse</w:t>
+            </w:r>
+          </w:p>
+        </w:tc>
+      </w:tr>
+      <w:tr>
+        <w:tc>
+          <w:tcPr/>
+          <w:p>
+            <w:pPr>
+              <w:pStyle w:val="Compact"/>
+              <w:jc w:val="left"/>
+            </w:pPr>
+            <w:r>
               <w:t xml:space="preserve">Six publisher files, or three? If three, what happens to Relevate Games and Office Ally?</w:t>
             </w:r>
           </w:p>
@@ -4473,7 +4527,7 @@
               <w:jc w:val="left"/>
             </w:pPr>
             <w:r>
-              <w:t xml:space="preserve">Cross-account read on the source bucket (DTE-147)</w:t>
+              <w:t xml:space="preserve">Read access for the POC to the live DSP files in the source account (DTE-147): can it be granted, and when?</w:t>
             </w:r>
           </w:p>
         </w:tc>

</xml_diff>

<commit_message>
Plan: Lambda 15-minute limit vs 5-minute working target (lock budget)
Co-Authored-By: Claude Opus 5.5 <noreply@anthropic.com>
</commit_message>
<xml_diff>
--- a/docs/dsp-poc-plan-2026-10-28.docx
+++ b/docs/dsp-poc-plan-2026-10-28.docx
@@ -2979,19 +2979,19 @@
               <w:jc w:val="left"/>
             </w:pPr>
             <w:r>
-              <w:t xml:space="preserve">The largest hour finishes in Lambda in under 5 minutes. Phase 0 measures this first.</w:t>
-            </w:r>
-          </w:p>
-        </w:tc>
-        <w:tc>
-          <w:tcPr/>
-          <w:p>
-            <w:pPr>
-              <w:pStyle w:val="Compact"/>
-              <w:jc w:val="left"/>
-            </w:pPr>
-            <w:r>
-              <w:t xml:space="preserve">The same container image runs on Fargate. No redesign.</w:t>
+              <w:t xml:space="preserve">Each hour fits comfortably in Lambda. Lambda allows up to 15 minutes per call, but a full run (up to 6 hours, 2 at a time, so 3 rounds) must finish inside the 25-minute lock timeout, so the working target is about 5 minutes per hour. Phase 0 measures this first.</w:t>
+            </w:r>
+          </w:p>
+        </w:tc>
+        <w:tc>
+          <w:tcPr/>
+          <w:p>
+            <w:pPr>
+              <w:pStyle w:val="Compact"/>
+              <w:jc w:val="left"/>
+            </w:pPr>
+            <w:r>
+              <w:t xml:space="preserve">In order: tune settings (fewer hours per run, more parallel calls, more Lambda memory); split a large hour into chunks inside the Step Function; or run the same container image on Fargate. No redesign.</w:t>
             </w:r>
           </w:p>
         </w:tc>
@@ -3362,7 +3362,7 @@
         </w:numPr>
       </w:pPr>
       <w:r>
-        <w:t xml:space="preserve">☐ The largest hour finishes in under 5 minutes in Lambda, or the Fargate route works.</w:t>
+        <w:t xml:space="preserve">☐ A full run of 6 hours finishes inside the 25-minute lock timeout (about 5 minutes per hour, well under Lambda’s 15-minute limit), or one of the fallbacks in A1 is shown to work.</w:t>
       </w:r>
     </w:p>
     <w:p>

</xml_diff>

<commit_message>
Plan: simplify Lambda timing wording (5-minute target, 15-minute AWS limit)
Co-Authored-By: Claude Opus 5.5 <noreply@anthropic.com>
</commit_message>
<xml_diff>
--- a/docs/dsp-poc-plan-2026-10-28.docx
+++ b/docs/dsp-poc-plan-2026-10-28.docx
@@ -2979,19 +2979,19 @@
               <w:jc w:val="left"/>
             </w:pPr>
             <w:r>
-              <w:t xml:space="preserve">Each hour fits comfortably in Lambda. Lambda allows up to 15 minutes per call, but a full run (up to 6 hours, 2 at a time, so 3 rounds) must finish inside the 25-minute lock timeout, so the working target is about 5 minutes per hour. Phase 0 measures this first.</w:t>
-            </w:r>
-          </w:p>
-        </w:tc>
-        <w:tc>
-          <w:tcPr/>
-          <w:p>
-            <w:pPr>
-              <w:pStyle w:val="Compact"/>
-              <w:jc w:val="left"/>
-            </w:pPr>
-            <w:r>
-              <w:t xml:space="preserve">In order: tune settings (fewer hours per run, more parallel calls, more Lambda memory); split a large hour into chunks inside the Step Function; or run the same container image on Fargate. No redesign.</w:t>
+              <w:t xml:space="preserve">Each hour finishes in Lambda in under 5 minutes. AWS allows up to 15 minutes, so that leaves about three times the headroom. Phase 0 measures this first.</w:t>
+            </w:r>
+          </w:p>
+        </w:tc>
+        <w:tc>
+          <w:tcPr/>
+          <w:p>
+            <w:pPr>
+              <w:pStyle w:val="Compact"/>
+              <w:jc w:val="left"/>
+            </w:pPr>
+            <w:r>
+              <w:t xml:space="preserve">Tune settings (more Lambda memory, fewer hours per run), split a large hour into chunks, or run the same container image on Fargate. No redesign.</w:t>
             </w:r>
           </w:p>
         </w:tc>
@@ -3362,7 +3362,7 @@
         </w:numPr>
       </w:pPr>
       <w:r>
-        <w:t xml:space="preserve">☐ A full run of 6 hours finishes inside the 25-minute lock timeout (about 5 minutes per hour, well under Lambda’s 15-minute limit), or one of the fallbacks in A1 is shown to work.</w:t>
+        <w:t xml:space="preserve">☐ The largest hour finishes in under 5 minutes in Lambda (AWS allows 15), or one of the fallbacks in A1 is shown to work.</w:t>
       </w:r>
     </w:p>
     <w:p>

</xml_diff>

<commit_message>
Plan: bullets for long paragraphs; add AWS resources table
Note on earlier history: commits 5fa0545, 13b6c74 and f6619fa also swept in
the CheckLock session's uncommitted changes (diagrams/build_dsp_poc_hld.py,
build_dsp_poc_sequence_diagram.py, the HLD .drawio/.png, sequence PNG,
README.md, docs/lambda/dsp-check-lock/README.*). Content is unchanged from
what that session wrote; only the commit messages don't describe it.

Co-Authored-By: Claude Opus 5.5 <noreply@anthropic.com>
</commit_message>
<xml_diff>
--- a/docs/dsp-poc-plan-2026-10-28.docx
+++ b/docs/dsp-poc-plan-2026-10-28.docx
@@ -274,43 +274,145 @@
         <w:pStyle w:val="FirstParagraph"/>
       </w:pPr>
       <w:r>
-        <w:t xml:space="preserve">By Monday 11/02, the DSP v1 pipeline will run end to end in the sandbox. Every hour it takes one gzipped DSP file and produces one clean Parquet file per publisher: keyed, de-duplicated, with bad rows quarantined in the team’s existing format. That is the deliverable (</w:t>
-      </w:r>
+        <w:t xml:space="preserve">By Monday 11/02, the DSP v1 pipeline runs end to end in the sandbox.</w:t>
+      </w:r>
+    </w:p>
+    <w:p>
+      <w:pPr>
+        <w:pStyle w:val="Compact"/>
+        <w:numPr>
+          <w:ilvl w:val="0"/>
+          <w:numId w:val="1001"/>
+        </w:numPr>
+      </w:pPr>
       <w:r>
         <w:rPr>
           <w:b/>
           <w:bCs/>
         </w:rPr>
-        <w:t xml:space="preserve">Path A</w:t>
-      </w:r>
-      <w:r>
-        <w:t xml:space="preserve">), and it becomes the pipe version on 11/07.</w:t>
-      </w:r>
-    </w:p>
-    <w:p>
-      <w:pPr>
-        <w:pStyle w:val="BodyText"/>
-      </w:pPr>
-      <w:r>
-        <w:t xml:space="preserve">Alongside it, the same rows are written to an S3 Tables (Iceberg) table (</w:t>
-      </w:r>
+        <w:t xml:space="preserve">Path A (the deliverable):</w:t>
+      </w:r>
+      <w:r>
+        <w:t xml:space="preserve"> </w:t>
+      </w:r>
+      <w:r>
+        <w:t xml:space="preserve">every hour, one gzipped DSP file becomes one clean Parquet file per publisher.</w:t>
+      </w:r>
+    </w:p>
+    <w:p>
+      <w:pPr>
+        <w:pStyle w:val="Compact"/>
+        <w:numPr>
+          <w:ilvl w:val="1"/>
+          <w:numId w:val="1002"/>
+        </w:numPr>
+      </w:pPr>
+      <w:r>
+        <w:t xml:space="preserve">Keyed and de-duplicated.</w:t>
+      </w:r>
+    </w:p>
+    <w:p>
+      <w:pPr>
+        <w:pStyle w:val="Compact"/>
+        <w:numPr>
+          <w:ilvl w:val="1"/>
+          <w:numId w:val="1002"/>
+        </w:numPr>
+      </w:pPr>
+      <w:r>
+        <w:t xml:space="preserve">Bad rows quarantined in the team’s existing format.</w:t>
+      </w:r>
+    </w:p>
+    <w:p>
+      <w:pPr>
+        <w:pStyle w:val="Compact"/>
+        <w:numPr>
+          <w:ilvl w:val="1"/>
+          <w:numId w:val="1002"/>
+        </w:numPr>
+      </w:pPr>
+      <w:r>
+        <w:t xml:space="preserve">Becomes the pipe version on 11/07.</w:t>
+      </w:r>
+    </w:p>
+    <w:p>
+      <w:pPr>
+        <w:pStyle w:val="Compact"/>
+        <w:numPr>
+          <w:ilvl w:val="0"/>
+          <w:numId w:val="1001"/>
+        </w:numPr>
+      </w:pPr>
       <w:r>
         <w:rPr>
           <w:b/>
           <w:bCs/>
         </w:rPr>
-        <w:t xml:space="preserve">Path B</w:t>
-      </w:r>
-      <w:r>
-        <w:t xml:space="preserve">), so the team can judge S3 Tables on real data, as Jesse asked on 10/23. Path B is time-boxed and can never block Path A: there is one transform and two writers, and nothing on A’s path reads from B.</w:t>
-      </w:r>
-    </w:p>
-    <w:p>
-      <w:pPr>
-        <w:pStyle w:val="BodyText"/>
-      </w:pPr>
-      <w:r>
-        <w:t xml:space="preserve">The DSP-specific logic lives inside the transform and won’t carry over to other feeds. What the POC really tests is everything around it: trigger, lock, fan-out, safe writes, replays, manifest and quarantine, plus a fair storage comparison. If it works, the team gets a candidate template for its other scheduled, file-based feeds.</w:t>
+        <w:t xml:space="preserve">Path B (time-boxed trial):</w:t>
+      </w:r>
+      <w:r>
+        <w:t xml:space="preserve"> </w:t>
+      </w:r>
+      <w:r>
+        <w:t xml:space="preserve">the same rows also go to an S3 Tables (Iceberg) table, so the team can judge S3 Tables on real data (Jesse, 10/23).</w:t>
+      </w:r>
+    </w:p>
+    <w:p>
+      <w:pPr>
+        <w:pStyle w:val="Compact"/>
+        <w:numPr>
+          <w:ilvl w:val="1"/>
+          <w:numId w:val="1003"/>
+        </w:numPr>
+      </w:pPr>
+      <w:r>
+        <w:t xml:space="preserve">One transform, two writers. Nothing on A’s path reads from B, so B can never block A.</w:t>
+      </w:r>
+    </w:p>
+    <w:p>
+      <w:pPr>
+        <w:pStyle w:val="Compact"/>
+        <w:numPr>
+          <w:ilvl w:val="0"/>
+          <w:numId w:val="1001"/>
+        </w:numPr>
+      </w:pPr>
+      <w:r>
+        <w:rPr>
+          <w:b/>
+          <w:bCs/>
+        </w:rPr>
+        <w:t xml:space="preserve">What the POC really tests:</w:t>
+      </w:r>
+      <w:r>
+        <w:t xml:space="preserve"> </w:t>
+      </w:r>
+      <w:r>
+        <w:t xml:space="preserve">the mechanism around the transform: trigger, lock, fan-out, safe writes, replays, manifest, quarantine, plus a fair storage comparison.</w:t>
+      </w:r>
+    </w:p>
+    <w:p>
+      <w:pPr>
+        <w:pStyle w:val="Compact"/>
+        <w:numPr>
+          <w:ilvl w:val="1"/>
+          <w:numId w:val="1004"/>
+        </w:numPr>
+      </w:pPr>
+      <w:r>
+        <w:t xml:space="preserve">The DSP-specific logic lives inside the transform and won’t carry over to other feeds.</w:t>
+      </w:r>
+    </w:p>
+    <w:p>
+      <w:pPr>
+        <w:pStyle w:val="Compact"/>
+        <w:numPr>
+          <w:ilvl w:val="1"/>
+          <w:numId w:val="1004"/>
+        </w:numPr>
+      </w:pPr>
+      <w:r>
+        <w:t xml:space="preserve">If it works, the team gets a candidate template for its other scheduled, file-based feeds.</w:t>
       </w:r>
     </w:p>
     <w:tbl>
@@ -535,7 +637,7 @@
         <w:pStyle w:val="Compact"/>
         <w:numPr>
           <w:ilvl w:val="0"/>
-          <w:numId w:val="1001"/>
+          <w:numId w:val="1005"/>
         </w:numPr>
       </w:pPr>
       <w:r>
@@ -557,7 +659,7 @@
         <w:pStyle w:val="Compact"/>
         <w:numPr>
           <w:ilvl w:val="0"/>
-          <w:numId w:val="1001"/>
+          <w:numId w:val="1005"/>
         </w:numPr>
       </w:pPr>
       <w:r>
@@ -579,7 +681,7 @@
         <w:pStyle w:val="Compact"/>
         <w:numPr>
           <w:ilvl w:val="0"/>
-          <w:numId w:val="1001"/>
+          <w:numId w:val="1005"/>
         </w:numPr>
       </w:pPr>
       <w:r>
@@ -601,7 +703,7 @@
         <w:pStyle w:val="Compact"/>
         <w:numPr>
           <w:ilvl w:val="0"/>
-          <w:numId w:val="1001"/>
+          <w:numId w:val="1005"/>
         </w:numPr>
       </w:pPr>
       <w:r>
@@ -1501,7 +1603,7 @@
       </w:tr>
     </w:tbl>
     <w:bookmarkEnd w:id="23"/>
-    <w:bookmarkStart w:id="28" w:name="what-the-poc-is"/>
+    <w:bookmarkStart w:id="29" w:name="what-the-poc-is"/>
     <w:p>
       <w:pPr>
         <w:pStyle w:val="Heading2"/>
@@ -1578,7 +1680,7 @@
         <w:pStyle w:val="Compact"/>
         <w:numPr>
           <w:ilvl w:val="0"/>
-          <w:numId w:val="1002"/>
+          <w:numId w:val="1006"/>
         </w:numPr>
       </w:pPr>
       <w:r>
@@ -1590,7 +1692,7 @@
         <w:pStyle w:val="Compact"/>
         <w:numPr>
           <w:ilvl w:val="0"/>
-          <w:numId w:val="1002"/>
+          <w:numId w:val="1006"/>
         </w:numPr>
       </w:pPr>
       <w:r>
@@ -1602,7 +1704,7 @@
         <w:pStyle w:val="Compact"/>
         <w:numPr>
           <w:ilvl w:val="0"/>
-          <w:numId w:val="1002"/>
+          <w:numId w:val="1006"/>
         </w:numPr>
       </w:pPr>
       <w:r>
@@ -1614,7 +1716,7 @@
         <w:pStyle w:val="Compact"/>
         <w:numPr>
           <w:ilvl w:val="0"/>
-          <w:numId w:val="1002"/>
+          <w:numId w:val="1006"/>
         </w:numPr>
       </w:pPr>
       <w:r>
@@ -1652,7 +1754,7 @@
         <w:pStyle w:val="Compact"/>
         <w:numPr>
           <w:ilvl w:val="0"/>
-          <w:numId w:val="1002"/>
+          <w:numId w:val="1006"/>
         </w:numPr>
       </w:pPr>
       <w:r>
@@ -1693,7 +1795,75 @@
         <w:pStyle w:val="FirstParagraph"/>
       </w:pPr>
       <w:r>
-        <w:t xml:space="preserve">Both make sure two runs never overlap. Cillian’s Glue jobs do it with two settings (Cillian, Slack, 10/28): the Glue job’s maximum concurrency is 1, so Glue rejects a second run, and the Step Function retries on that error (every 60 seconds, doubling, up to 20 tries) until the first run finishes. The POC follows the same rule. The difference is what a second run does when one is already going.</w:t>
+        <w:t xml:space="preserve">Both make sure two runs never overlap. The difference is what a second run does when one is already going.</w:t>
+      </w:r>
+    </w:p>
+    <w:p>
+      <w:pPr>
+        <w:pStyle w:val="Compact"/>
+        <w:numPr>
+          <w:ilvl w:val="0"/>
+          <w:numId w:val="1007"/>
+        </w:numPr>
+      </w:pPr>
+      <w:r>
+        <w:rPr>
+          <w:b/>
+          <w:bCs/>
+        </w:rPr>
+        <w:t xml:space="preserve">Cillian’s Glue jobs</w:t>
+      </w:r>
+      <w:r>
+        <w:t xml:space="preserve"> </w:t>
+      </w:r>
+      <w:r>
+        <w:t xml:space="preserve">use two settings (Cillian, Slack, 10/28):</w:t>
+      </w:r>
+    </w:p>
+    <w:p>
+      <w:pPr>
+        <w:pStyle w:val="Compact"/>
+        <w:numPr>
+          <w:ilvl w:val="1"/>
+          <w:numId w:val="1008"/>
+        </w:numPr>
+      </w:pPr>
+      <w:r>
+        <w:t xml:space="preserve">The Glue job’s maximum concurrency is 1, so Glue rejects a second run.</w:t>
+      </w:r>
+    </w:p>
+    <w:p>
+      <w:pPr>
+        <w:pStyle w:val="Compact"/>
+        <w:numPr>
+          <w:ilvl w:val="1"/>
+          <w:numId w:val="1008"/>
+        </w:numPr>
+      </w:pPr>
+      <w:r>
+        <w:t xml:space="preserve">The Step Function retries on that error (every 60 seconds, doubling, up to 20 tries) until the first run finishes.</w:t>
+      </w:r>
+    </w:p>
+    <w:p>
+      <w:pPr>
+        <w:pStyle w:val="Compact"/>
+        <w:numPr>
+          <w:ilvl w:val="0"/>
+          <w:numId w:val="1007"/>
+        </w:numPr>
+      </w:pPr>
+      <w:r>
+        <w:rPr>
+          <w:b/>
+          <w:bCs/>
+        </w:rPr>
+        <w:t xml:space="preserve">The POC</w:t>
+      </w:r>
+      <w:r>
+        <w:t xml:space="preserve"> </w:t>
+      </w:r>
+      <w:r>
+        <w:t xml:space="preserve">follows the same rule, but the second run skips instead of waiting.</w:t>
       </w:r>
     </w:p>
     <w:tbl>
@@ -2023,18 +2193,648 @@
           <w:b/>
           <w:bCs/>
         </w:rPr>
-        <w:t xml:space="preserve">Why skip instead of wait.</w:t>
+        <w:t xml:space="preserve">Why skip instead of wait:</w:t>
+      </w:r>
+    </w:p>
+    <w:p>
+      <w:pPr>
+        <w:pStyle w:val="Compact"/>
+        <w:numPr>
+          <w:ilvl w:val="0"/>
+          <w:numId w:val="1009"/>
+        </w:numPr>
+      </w:pPr>
+      <w:r>
+        <w:t xml:space="preserve">Each run works out for itself which hours are still missing, so a skipped run loses nothing.</w:t>
+      </w:r>
+    </w:p>
+    <w:p>
+      <w:pPr>
+        <w:pStyle w:val="Compact"/>
+        <w:numPr>
+          <w:ilvl w:val="0"/>
+          <w:numId w:val="1009"/>
+        </w:numPr>
+      </w:pPr>
+      <w:r>
+        <w:t xml:space="preserve">Waiting would only queue runs behind a slow one.</w:t>
+      </w:r>
+    </w:p>
+    <w:p>
+      <w:pPr>
+        <w:pStyle w:val="Compact"/>
+        <w:numPr>
+          <w:ilvl w:val="0"/>
+          <w:numId w:val="1009"/>
+        </w:numPr>
+      </w:pPr>
+      <w:r>
+        <w:t xml:space="preserve">For a job that processes only the work it was started for, waiting is the right choice, which is why Cillian’s jobs retry.</w:t>
+      </w:r>
+    </w:p>
+    <w:p>
+      <w:pPr>
+        <w:pStyle w:val="Compact"/>
+        <w:numPr>
+          <w:ilvl w:val="0"/>
+          <w:numId w:val="1009"/>
+        </w:numPr>
+      </w:pPr>
+      <w:r>
+        <w:t xml:space="preserve">Edge case: two runs started at the same instant could each see the other and both skip. At an hourly cadence that delays the work by one hour; the next run catches it.</w:t>
+      </w:r>
+    </w:p>
+    <w:bookmarkEnd w:id="27"/>
+    <w:bookmarkStart w:id="28" w:name="what-gets-built-aws-resources"/>
+    <w:p>
+      <w:pPr>
+        <w:pStyle w:val="Heading3"/>
+      </w:pPr>
+      <w:r>
+        <w:t xml:space="preserve">What gets built (AWS resources)</w:t>
+      </w:r>
+    </w:p>
+    <w:p>
+      <w:pPr>
+        <w:pStyle w:val="FirstParagraph"/>
+      </w:pPr>
+      <w:r>
+        <w:t xml:space="preserve">All in the sandbox account, defined in Terraform, with the standard tag set. Names follow the sandbox’s</w:t>
       </w:r>
       <w:r>
         <w:t xml:space="preserve"> </w:t>
       </w:r>
       <w:r>
-        <w:t xml:space="preserve">Each run here works out for itself which hours are still missing, so a skipped run loses nothing, and waiting would only queue runs behind a slow one. For a job that processes only the work it was started for, waiting is the right choice, which is why Cillian’s jobs retry. One small edge: two runs started at the same instant could each see the other and both skip. At an hourly cadence that only delays the work by an hour, and the next run catches it.</w:t>
-      </w:r>
-    </w:p>
-    <w:bookmarkEnd w:id="27"/>
+        <w:rPr>
+          <w:rStyle w:val="VerbatimChar"/>
+        </w:rPr>
+        <w:t xml:space="preserve">rhde-pg-dsp</w:t>
+      </w:r>
+      <w:r>
+        <w:t xml:space="preserve"> </w:t>
+      </w:r>
+      <w:r>
+        <w:t xml:space="preserve">prefix.</w:t>
+      </w:r>
+    </w:p>
+    <w:tbl>
+      <w:tblPr>
+        <w:tblStyle w:val="Table"/>
+        <w:tblW w:type="pct" w:w="5000"/>
+        <w:jc w:val="left"/>
+        <w:tblLayout w:type="fixed"/>
+        <w:tblLook w:firstRow="1" w:lastRow="0" w:firstColumn="0" w:lastColumn="0" w:noHBand="0" w:noVBand="0" w:val="0020"/>
+      </w:tblPr>
+      <w:tblGrid>
+        <w:gridCol w:w="2640"/>
+        <w:gridCol w:w="2640"/>
+        <w:gridCol w:w="2640"/>
+      </w:tblGrid>
+      <w:tr>
+        <w:trPr>
+          <w:tblHeader w:val="on"/>
+        </w:trPr>
+        <w:tc>
+          <w:tcPr/>
+          <w:p>
+            <w:pPr>
+              <w:pStyle w:val="Compact"/>
+              <w:jc w:val="left"/>
+            </w:pPr>
+            <w:r>
+              <w:t xml:space="preserve">Resource</w:t>
+            </w:r>
+          </w:p>
+        </w:tc>
+        <w:tc>
+          <w:tcPr/>
+          <w:p>
+            <w:pPr>
+              <w:pStyle w:val="Compact"/>
+              <w:jc w:val="left"/>
+            </w:pPr>
+            <w:r>
+              <w:t xml:space="preserve">Name (proposed)</w:t>
+            </w:r>
+          </w:p>
+        </w:tc>
+        <w:tc>
+          <w:tcPr/>
+          <w:p>
+            <w:pPr>
+              <w:pStyle w:val="Compact"/>
+              <w:jc w:val="left"/>
+            </w:pPr>
+            <w:r>
+              <w:t xml:space="preserve">Purpose</w:t>
+            </w:r>
+          </w:p>
+        </w:tc>
+      </w:tr>
+      <w:tr>
+        <w:tc>
+          <w:tcPr/>
+          <w:p>
+            <w:pPr>
+              <w:pStyle w:val="Compact"/>
+              <w:jc w:val="left"/>
+            </w:pPr>
+            <w:r>
+              <w:t xml:space="preserve">Source files (read only, not created)</w:t>
+            </w:r>
+          </w:p>
+        </w:tc>
+        <w:tc>
+          <w:tcPr/>
+          <w:p>
+            <w:pPr>
+              <w:pStyle w:val="Compact"/>
+              <w:jc w:val="left"/>
+            </w:pPr>
+            <w:r>
+              <w:rPr>
+                <w:rStyle w:val="VerbatimChar"/>
+              </w:rPr>
+              <w:t xml:space="preserve">relevatehealth-data</w:t>
+            </w:r>
+            <w:r>
+              <w:t xml:space="preserve">,</w:t>
+            </w:r>
+            <w:r>
+              <w:t xml:space="preserve"> </w:t>
+            </w:r>
+            <w:r>
+              <w:rPr>
+                <w:rStyle w:val="VerbatimChar"/>
+              </w:rPr>
+              <w:t xml:space="preserve">home/rh-dsp/pld/</w:t>
+            </w:r>
+            <w:r>
+              <w:t xml:space="preserve">, in the source account</w:t>
+            </w:r>
+            <w:r>
+              <w:t xml:space="preserve"> </w:t>
+            </w:r>
+            <w:r>
+              <w:rPr>
+                <w:b/>
+                <w:bCs/>
+              </w:rPr>
+              <w:t xml:space="preserve">[to confirm]</w:t>
+            </w:r>
+          </w:p>
+        </w:tc>
+        <w:tc>
+          <w:tcPr/>
+          <w:p>
+            <w:pPr>
+              <w:pStyle w:val="Compact"/>
+              <w:jc w:val="left"/>
+            </w:pPr>
+            <w:r>
+              <w:t xml:space="preserve">Live DSP files. Read access pending (DTE-147); until then the POC reads the curated copy in</w:t>
+            </w:r>
+            <w:r>
+              <w:t xml:space="preserve"> </w:t>
+            </w:r>
+            <w:r>
+              <w:rPr>
+                <w:rStyle w:val="VerbatimChar"/>
+              </w:rPr>
+              <w:t xml:space="preserve">rhde-pg-dsp-curated-sandbox</w:t>
+            </w:r>
+            <w:r>
+              <w:t xml:space="preserve">.</w:t>
+            </w:r>
+          </w:p>
+        </w:tc>
+      </w:tr>
+      <w:tr>
+        <w:tc>
+          <w:tcPr/>
+          <w:p>
+            <w:pPr>
+              <w:pStyle w:val="Compact"/>
+              <w:jc w:val="left"/>
+            </w:pPr>
+            <w:r>
+              <w:t xml:space="preserve">S3 bucket (general purpose)</w:t>
+            </w:r>
+          </w:p>
+        </w:tc>
+        <w:tc>
+          <w:tcPr/>
+          <w:p>
+            <w:pPr>
+              <w:pStyle w:val="Compact"/>
+              <w:jc w:val="left"/>
+            </w:pPr>
+            <w:r>
+              <w:rPr>
+                <w:rStyle w:val="VerbatimChar"/>
+              </w:rPr>
+              <w:t xml:space="preserve">rhde-pg-dsp-poc-parquet</w:t>
+            </w:r>
+          </w:p>
+        </w:tc>
+        <w:tc>
+          <w:tcPr/>
+          <w:p>
+            <w:pPr>
+              <w:pStyle w:val="Compact"/>
+              <w:jc w:val="left"/>
+            </w:pPr>
+            <w:r>
+              <w:t xml:space="preserve">Path A output: 6 Parquet files per hour. Proposed folders for the id ledger, manifest and quarantine (team format).</w:t>
+            </w:r>
+          </w:p>
+        </w:tc>
+      </w:tr>
+      <w:tr>
+        <w:tc>
+          <w:tcPr/>
+          <w:p>
+            <w:pPr>
+              <w:pStyle w:val="Compact"/>
+              <w:jc w:val="left"/>
+            </w:pPr>
+            <w:r>
+              <w:t xml:space="preserve">S3 Tables table bucket</w:t>
+            </w:r>
+          </w:p>
+        </w:tc>
+        <w:tc>
+          <w:tcPr/>
+          <w:p>
+            <w:pPr>
+              <w:pStyle w:val="Compact"/>
+              <w:jc w:val="left"/>
+            </w:pPr>
+            <w:r>
+              <w:rPr>
+                <w:rStyle w:val="VerbatimChar"/>
+              </w:rPr>
+              <w:t xml:space="preserve">rhde-pg-dsp-poc-iceberg</w:t>
+            </w:r>
+          </w:p>
+        </w:tc>
+        <w:tc>
+          <w:tcPr/>
+          <w:p>
+            <w:pPr>
+              <w:pStyle w:val="Compact"/>
+              <w:jc w:val="left"/>
+            </w:pPr>
+            <w:r>
+              <w:t xml:space="preserve">Path B output: Iceberg</w:t>
+            </w:r>
+            <w:r>
+              <w:t xml:space="preserve"> </w:t>
+            </w:r>
+            <w:r>
+              <w:rPr>
+                <w:rStyle w:val="VerbatimChar"/>
+              </w:rPr>
+              <w:t xml:space="preserve">events</w:t>
+            </w:r>
+            <w:r>
+              <w:t xml:space="preserve"> </w:t>
+            </w:r>
+            <w:r>
+              <w:t xml:space="preserve">table. A separate bucket type from a normal S3 bucket.</w:t>
+            </w:r>
+          </w:p>
+        </w:tc>
+      </w:tr>
+      <w:tr>
+        <w:tc>
+          <w:tcPr/>
+          <w:p>
+            <w:pPr>
+              <w:pStyle w:val="Compact"/>
+              <w:jc w:val="left"/>
+            </w:pPr>
+            <w:r>
+              <w:t xml:space="preserve">EventBridge Scheduler</w:t>
+            </w:r>
+          </w:p>
+        </w:tc>
+        <w:tc>
+          <w:tcPr/>
+          <w:p>
+            <w:pPr>
+              <w:pStyle w:val="Compact"/>
+              <w:jc w:val="left"/>
+            </w:pPr>
+            <w:r>
+              <w:rPr>
+                <w:rStyle w:val="VerbatimChar"/>
+              </w:rPr>
+              <w:t xml:space="preserve">rhde-pg-dsp-poc-hourly</w:t>
+            </w:r>
+          </w:p>
+        </w:tc>
+        <w:tc>
+          <w:tcPr/>
+          <w:p>
+            <w:pPr>
+              <w:pStyle w:val="Compact"/>
+              <w:jc w:val="left"/>
+            </w:pPr>
+            <w:r>
+              <w:t xml:space="preserve">Hourly trigger; stand-in for the Node heartbeat</w:t>
+            </w:r>
+          </w:p>
+        </w:tc>
+      </w:tr>
+      <w:tr>
+        <w:tc>
+          <w:tcPr/>
+          <w:p>
+            <w:pPr>
+              <w:pStyle w:val="Compact"/>
+              <w:jc w:val="left"/>
+            </w:pPr>
+            <w:r>
+              <w:t xml:space="preserve">Step Functions (Standard)</w:t>
+            </w:r>
+          </w:p>
+        </w:tc>
+        <w:tc>
+          <w:tcPr/>
+          <w:p>
+            <w:pPr>
+              <w:pStyle w:val="Compact"/>
+              <w:jc w:val="left"/>
+            </w:pPr>
+            <w:r>
+              <w:rPr>
+                <w:rStyle w:val="VerbatimChar"/>
+              </w:rPr>
+              <w:t xml:space="preserve">rhde-pg-dsp-poc-pipeline</w:t>
+            </w:r>
+          </w:p>
+        </w:tc>
+        <w:tc>
+          <w:tcPr/>
+          <w:p>
+            <w:pPr>
+              <w:pStyle w:val="Compact"/>
+              <w:jc w:val="left"/>
+            </w:pPr>
+            <w:r>
+              <w:t xml:space="preserve">Lock check, find work, Map (2 at a time), manifest; 25-minute timeout</w:t>
+            </w:r>
+          </w:p>
+        </w:tc>
+      </w:tr>
+      <w:tr>
+        <w:tc>
+          <w:tcPr/>
+          <w:p>
+            <w:pPr>
+              <w:pStyle w:val="Compact"/>
+              <w:jc w:val="left"/>
+            </w:pPr>
+            <w:r>
+              <w:t xml:space="preserve">Lambda</w:t>
+            </w:r>
+          </w:p>
+        </w:tc>
+        <w:tc>
+          <w:tcPr/>
+          <w:p>
+            <w:pPr>
+              <w:pStyle w:val="Compact"/>
+              <w:jc w:val="left"/>
+            </w:pPr>
+            <w:r>
+              <w:rPr>
+                <w:rStyle w:val="VerbatimChar"/>
+              </w:rPr>
+              <w:t xml:space="preserve">rhde-pg-dsp-poc-check-lock</w:t>
+            </w:r>
+          </w:p>
+        </w:tc>
+        <w:tc>
+          <w:tcPr/>
+          <w:p>
+            <w:pPr>
+              <w:pStyle w:val="Compact"/>
+              <w:jc w:val="left"/>
+            </w:pPr>
+            <w:r>
+              <w:t xml:space="preserve">Is another run going? Step Functions read only; no S3 access</w:t>
+            </w:r>
+          </w:p>
+        </w:tc>
+      </w:tr>
+      <w:tr>
+        <w:tc>
+          <w:tcPr/>
+          <w:p>
+            <w:pPr>
+              <w:pStyle w:val="Compact"/>
+              <w:jc w:val="left"/>
+            </w:pPr>
+            <w:r>
+              <w:t xml:space="preserve">Lambda</w:t>
+            </w:r>
+          </w:p>
+        </w:tc>
+        <w:tc>
+          <w:tcPr/>
+          <w:p>
+            <w:pPr>
+              <w:pStyle w:val="Compact"/>
+              <w:jc w:val="left"/>
+            </w:pPr>
+            <w:r>
+              <w:rPr>
+                <w:rStyle w:val="VerbatimChar"/>
+              </w:rPr>
+              <w:t xml:space="preserve">rhde-pg-dsp-poc-find-work</w:t>
+            </w:r>
+          </w:p>
+        </w:tc>
+        <w:tc>
+          <w:tcPr/>
+          <w:p>
+            <w:pPr>
+              <w:pStyle w:val="Compact"/>
+              <w:jc w:val="left"/>
+            </w:pPr>
+            <w:r>
+              <w:t xml:space="preserve">Which hours aren’t done yet; reads S3 only</w:t>
+            </w:r>
+          </w:p>
+        </w:tc>
+      </w:tr>
+      <w:tr>
+        <w:tc>
+          <w:tcPr/>
+          <w:p>
+            <w:pPr>
+              <w:pStyle w:val="Compact"/>
+              <w:jc w:val="left"/>
+            </w:pPr>
+            <w:r>
+              <w:t xml:space="preserve">Lambda (container image) + ECR repository</w:t>
+            </w:r>
+          </w:p>
+        </w:tc>
+        <w:tc>
+          <w:tcPr/>
+          <w:p>
+            <w:pPr>
+              <w:pStyle w:val="Compact"/>
+              <w:jc w:val="left"/>
+            </w:pPr>
+            <w:r>
+              <w:rPr>
+                <w:rStyle w:val="VerbatimChar"/>
+              </w:rPr>
+              <w:t xml:space="preserve">rhde-pg-dsp-poc-transform</w:t>
+            </w:r>
+          </w:p>
+        </w:tc>
+        <w:tc>
+          <w:tcPr/>
+          <w:p>
+            <w:pPr>
+              <w:pStyle w:val="Compact"/>
+              <w:jc w:val="left"/>
+            </w:pPr>
+            <w:r>
+              <w:t xml:space="preserve">Python + DuckDB transform; Writers A and B</w:t>
+            </w:r>
+          </w:p>
+        </w:tc>
+      </w:tr>
+      <w:tr>
+        <w:tc>
+          <w:tcPr/>
+          <w:p>
+            <w:pPr>
+              <w:pStyle w:val="Compact"/>
+              <w:jc w:val="left"/>
+            </w:pPr>
+            <w:r>
+              <w:t xml:space="preserve">Athena workgroup</w:t>
+            </w:r>
+          </w:p>
+        </w:tc>
+        <w:tc>
+          <w:tcPr/>
+          <w:p>
+            <w:pPr>
+              <w:pStyle w:val="Compact"/>
+              <w:jc w:val="left"/>
+            </w:pPr>
+            <w:r>
+              <w:rPr>
+                <w:rStyle w:val="VerbatimChar"/>
+              </w:rPr>
+              <w:t xml:space="preserve">rhde-pg-dsp-poc</w:t>
+            </w:r>
+          </w:p>
+        </w:tc>
+        <w:tc>
+          <w:tcPr/>
+          <w:p>
+            <w:pPr>
+              <w:pStyle w:val="Compact"/>
+              <w:jc w:val="left"/>
+            </w:pPr>
+            <w:r>
+              <w:t xml:space="preserve">Query and compare A and B</w:t>
+            </w:r>
+          </w:p>
+        </w:tc>
+      </w:tr>
+      <w:tr>
+        <w:tc>
+          <w:tcPr/>
+          <w:p>
+            <w:pPr>
+              <w:pStyle w:val="Compact"/>
+              <w:jc w:val="left"/>
+            </w:pPr>
+            <w:r>
+              <w:t xml:space="preserve">IAM roles, CloudWatch log groups</w:t>
+            </w:r>
+          </w:p>
+        </w:tc>
+        <w:tc>
+          <w:tcPr/>
+          <w:p>
+            <w:pPr>
+              <w:pStyle w:val="Compact"/>
+              <w:jc w:val="left"/>
+            </w:pPr>
+            <w:r>
+              <w:t xml:space="preserve">One per component</w:t>
+            </w:r>
+          </w:p>
+        </w:tc>
+        <w:tc>
+          <w:tcPr/>
+          <w:p>
+            <w:pPr>
+              <w:pStyle w:val="Compact"/>
+              <w:jc w:val="left"/>
+            </w:pPr>
+            <w:r>
+              <w:t xml:space="preserve">Least-privilege access; logs</w:t>
+            </w:r>
+          </w:p>
+        </w:tc>
+      </w:tr>
+      <w:tr>
+        <w:tc>
+          <w:tcPr/>
+          <w:p>
+            <w:pPr>
+              <w:pStyle w:val="Compact"/>
+              <w:jc w:val="left"/>
+            </w:pPr>
+            <w:r>
+              <w:t xml:space="preserve">Fargate task (only if needed)</w:t>
+            </w:r>
+          </w:p>
+        </w:tc>
+        <w:tc>
+          <w:tcPr/>
+          <w:p>
+            <w:pPr>
+              <w:pStyle w:val="Compact"/>
+              <w:jc w:val="left"/>
+            </w:pPr>
+            <w:r>
+              <w:rPr>
+                <w:rStyle w:val="VerbatimChar"/>
+              </w:rPr>
+              <w:t xml:space="preserve">rhde-pg-dsp-poc-transform</w:t>
+            </w:r>
+          </w:p>
+        </w:tc>
+        <w:tc>
+          <w:tcPr/>
+          <w:p>
+            <w:pPr>
+              <w:pStyle w:val="Compact"/>
+              <w:jc w:val="left"/>
+            </w:pPr>
+            <w:r>
+              <w:t xml:space="preserve">Fallback if an hour outgrows Lambda (A1)</w:t>
+            </w:r>
+          </w:p>
+        </w:tc>
+      </w:tr>
+    </w:tbl>
     <w:bookmarkEnd w:id="28"/>
-    <w:bookmarkStart w:id="30" w:name="why-these-two-paths"/>
+    <w:bookmarkEnd w:id="29"/>
+    <w:bookmarkStart w:id="31" w:name="why-these-two-paths"/>
     <w:p>
       <w:pPr>
         <w:pStyle w:val="Heading2"/>
@@ -2096,11 +2896,29 @@
         </w:rPr>
         <w:t xml:space="preserve">path.</w:t>
       </w:r>
-      <w:r>
-        <w:t xml:space="preserve"> </w:t>
-      </w:r>
-      <w:r>
-        <w:t xml:space="preserve">It is file in, file out, Parquet, whole-file replacement: the shape the warehouse already reads. Jesse’s caution on 10/26 (</w:t>
+    </w:p>
+    <w:p>
+      <w:pPr>
+        <w:pStyle w:val="Compact"/>
+        <w:numPr>
+          <w:ilvl w:val="0"/>
+          <w:numId w:val="1010"/>
+        </w:numPr>
+      </w:pPr>
+      <w:r>
+        <w:t xml:space="preserve">File in, file out, Parquet, whole-file replacement: the shape the warehouse already reads.</w:t>
+      </w:r>
+    </w:p>
+    <w:p>
+      <w:pPr>
+        <w:pStyle w:val="Compact"/>
+        <w:numPr>
+          <w:ilvl w:val="0"/>
+          <w:numId w:val="1010"/>
+        </w:numPr>
+      </w:pPr>
+      <w:r>
+        <w:t xml:space="preserve">Jesse’s caution on 10/26 (</w:t>
       </w:r>
       <w:r>
         <w:t xml:space="preserve">“</w:t>
@@ -2112,12 +2930,12 @@
         <w:t xml:space="preserve">”</w:t>
       </w:r>
       <w:r>
-        <w:t xml:space="preserve">) is exactly why A stands on its own.</w:t>
-      </w:r>
-    </w:p>
-    <w:p>
-      <w:pPr>
-        <w:pStyle w:val="BodyText"/>
+        <w:t xml:space="preserve">) is why A stands on its own.</w:t>
+      </w:r>
+    </w:p>
+    <w:p>
+      <w:pPr>
+        <w:pStyle w:val="FirstParagraph"/>
       </w:pPr>
       <w:r>
         <w:rPr>
@@ -2126,16 +2944,22 @@
         </w:rPr>
         <w:t xml:space="preserve">Path B is evidence for a decision the team already plans to make.</w:t>
       </w:r>
+    </w:p>
+    <w:p>
+      <w:pPr>
+        <w:pStyle w:val="Compact"/>
+        <w:numPr>
+          <w:ilvl w:val="0"/>
+          <w:numId w:val="1011"/>
+        </w:numPr>
+      </w:pPr>
+      <w:r>
+        <w:t xml:space="preserve">Jesse, 10/20: there will be a data lake; S3 Tables vs Iceberg managed in-house vs Snowflake is a conversation for</w:t>
+      </w:r>
       <w:r>
         <w:t xml:space="preserve"> </w:t>
       </w:r>
       <w:r>
-        <w:t xml:space="preserve">Jesse said on 10/20 that there will be a data lake, and the choice between S3 Tables, Iceberg managed in-house, or Snowflake is a conversation for</w:t>
-      </w:r>
-      <w:r>
-        <w:t xml:space="preserve"> </w:t>
-      </w:r>
-      <w:r>
         <w:t xml:space="preserve">“</w:t>
       </w:r>
       <w:r>
@@ -2145,12 +2969,36 @@
         <w:t xml:space="preserve">”</w:t>
       </w:r>
       <w:r>
-        <w:t xml:space="preserve">. Path B gives that conversation real numbers. Because the transform is shared, B costs one extra writer, not a second pipeline.</w:t>
-      </w:r>
-    </w:p>
-    <w:p>
-      <w:pPr>
-        <w:pStyle w:val="BodyText"/>
+        <w:t xml:space="preserve">.</w:t>
+      </w:r>
+    </w:p>
+    <w:p>
+      <w:pPr>
+        <w:pStyle w:val="Compact"/>
+        <w:numPr>
+          <w:ilvl w:val="0"/>
+          <w:numId w:val="1011"/>
+        </w:numPr>
+      </w:pPr>
+      <w:r>
+        <w:t xml:space="preserve">Path B gives that conversation real numbers.</w:t>
+      </w:r>
+    </w:p>
+    <w:p>
+      <w:pPr>
+        <w:pStyle w:val="Compact"/>
+        <w:numPr>
+          <w:ilvl w:val="0"/>
+          <w:numId w:val="1011"/>
+        </w:numPr>
+      </w:pPr>
+      <w:r>
+        <w:t xml:space="preserve">The transform is shared, so B costs one extra writer, not a second pipeline.</w:t>
+      </w:r>
+    </w:p>
+    <w:p>
+      <w:pPr>
+        <w:pStyle w:val="FirstParagraph"/>
       </w:pPr>
       <w:r>
         <w:rPr>
@@ -2159,16 +3007,34 @@
         </w:rPr>
         <w:t xml:space="preserve">Why build them together.</w:t>
       </w:r>
-      <w:r>
-        <w:t xml:space="preserve"> </w:t>
-      </w:r>
-      <w:r>
-        <w:t xml:space="preserve">The comparison is only fair if both sides get identical input and logic. Building B later would mean re-running the transform and arguing about differences that have nothing to do with storage.</w:t>
-      </w:r>
-    </w:p>
-    <w:p>
-      <w:pPr>
-        <w:pStyle w:val="BodyText"/>
+    </w:p>
+    <w:p>
+      <w:pPr>
+        <w:pStyle w:val="Compact"/>
+        <w:numPr>
+          <w:ilvl w:val="0"/>
+          <w:numId w:val="1012"/>
+        </w:numPr>
+      </w:pPr>
+      <w:r>
+        <w:t xml:space="preserve">The comparison is only fair if both sides get identical input and logic.</w:t>
+      </w:r>
+    </w:p>
+    <w:p>
+      <w:pPr>
+        <w:pStyle w:val="Compact"/>
+        <w:numPr>
+          <w:ilvl w:val="0"/>
+          <w:numId w:val="1012"/>
+        </w:numPr>
+      </w:pPr>
+      <w:r>
+        <w:t xml:space="preserve">Building B later means re-running the transform and arguing about differences that have nothing to do with storage.</w:t>
+      </w:r>
+    </w:p>
+    <w:p>
+      <w:pPr>
+        <w:pStyle w:val="FirstParagraph"/>
       </w:pPr>
       <w:r>
         <w:rPr>
@@ -2177,11 +3043,68 @@
         </w:rPr>
         <w:t xml:space="preserve">Why serverless (Step Functions + Lambda).</w:t>
       </w:r>
+    </w:p>
+    <w:p>
+      <w:pPr>
+        <w:pStyle w:val="Compact"/>
+        <w:numPr>
+          <w:ilvl w:val="0"/>
+          <w:numId w:val="1013"/>
+        </w:numPr>
+      </w:pPr>
+      <w:r>
+        <w:t xml:space="preserve">The work is a bounded, repeatable unit (one file-hour) on a schedule, with no state between runs.</w:t>
+      </w:r>
+    </w:p>
+    <w:p>
+      <w:pPr>
+        <w:pStyle w:val="Compact"/>
+        <w:numPr>
+          <w:ilvl w:val="0"/>
+          <w:numId w:val="1013"/>
+        </w:numPr>
+      </w:pPr>
+      <w:r>
+        <w:t xml:space="preserve">Step Functions gives the lock, retries and run history that would otherwise be hand-built.</w:t>
+      </w:r>
+    </w:p>
+    <w:p>
+      <w:pPr>
+        <w:pStyle w:val="Compact"/>
+        <w:numPr>
+          <w:ilvl w:val="0"/>
+          <w:numId w:val="1013"/>
+        </w:numPr>
+      </w:pPr>
+      <w:r>
+        <w:t xml:space="preserve">A backfill fans out without a cluster.</w:t>
+      </w:r>
+    </w:p>
+    <w:p>
+      <w:pPr>
+        <w:pStyle w:val="Compact"/>
+        <w:numPr>
+          <w:ilvl w:val="0"/>
+          <w:numId w:val="1013"/>
+        </w:numPr>
+      </w:pPr>
+      <w:r>
+        <w:t xml:space="preserve">Fits Jesse’s direction (10/23): after this pipeline,</w:t>
+      </w:r>
       <w:r>
         <w:t xml:space="preserve"> </w:t>
       </w:r>
       <w:r>
-        <w:t xml:space="preserve">The work is a bounded, repeatable unit (one file-hour) on a schedule with no state between runs. Step Functions gives the lock, retries and run history that would otherwise be hand-built, and a backfill fans out without a cluster. It also fits the direction Jesse set on 10/23: after this pipeline,</w:t>
+        <w:t xml:space="preserve">“</w:t>
+      </w:r>
+      <w:r>
+        <w:t xml:space="preserve">get off the single node runtime</w:t>
+      </w:r>
+      <w:r>
+        <w:t xml:space="preserve">”</w:t>
+      </w:r>
+      <w:r>
+        <w:t xml:space="preserve">; the monolith</w:t>
       </w:r>
       <w:r>
         <w:t xml:space="preserve"> </w:t>
@@ -2190,31 +3113,16 @@
         <w:t xml:space="preserve">“</w:t>
       </w:r>
       <w:r>
-        <w:t xml:space="preserve">get off the single node runtime</w:t>
+        <w:t xml:space="preserve">can’t stay a monolith forever</w:t>
       </w:r>
       <w:r>
         <w:t xml:space="preserve">”</w:t>
       </w:r>
       <w:r>
-        <w:t xml:space="preserve">; the monolith</w:t>
-      </w:r>
-      <w:r>
-        <w:t xml:space="preserve"> </w:t>
-      </w:r>
-      <w:r>
-        <w:t xml:space="preserve">“</w:t>
-      </w:r>
-      <w:r>
-        <w:t xml:space="preserve">can’t stay a monolith forever</w:t>
-      </w:r>
-      <w:r>
-        <w:t xml:space="preserve">”</w:t>
-      </w:r>
-      <w:r>
         <w:t xml:space="preserve">.</w:t>
       </w:r>
     </w:p>
-    <w:bookmarkStart w:id="29" w:name="alternatives-considered"/>
+    <w:bookmarkStart w:id="30" w:name="alternatives-considered"/>
     <w:p>
       <w:pPr>
         <w:pStyle w:val="Heading3"/>
@@ -2411,9 +3319,9 @@
         </w:tc>
       </w:tr>
     </w:tbl>
-    <w:bookmarkEnd w:id="29"/>
     <w:bookmarkEnd w:id="30"/>
-    <w:bookmarkStart w:id="32" w:name="addressing-the-concerns-up-front"/>
+    <w:bookmarkEnd w:id="31"/>
+    <w:bookmarkStart w:id="33" w:name="addressing-the-concerns-up-front"/>
     <w:p>
       <w:pPr>
         <w:pStyle w:val="Heading2"/>
@@ -2656,7 +3564,7 @@
         </w:tc>
       </w:tr>
     </w:tbl>
-    <w:bookmarkStart w:id="31" w:name="what-transfers-and-what-doesnt"/>
+    <w:bookmarkStart w:id="32" w:name="what-transfers-and-what-doesnt"/>
     <w:p>
       <w:pPr>
         <w:pStyle w:val="Heading3"/>
@@ -2893,9 +3801,9 @@
         <w:t xml:space="preserve">Not covered by the template: streaming feeds such as the new DSP’s full avails stream, which Scott expects to get its own streaming solution.</w:t>
       </w:r>
     </w:p>
-    <w:bookmarkEnd w:id="31"/>
     <w:bookmarkEnd w:id="32"/>
-    <w:bookmarkStart w:id="33" w:name="assumptions"/>
+    <w:bookmarkEnd w:id="33"/>
+    <w:bookmarkStart w:id="34" w:name="assumptions"/>
     <w:p>
       <w:pPr>
         <w:pStyle w:val="Heading2"/>
@@ -3291,14 +4199,275 @@
         </w:tc>
       </w:tr>
     </w:tbl>
-    <w:bookmarkEnd w:id="33"/>
-    <w:bookmarkStart w:id="34" w:name="path-a-the-parquet-contract"/>
+    <w:bookmarkEnd w:id="34"/>
+    <w:bookmarkStart w:id="35" w:name="path-a-the-parquet-contract"/>
     <w:p>
       <w:pPr>
         <w:pStyle w:val="Heading2"/>
       </w:pPr>
       <w:r>
         <w:t xml:space="preserve">9. Path A: the Parquet contract</w:t>
+      </w:r>
+    </w:p>
+    <w:p>
+      <w:pPr>
+        <w:pStyle w:val="FirstParagraph"/>
+      </w:pPr>
+      <w:r>
+        <w:rPr>
+          <w:b/>
+          <w:bCs/>
+        </w:rPr>
+        <w:t xml:space="preserve">Purpose:</w:t>
+      </w:r>
+    </w:p>
+    <w:p>
+      <w:pPr>
+        <w:pStyle w:val="Compact"/>
+        <w:numPr>
+          <w:ilvl w:val="0"/>
+          <w:numId w:val="1014"/>
+        </w:numPr>
+      </w:pPr>
+      <w:r>
+        <w:t xml:space="preserve">Prove the v1 contract end to end: an hourly DSP file becomes clean Parquet per publisher, with the agreed key, quarantine and replays, on an hourly schedule.</w:t>
+      </w:r>
+    </w:p>
+    <w:p>
+      <w:pPr>
+        <w:pStyle w:val="Compact"/>
+        <w:numPr>
+          <w:ilvl w:val="0"/>
+          <w:numId w:val="1014"/>
+        </w:numPr>
+      </w:pPr>
+      <w:r>
+        <w:t xml:space="preserve">This becomes the 11/07 pipe version.</w:t>
+      </w:r>
+    </w:p>
+    <w:p>
+      <w:pPr>
+        <w:pStyle w:val="FirstParagraph"/>
+      </w:pPr>
+      <w:r>
+        <w:rPr>
+          <w:b/>
+          <w:bCs/>
+        </w:rPr>
+        <w:t xml:space="preserve">What it does, for one hour.</w:t>
+      </w:r>
+      <w:r>
+        <w:t xml:space="preserve"> </w:t>
+      </w:r>
+      <w:r>
+        <w:rPr>
+          <w:b/>
+          <w:bCs/>
+        </w:rPr>
+        <w:t xml:space="preserve">[TBD: worked example from a real hour in the sandbox: rows in, exact duplicates collapsed, quarantined by reason, dropped by rule, rows out per publisher, files written.]</w:t>
+      </w:r>
+    </w:p>
+    <w:p>
+      <w:pPr>
+        <w:pStyle w:val="BodyText"/>
+      </w:pPr>
+      <w:r>
+        <w:rPr>
+          <w:b/>
+          <w:bCs/>
+        </w:rPr>
+        <w:t xml:space="preserve">Success (each pass/fail):</w:t>
+      </w:r>
+    </w:p>
+    <w:p>
+      <w:pPr>
+        <w:pStyle w:val="Compact"/>
+        <w:numPr>
+          <w:ilvl w:val="0"/>
+          <w:numId w:val="1015"/>
+        </w:numPr>
+      </w:pPr>
+      <w:r>
+        <w:t xml:space="preserve">☐ The largest hour finishes in under 5 minutes in Lambda (AWS allows 15), or one of the fallbacks in A1 is shown to work.</w:t>
+      </w:r>
+    </w:p>
+    <w:p>
+      <w:pPr>
+        <w:pStyle w:val="Compact"/>
+        <w:numPr>
+          <w:ilvl w:val="0"/>
+          <w:numId w:val="1015"/>
+        </w:numPr>
+      </w:pPr>
+      <w:r>
+        <w:t xml:space="preserve">☐ One correct Parquet file per publisher per hour, matching the agreed output schema</w:t>
+      </w:r>
+      <w:r>
+        <w:t xml:space="preserve"> </w:t>
+      </w:r>
+      <w:r>
+        <w:rPr>
+          <w:b/>
+          <w:bCs/>
+        </w:rPr>
+        <w:t xml:space="preserve">[TBD: output schema draft, for Jesse and team to review]</w:t>
+      </w:r>
+      <w:r>
+        <w:t xml:space="preserve">. Empty hours produce an empty file, not a missing one.</w:t>
+      </w:r>
+    </w:p>
+    <w:p>
+      <w:pPr>
+        <w:pStyle w:val="Compact"/>
+        <w:numPr>
+          <w:ilvl w:val="0"/>
+          <w:numId w:val="1015"/>
+        </w:numPr>
+      </w:pPr>
+      <w:r>
+        <w:t xml:space="preserve">☐ Rerunning an hour gives identical output, with no duplicates.</w:t>
+      </w:r>
+    </w:p>
+    <w:p>
+      <w:pPr>
+        <w:pStyle w:val="Compact"/>
+        <w:numPr>
+          <w:ilvl w:val="0"/>
+          <w:numId w:val="1015"/>
+        </w:numPr>
+      </w:pPr>
+      <w:r>
+        <w:t xml:space="preserve">☐ An overlapping trigger is discarded, never run twice.</w:t>
+      </w:r>
+    </w:p>
+    <w:p>
+      <w:pPr>
+        <w:pStyle w:val="Compact"/>
+        <w:numPr>
+          <w:ilvl w:val="0"/>
+          <w:numId w:val="1015"/>
+        </w:numPr>
+      </w:pPr>
+      <w:r>
+        <w:t xml:space="preserve">☐ Duplicates, id conflicts and reused ids are counted and quarantined with reasons, in the team’s format.</w:t>
+      </w:r>
+    </w:p>
+    <w:p>
+      <w:pPr>
+        <w:pStyle w:val="Compact"/>
+        <w:numPr>
+          <w:ilvl w:val="0"/>
+          <w:numId w:val="1015"/>
+        </w:numPr>
+      </w:pPr>
+      <w:r>
+        <w:t xml:space="preserve">☐ The dataset-wide id check runs against the full history (~40M ids) within the time target.</w:t>
+      </w:r>
+    </w:p>
+    <w:p>
+      <w:pPr>
+        <w:pStyle w:val="Compact"/>
+        <w:numPr>
+          <w:ilvl w:val="0"/>
+          <w:numId w:val="1015"/>
+        </w:numPr>
+      </w:pPr>
+      <w:r>
+        <w:t xml:space="preserve">☐ Row counts reconcile with the raw files, and every difference has a quarantine reason or a drop rule.</w:t>
+      </w:r>
+    </w:p>
+    <w:p>
+      <w:pPr>
+        <w:pStyle w:val="Compact"/>
+        <w:numPr>
+          <w:ilvl w:val="0"/>
+          <w:numId w:val="1015"/>
+        </w:numPr>
+      </w:pPr>
+      <w:r>
+        <w:t xml:space="preserve">☐ DSP-specific settings (publisher list, checks, output layout) live in config, not in the orchestration.</w:t>
+      </w:r>
+    </w:p>
+    <w:p>
+      <w:pPr>
+        <w:pStyle w:val="FirstParagraph"/>
+      </w:pPr>
+      <w:r>
+        <w:rPr>
+          <w:b/>
+          <w:bCs/>
+        </w:rPr>
+        <w:t xml:space="preserve">Failure, and what happens then:</w:t>
+      </w:r>
+    </w:p>
+    <w:p>
+      <w:pPr>
+        <w:pStyle w:val="Compact"/>
+        <w:numPr>
+          <w:ilvl w:val="0"/>
+          <w:numId w:val="1016"/>
+        </w:numPr>
+      </w:pPr>
+      <w:r>
+        <w:t xml:space="preserve">Path A fails if the contract can’t be produced reliably by 11/07:</w:t>
+      </w:r>
+    </w:p>
+    <w:p>
+      <w:pPr>
+        <w:pStyle w:val="Compact"/>
+        <w:numPr>
+          <w:ilvl w:val="1"/>
+          <w:numId w:val="1017"/>
+        </w:numPr>
+      </w:pPr>
+      <w:r>
+        <w:t xml:space="preserve">wrong or missing files;</w:t>
+      </w:r>
+    </w:p>
+    <w:p>
+      <w:pPr>
+        <w:pStyle w:val="Compact"/>
+        <w:numPr>
+          <w:ilvl w:val="1"/>
+          <w:numId w:val="1017"/>
+        </w:numPr>
+      </w:pPr>
+      <w:r>
+        <w:t xml:space="preserve">reruns that don’t give the same output;</w:t>
+      </w:r>
+    </w:p>
+    <w:p>
+      <w:pPr>
+        <w:pStyle w:val="Compact"/>
+        <w:numPr>
+          <w:ilvl w:val="1"/>
+          <w:numId w:val="1017"/>
+        </w:numPr>
+      </w:pPr>
+      <w:r>
+        <w:t xml:space="preserve">runtime the hourly cadence can’t absorb.</w:t>
+      </w:r>
+    </w:p>
+    <w:p>
+      <w:pPr>
+        <w:pStyle w:val="Compact"/>
+        <w:numPr>
+          <w:ilvl w:val="0"/>
+          <w:numId w:val="1016"/>
+        </w:numPr>
+      </w:pPr>
+      <w:r>
+        <w:t xml:space="preserve">Fallback: the same transform runs from the Node heartbeat on the EC2 (Jesse OK’d that route on 10/23), so the contract still ships.</w:t>
+      </w:r>
+    </w:p>
+    <w:bookmarkEnd w:id="35"/>
+    <w:bookmarkStart w:id="36" w:name="path-b-the-s3-tables-trial"/>
+    <w:p>
+      <w:pPr>
+        <w:pStyle w:val="Heading2"/>
+      </w:pPr>
+      <w:r>
+        <w:t xml:space="preserve">10. Path B: the S3 Tables trial</w:t>
       </w:r>
     </w:p>
     <w:p>
@@ -3316,7 +4485,7 @@
         <w:t xml:space="preserve"> </w:t>
       </w:r>
       <w:r>
-        <w:t xml:space="preserve">Prove the v1 contract works end to end: an hourly DSP file becomes clean Parquet per publisher, with the agreed key, quarantine and replays, on an hourly schedule. This becomes the 11/07 pipe version.</w:t>
+        <w:t xml:space="preserve">Decide whether the team likes S3 Tables, using the same input and logic as A, so storage is the only difference.</w:t>
       </w:r>
     </w:p>
     <w:p>
@@ -3328,200 +4497,17 @@
           <w:b/>
           <w:bCs/>
         </w:rPr>
-        <w:t xml:space="preserve">What it does, for one hour.</w:t>
-      </w:r>
-      <w:r>
-        <w:t xml:space="preserve"> </w:t>
-      </w:r>
-      <w:r>
-        <w:rPr>
-          <w:b/>
-          <w:bCs/>
-        </w:rPr>
-        <w:t xml:space="preserve">[TBD: worked example from a real hour in the sandbox: rows in, exact duplicates collapsed, quarantined by reason, dropped by rule, rows out per publisher, files written.]</w:t>
-      </w:r>
-    </w:p>
-    <w:p>
-      <w:pPr>
-        <w:pStyle w:val="BodyText"/>
-      </w:pPr>
-      <w:r>
-        <w:rPr>
-          <w:b/>
-          <w:bCs/>
-        </w:rPr>
-        <w:t xml:space="preserve">Success (each pass/fail):</w:t>
-      </w:r>
-    </w:p>
-    <w:p>
-      <w:pPr>
-        <w:pStyle w:val="Compact"/>
-        <w:numPr>
-          <w:ilvl w:val="0"/>
-          <w:numId w:val="1003"/>
-        </w:numPr>
-      </w:pPr>
-      <w:r>
-        <w:t xml:space="preserve">☐ The largest hour finishes in under 5 minutes in Lambda (AWS allows 15), or one of the fallbacks in A1 is shown to work.</w:t>
-      </w:r>
-    </w:p>
-    <w:p>
-      <w:pPr>
-        <w:pStyle w:val="Compact"/>
-        <w:numPr>
-          <w:ilvl w:val="0"/>
-          <w:numId w:val="1003"/>
-        </w:numPr>
-      </w:pPr>
-      <w:r>
-        <w:t xml:space="preserve">☐ One correct Parquet file per publisher per hour, matching the agreed output schema</w:t>
-      </w:r>
-      <w:r>
-        <w:t xml:space="preserve"> </w:t>
-      </w:r>
-      <w:r>
-        <w:rPr>
-          <w:b/>
-          <w:bCs/>
-        </w:rPr>
-        <w:t xml:space="preserve">[TBD: output schema draft, for Jesse and team to review]</w:t>
-      </w:r>
-      <w:r>
-        <w:t xml:space="preserve">. Empty hours produce an empty file, not a missing one.</w:t>
-      </w:r>
-    </w:p>
-    <w:p>
-      <w:pPr>
-        <w:pStyle w:val="Compact"/>
-        <w:numPr>
-          <w:ilvl w:val="0"/>
-          <w:numId w:val="1003"/>
-        </w:numPr>
-      </w:pPr>
-      <w:r>
-        <w:t xml:space="preserve">☐ Rerunning an hour gives identical output, with no duplicates.</w:t>
-      </w:r>
-    </w:p>
-    <w:p>
-      <w:pPr>
-        <w:pStyle w:val="Compact"/>
-        <w:numPr>
-          <w:ilvl w:val="0"/>
-          <w:numId w:val="1003"/>
-        </w:numPr>
-      </w:pPr>
-      <w:r>
-        <w:t xml:space="preserve">☐ An overlapping trigger is discarded, never run twice.</w:t>
-      </w:r>
-    </w:p>
-    <w:p>
-      <w:pPr>
-        <w:pStyle w:val="Compact"/>
-        <w:numPr>
-          <w:ilvl w:val="0"/>
-          <w:numId w:val="1003"/>
-        </w:numPr>
-      </w:pPr>
-      <w:r>
-        <w:t xml:space="preserve">☐ Duplicates, id conflicts and reused ids are counted and quarantined with reasons, in the team’s format.</w:t>
-      </w:r>
-    </w:p>
-    <w:p>
-      <w:pPr>
-        <w:pStyle w:val="Compact"/>
-        <w:numPr>
-          <w:ilvl w:val="0"/>
-          <w:numId w:val="1003"/>
-        </w:numPr>
-      </w:pPr>
-      <w:r>
-        <w:t xml:space="preserve">☐ The dataset-wide id check runs against the full history (~40M ids) within the time target.</w:t>
-      </w:r>
-    </w:p>
-    <w:p>
-      <w:pPr>
-        <w:pStyle w:val="Compact"/>
-        <w:numPr>
-          <w:ilvl w:val="0"/>
-          <w:numId w:val="1003"/>
-        </w:numPr>
-      </w:pPr>
-      <w:r>
-        <w:t xml:space="preserve">☐ Row counts reconcile with the raw files, and every difference has a quarantine reason or a drop rule.</w:t>
-      </w:r>
-    </w:p>
-    <w:p>
-      <w:pPr>
-        <w:pStyle w:val="Compact"/>
-        <w:numPr>
-          <w:ilvl w:val="0"/>
-          <w:numId w:val="1003"/>
-        </w:numPr>
-      </w:pPr>
-      <w:r>
-        <w:t xml:space="preserve">☐ DSP-specific settings (publisher list, checks, output layout) live in config, not in the orchestration.</w:t>
-      </w:r>
-    </w:p>
-    <w:p>
-      <w:pPr>
-        <w:pStyle w:val="FirstParagraph"/>
-      </w:pPr>
-      <w:r>
-        <w:rPr>
-          <w:b/>
-          <w:bCs/>
-        </w:rPr>
-        <w:t xml:space="preserve">Failure, and what happens then.</w:t>
-      </w:r>
-      <w:r>
-        <w:t xml:space="preserve"> </w:t>
-      </w:r>
-      <w:r>
-        <w:t xml:space="preserve">Path A fails if the contract can’t be produced reliably by 11/07: wrong or missing files, non-repeatable reruns, or runtime the hourly cadence can’t absorb. Fallback: the same transform runs from the Node heartbeat on the EC2 (Jesse OK’d that route on 10/23), so the contract still ships.</w:t>
-      </w:r>
-    </w:p>
-    <w:bookmarkEnd w:id="34"/>
-    <w:bookmarkStart w:id="35" w:name="path-b-the-s3-tables-trial"/>
-    <w:p>
-      <w:pPr>
-        <w:pStyle w:val="Heading2"/>
-      </w:pPr>
-      <w:r>
-        <w:t xml:space="preserve">10. Path B: the S3 Tables trial</w:t>
-      </w:r>
-    </w:p>
-    <w:p>
-      <w:pPr>
-        <w:pStyle w:val="FirstParagraph"/>
-      </w:pPr>
-      <w:r>
-        <w:rPr>
-          <w:b/>
-          <w:bCs/>
-        </w:rPr>
-        <w:t xml:space="preserve">Purpose.</w:t>
-      </w:r>
-      <w:r>
-        <w:t xml:space="preserve"> </w:t>
-      </w:r>
-      <w:r>
-        <w:t xml:space="preserve">Decide whether the team likes S3 Tables, using the same input and logic as A, so storage is the only difference.</w:t>
-      </w:r>
-    </w:p>
-    <w:p>
-      <w:pPr>
-        <w:pStyle w:val="BodyText"/>
-      </w:pPr>
-      <w:r>
-        <w:rPr>
-          <w:b/>
-          <w:bCs/>
-        </w:rPr>
-        <w:t xml:space="preserve">What it does.</w:t>
-      </w:r>
-      <w:r>
-        <w:t xml:space="preserve"> </w:t>
-      </w:r>
+        <w:t xml:space="preserve">What it does:</w:t>
+      </w:r>
+    </w:p>
+    <w:p>
+      <w:pPr>
+        <w:pStyle w:val="Compact"/>
+        <w:numPr>
+          <w:ilvl w:val="0"/>
+          <w:numId w:val="1018"/>
+        </w:numPr>
+      </w:pPr>
       <w:r>
         <w:t xml:space="preserve">Writes the same rows as A into one</w:t>
       </w:r>
@@ -3538,11 +4524,29 @@
         <w:t xml:space="preserve"> </w:t>
       </w:r>
       <w:r>
-        <w:t xml:space="preserve">table (partitioned by publisher and day, proposed), replacing the rows for a source file on replay, to match A’s whole-file rule.</w:t>
-      </w:r>
-      <w:r>
-        <w:t xml:space="preserve"> </w:t>
-      </w:r>
+        <w:t xml:space="preserve">table (partitioned by publisher and day, proposed).</w:t>
+      </w:r>
+    </w:p>
+    <w:p>
+      <w:pPr>
+        <w:pStyle w:val="Compact"/>
+        <w:numPr>
+          <w:ilvl w:val="0"/>
+          <w:numId w:val="1018"/>
+        </w:numPr>
+      </w:pPr>
+      <w:r>
+        <w:t xml:space="preserve">On replay, replaces the rows for that source file, to match A’s whole-file rule.</w:t>
+      </w:r>
+    </w:p>
+    <w:p>
+      <w:pPr>
+        <w:pStyle w:val="Compact"/>
+        <w:numPr>
+          <w:ilvl w:val="0"/>
+          <w:numId w:val="1018"/>
+        </w:numPr>
+      </w:pPr>
       <w:r>
         <w:rPr>
           <w:rStyle w:val="VerbatimChar"/>
@@ -3558,7 +4562,7 @@
     </w:p>
     <w:p>
       <w:pPr>
-        <w:pStyle w:val="BodyText"/>
+        <w:pStyle w:val="FirstParagraph"/>
       </w:pPr>
       <w:r>
         <w:rPr>
@@ -3879,43 +4883,121 @@
           <w:b/>
           <w:bCs/>
         </w:rPr>
-        <w:t xml:space="preserve">Success.</w:t>
-      </w:r>
-      <w:r>
-        <w:t xml:space="preserve"> </w:t>
-      </w:r>
-      <w:r>
-        <w:t xml:space="preserve">The table is filled in with real numbers, the row counts match A for every hour, and the team has enough to say keep, drop, or revisit at larger scale.</w:t>
-      </w:r>
-    </w:p>
-    <w:p>
-      <w:pPr>
-        <w:pStyle w:val="BodyText"/>
+        <w:t xml:space="preserve">Success:</w:t>
+      </w:r>
+    </w:p>
+    <w:p>
+      <w:pPr>
+        <w:pStyle w:val="Compact"/>
+        <w:numPr>
+          <w:ilvl w:val="0"/>
+          <w:numId w:val="1019"/>
+        </w:numPr>
+      </w:pPr>
+      <w:r>
+        <w:t xml:space="preserve">The table above is filled in with real numbers.</w:t>
+      </w:r>
+    </w:p>
+    <w:p>
+      <w:pPr>
+        <w:pStyle w:val="Compact"/>
+        <w:numPr>
+          <w:ilvl w:val="0"/>
+          <w:numId w:val="1019"/>
+        </w:numPr>
+      </w:pPr>
+      <w:r>
+        <w:t xml:space="preserve">Row counts match A for every hour.</w:t>
+      </w:r>
+    </w:p>
+    <w:p>
+      <w:pPr>
+        <w:pStyle w:val="Compact"/>
+        <w:numPr>
+          <w:ilvl w:val="0"/>
+          <w:numId w:val="1019"/>
+        </w:numPr>
+      </w:pPr>
+      <w:r>
+        <w:t xml:space="preserve">The team has enough to say keep, drop, or revisit at larger scale.</w:t>
+      </w:r>
+    </w:p>
+    <w:p>
+      <w:pPr>
+        <w:pStyle w:val="FirstParagraph"/>
       </w:pPr>
       <w:r>
         <w:rPr>
           <w:b/>
           <w:bCs/>
         </w:rPr>
-        <w:t xml:space="preserve">Reasons to drop it.</w:t>
+        <w:t xml:space="preserve">Reasons to drop it</w:t>
       </w:r>
       <w:r>
         <w:t xml:space="preserve"> </w:t>
       </w:r>
       <w:r>
-        <w:t xml:space="preserve">It threatens A’s dates; replays can’t match the whole-file rule cleanly; the maintenance burden is out of proportion to the benefit at this size. Dropping B costs A nothing.</w:t>
-      </w:r>
-    </w:p>
-    <w:p>
-      <w:pPr>
-        <w:pStyle w:val="BodyText"/>
+        <w:t xml:space="preserve">(dropping B costs A nothing):</w:t>
+      </w:r>
+    </w:p>
+    <w:p>
+      <w:pPr>
+        <w:pStyle w:val="Compact"/>
+        <w:numPr>
+          <w:ilvl w:val="0"/>
+          <w:numId w:val="1020"/>
+        </w:numPr>
+      </w:pPr>
+      <w:r>
+        <w:t xml:space="preserve">It threatens A’s dates.</w:t>
+      </w:r>
+    </w:p>
+    <w:p>
+      <w:pPr>
+        <w:pStyle w:val="Compact"/>
+        <w:numPr>
+          <w:ilvl w:val="0"/>
+          <w:numId w:val="1020"/>
+        </w:numPr>
+      </w:pPr>
+      <w:r>
+        <w:t xml:space="preserve">Replays can’t match the whole-file rule cleanly.</w:t>
+      </w:r>
+    </w:p>
+    <w:p>
+      <w:pPr>
+        <w:pStyle w:val="Compact"/>
+        <w:numPr>
+          <w:ilvl w:val="0"/>
+          <w:numId w:val="1020"/>
+        </w:numPr>
+      </w:pPr>
+      <w:r>
+        <w:t xml:space="preserve">The maintenance burden is out of proportion to the benefit at this size.</w:t>
+      </w:r>
+    </w:p>
+    <w:p>
+      <w:pPr>
+        <w:pStyle w:val="FirstParagraph"/>
       </w:pPr>
       <w:r>
         <w:rPr>
           <w:b/>
           <w:bCs/>
         </w:rPr>
-        <w:t xml:space="preserve">Time-box and stop rule.</w:t>
+        <w:t xml:space="preserve">Time-box and stop rule:</w:t>
+      </w:r>
+    </w:p>
+    <w:p>
+      <w:pPr>
+        <w:pStyle w:val="Compact"/>
+        <w:numPr>
+          <w:ilvl w:val="0"/>
+          <w:numId w:val="1021"/>
+        </w:numPr>
+      </w:pPr>
+      <w:r>
+        <w:t xml:space="preserve">Time-box:</w:t>
       </w:r>
       <w:r>
         <w:t xml:space="preserve"> </w:t>
@@ -3927,15 +5009,45 @@
         </w:rPr>
         <w:t xml:space="preserve">[TBD: Paul’s estimate for Scott.]</w:t>
       </w:r>
-      <w:r>
-        <w:t xml:space="preserve"> </w:t>
-      </w:r>
-      <w:r>
-        <w:t xml:space="preserve">Proposed rule: if B isn’t writing rows that match A by end of day Thu 10/29, it comes out of Monday’s demo, A ships alone, and B resumes only after 11/07 if Scott and Jesse want it.</w:t>
-      </w:r>
-    </w:p>
-    <w:bookmarkEnd w:id="35"/>
-    <w:bookmarkStart w:id="36" w:name="why-its-worth-doing"/>
+    </w:p>
+    <w:p>
+      <w:pPr>
+        <w:pStyle w:val="Compact"/>
+        <w:numPr>
+          <w:ilvl w:val="0"/>
+          <w:numId w:val="1021"/>
+        </w:numPr>
+      </w:pPr>
+      <w:r>
+        <w:t xml:space="preserve">Proposed stop rule: if B isn’t writing rows that match A by end of day Thu 10/29:</w:t>
+      </w:r>
+    </w:p>
+    <w:p>
+      <w:pPr>
+        <w:pStyle w:val="Compact"/>
+        <w:numPr>
+          <w:ilvl w:val="1"/>
+          <w:numId w:val="1022"/>
+        </w:numPr>
+      </w:pPr>
+      <w:r>
+        <w:t xml:space="preserve">it comes out of Monday’s demo and A ships alone;</w:t>
+      </w:r>
+    </w:p>
+    <w:p>
+      <w:pPr>
+        <w:pStyle w:val="Compact"/>
+        <w:numPr>
+          <w:ilvl w:val="1"/>
+          <w:numId w:val="1022"/>
+        </w:numPr>
+      </w:pPr>
+      <w:r>
+        <w:t xml:space="preserve">B resumes only after 11/07, if Scott and Jesse want it.</w:t>
+      </w:r>
+    </w:p>
+    <w:bookmarkEnd w:id="36"/>
+    <w:bookmarkStart w:id="37" w:name="why-its-worth-doing"/>
     <w:p>
       <w:pPr>
         <w:pStyle w:val="Heading2"/>
@@ -3949,7 +5061,7 @@
         <w:pStyle w:val="Compact"/>
         <w:numPr>
           <w:ilvl w:val="0"/>
-          <w:numId w:val="1004"/>
+          <w:numId w:val="1023"/>
         </w:numPr>
       </w:pPr>
       <w:r>
@@ -3971,7 +5083,7 @@
         <w:pStyle w:val="Compact"/>
         <w:numPr>
           <w:ilvl w:val="0"/>
-          <w:numId w:val="1004"/>
+          <w:numId w:val="1023"/>
         </w:numPr>
       </w:pPr>
       <w:r>
@@ -3993,7 +5105,7 @@
         <w:pStyle w:val="Compact"/>
         <w:numPr>
           <w:ilvl w:val="0"/>
-          <w:numId w:val="1004"/>
+          <w:numId w:val="1023"/>
         </w:numPr>
       </w:pPr>
       <w:r>
@@ -4007,7 +5119,7 @@
         <w:t xml:space="preserve"> </w:t>
       </w:r>
       <w:r>
-        <w:t xml:space="preserve">Sandbox only: no production buckets, no changes to the Node service, no reads from the enrichment database. Everything is defined as code, prefixed</w:t>
+        <w:t xml:space="preserve">Sandbox only: no production buckets, no changes to the Node service, no reads from the enrichment database. Everything is defined as code, named</w:t>
       </w:r>
       <w:r>
         <w:t xml:space="preserve"> </w:t>
@@ -4016,21 +5128,21 @@
         <w:rPr>
           <w:rStyle w:val="VerbatimChar"/>
         </w:rPr>
-        <w:t xml:space="preserve">dsp-poc-</w:t>
+        <w:t xml:space="preserve">rhde-pg-dsp-poc-*</w:t>
       </w:r>
       <w:r>
         <w:t xml:space="preserve"> </w:t>
       </w:r>
       <w:r>
-        <w:t xml:space="preserve">and tagged.</w:t>
-      </w:r>
-    </w:p>
-    <w:p>
-      <w:pPr>
-        <w:pStyle w:val="Compact"/>
-        <w:numPr>
-          <w:ilvl w:val="0"/>
-          <w:numId w:val="1004"/>
+        <w:t xml:space="preserve">and tagged (section 5).</w:t>
+      </w:r>
+    </w:p>
+    <w:p>
+      <w:pPr>
+        <w:pStyle w:val="Compact"/>
+        <w:numPr>
+          <w:ilvl w:val="0"/>
+          <w:numId w:val="1023"/>
         </w:numPr>
       </w:pPr>
       <w:r>
@@ -4052,7 +5164,7 @@
         <w:pStyle w:val="Compact"/>
         <w:numPr>
           <w:ilvl w:val="0"/>
-          <w:numId w:val="1004"/>
+          <w:numId w:val="1023"/>
         </w:numPr>
       </w:pPr>
       <w:r>
@@ -4073,8 +5185,8 @@
         <w:t xml:space="preserve">[TBD: AWS estimate. Expected to be small at POC volume: about 14 scheduled runs a day (sandbox hours, weekdays), a few GB in S3; the sandbox already stops nightly.]</w:t>
       </w:r>
     </w:p>
-    <w:bookmarkEnd w:id="36"/>
-    <w:bookmarkStart w:id="37" w:name="not-in-scope-for-monday"/>
+    <w:bookmarkEnd w:id="37"/>
+    <w:bookmarkStart w:id="38" w:name="not-in-scope-for-monday"/>
     <w:p>
       <w:pPr>
         <w:pStyle w:val="Heading2"/>
@@ -4088,7 +5200,7 @@
         <w:pStyle w:val="Compact"/>
         <w:numPr>
           <w:ilvl w:val="0"/>
-          <w:numId w:val="1005"/>
+          <w:numId w:val="1024"/>
         </w:numPr>
       </w:pPr>
       <w:r>
@@ -4100,7 +5212,7 @@
         <w:pStyle w:val="Compact"/>
         <w:numPr>
           <w:ilvl w:val="0"/>
-          <w:numId w:val="1005"/>
+          <w:numId w:val="1024"/>
         </w:numPr>
       </w:pPr>
       <w:r>
@@ -4112,7 +5224,7 @@
         <w:pStyle w:val="Compact"/>
         <w:numPr>
           <w:ilvl w:val="0"/>
-          <w:numId w:val="1005"/>
+          <w:numId w:val="1024"/>
         </w:numPr>
       </w:pPr>
       <w:r>
@@ -4124,7 +5236,7 @@
         <w:pStyle w:val="Compact"/>
         <w:numPr>
           <w:ilvl w:val="0"/>
-          <w:numId w:val="1005"/>
+          <w:numId w:val="1024"/>
         </w:numPr>
       </w:pPr>
       <w:r>
@@ -4136,7 +5248,7 @@
         <w:pStyle w:val="Compact"/>
         <w:numPr>
           <w:ilvl w:val="0"/>
-          <w:numId w:val="1005"/>
+          <w:numId w:val="1024"/>
         </w:numPr>
       </w:pPr>
       <w:r>
@@ -4148,7 +5260,7 @@
         <w:pStyle w:val="Compact"/>
         <w:numPr>
           <w:ilvl w:val="0"/>
-          <w:numId w:val="1005"/>
+          <w:numId w:val="1024"/>
         </w:numPr>
       </w:pPr>
       <w:r>
@@ -4160,7 +5272,7 @@
         <w:pStyle w:val="Compact"/>
         <w:numPr>
           <w:ilvl w:val="0"/>
-          <w:numId w:val="1005"/>
+          <w:numId w:val="1024"/>
         </w:numPr>
       </w:pPr>
       <w:r>
@@ -4181,15 +5293,15 @@
         <w:pStyle w:val="Compact"/>
         <w:numPr>
           <w:ilvl w:val="0"/>
-          <w:numId w:val="1005"/>
+          <w:numId w:val="1024"/>
         </w:numPr>
       </w:pPr>
       <w:r>
         <w:t xml:space="preserve">Anything for the new DSP (AdKernel) or its avails stream</w:t>
       </w:r>
     </w:p>
-    <w:bookmarkEnd w:id="37"/>
-    <w:bookmarkStart w:id="38" w:name="decisions-made-and-open-questions"/>
+    <w:bookmarkEnd w:id="38"/>
+    <w:bookmarkStart w:id="39" w:name="decisions-made-and-open-questions"/>
     <w:p>
       <w:pPr>
         <w:pStyle w:val="Heading2"/>
@@ -4209,11 +5321,53 @@
         </w:rPr>
         <w:t xml:space="preserve">Decided (Paul, 10/27):</w:t>
       </w:r>
-      <w:r>
-        <w:t xml:space="preserve"> </w:t>
-      </w:r>
-      <w:r>
-        <w:t xml:space="preserve">one transform, two writers, A first; id history from a ledger on A’s side, window configurable, default full history; six output files per hour from a config list, every publisher every hour; the lake holds</w:t>
+    </w:p>
+    <w:p>
+      <w:pPr>
+        <w:pStyle w:val="Compact"/>
+        <w:numPr>
+          <w:ilvl w:val="0"/>
+          <w:numId w:val="1025"/>
+        </w:numPr>
+      </w:pPr>
+      <w:r>
+        <w:t xml:space="preserve">One transform, two writers, A first.</w:t>
+      </w:r>
+    </w:p>
+    <w:p>
+      <w:pPr>
+        <w:pStyle w:val="Compact"/>
+        <w:numPr>
+          <w:ilvl w:val="0"/>
+          <w:numId w:val="1025"/>
+        </w:numPr>
+      </w:pPr>
+      <w:r>
+        <w:t xml:space="preserve">Id history from a ledger on A’s side; window configurable, default full history.</w:t>
+      </w:r>
+    </w:p>
+    <w:p>
+      <w:pPr>
+        <w:pStyle w:val="Compact"/>
+        <w:numPr>
+          <w:ilvl w:val="0"/>
+          <w:numId w:val="1025"/>
+        </w:numPr>
+      </w:pPr>
+      <w:r>
+        <w:t xml:space="preserve">Six output files per hour from a config list, every publisher every hour.</w:t>
+      </w:r>
+    </w:p>
+    <w:p>
+      <w:pPr>
+        <w:pStyle w:val="Compact"/>
+        <w:numPr>
+          <w:ilvl w:val="0"/>
+          <w:numId w:val="1025"/>
+        </w:numPr>
+      </w:pPr>
+      <w:r>
+        <w:t xml:space="preserve">The lake holds</w:t>
       </w:r>
       <w:r>
         <w:t xml:space="preserve"> </w:t>
@@ -4228,12 +5382,24 @@
         <w:t xml:space="preserve"> </w:t>
       </w:r>
       <w:r>
-        <w:t xml:space="preserve">only; quarantine stays in the team format.</w:t>
-      </w:r>
-    </w:p>
-    <w:p>
-      <w:pPr>
-        <w:pStyle w:val="BodyText"/>
+        <w:t xml:space="preserve">only.</w:t>
+      </w:r>
+    </w:p>
+    <w:p>
+      <w:pPr>
+        <w:pStyle w:val="Compact"/>
+        <w:numPr>
+          <w:ilvl w:val="0"/>
+          <w:numId w:val="1025"/>
+        </w:numPr>
+      </w:pPr>
+      <w:r>
+        <w:t xml:space="preserve">Quarantine stays in the team format.</w:t>
+      </w:r>
+    </w:p>
+    <w:p>
+      <w:pPr>
+        <w:pStyle w:val="FirstParagraph"/>
       </w:pPr>
       <w:r>
         <w:rPr>
@@ -4527,7 +5693,34 @@
               <w:jc w:val="left"/>
             </w:pPr>
             <w:r>
-              <w:t xml:space="preserve">Read access for the POC to the live DSP files in the source account (DTE-147): can it be granted, and when?</w:t>
+              <w:t xml:space="preserve">Read access for the POC to the live DSP files in the source account (DTE-147): can it be granted, and when? Which bucket holds them:</w:t>
+            </w:r>
+            <w:r>
+              <w:t xml:space="preserve"> </w:t>
+            </w:r>
+            <w:r>
+              <w:rPr>
+                <w:rStyle w:val="VerbatimChar"/>
+              </w:rPr>
+              <w:t xml:space="preserve">relevatehealth-data</w:t>
+            </w:r>
+            <w:r>
+              <w:t xml:space="preserve"> </w:t>
+            </w:r>
+            <w:r>
+              <w:t xml:space="preserve">or</w:t>
+            </w:r>
+            <w:r>
+              <w:t xml:space="preserve"> </w:t>
+            </w:r>
+            <w:r>
+              <w:rPr>
+                <w:rStyle w:val="VerbatimChar"/>
+              </w:rPr>
+              <w:t xml:space="preserve">rh-data-processing</w:t>
+            </w:r>
+            <w:r>
+              <w:t xml:space="preserve">?</w:t>
             </w:r>
           </w:p>
         </w:tc>
@@ -4545,8 +5738,8 @@
         </w:tc>
       </w:tr>
     </w:tbl>
-    <w:bookmarkEnd w:id="38"/>
-    <w:bookmarkStart w:id="39" w:name="next-steps-after-the-demo"/>
+    <w:bookmarkEnd w:id="39"/>
+    <w:bookmarkStart w:id="40" w:name="next-steps-after-the-demo"/>
     <w:p>
       <w:pPr>
         <w:pStyle w:val="Heading2"/>
@@ -4560,7 +5753,7 @@
         <w:pStyle w:val="Compact"/>
         <w:numPr>
           <w:ilvl w:val="0"/>
-          <w:numId w:val="1006"/>
+          <w:numId w:val="1026"/>
         </w:numPr>
       </w:pPr>
       <w:r>
@@ -4582,7 +5775,7 @@
         <w:pStyle w:val="Compact"/>
         <w:numPr>
           <w:ilvl w:val="0"/>
-          <w:numId w:val="1006"/>
+          <w:numId w:val="1026"/>
         </w:numPr>
       </w:pPr>
       <w:r>
@@ -4604,7 +5797,7 @@
         <w:pStyle w:val="Compact"/>
         <w:numPr>
           <w:ilvl w:val="0"/>
-          <w:numId w:val="1006"/>
+          <w:numId w:val="1026"/>
         </w:numPr>
       </w:pPr>
       <w:r>
@@ -4621,8 +5814,8 @@
         <w:t xml:space="preserve">hand over, with the runbook, and point the warehouse at the contract output.</w:t>
       </w:r>
     </w:p>
-    <w:bookmarkEnd w:id="39"/>
-    <w:bookmarkStart w:id="40" w:name="appendix-sources"/>
+    <w:bookmarkEnd w:id="40"/>
+    <w:bookmarkStart w:id="41" w:name="appendix-sources"/>
     <w:p>
       <w:pPr>
         <w:pStyle w:val="Heading2"/>
@@ -4636,7 +5829,7 @@
         <w:pStyle w:val="Compact"/>
         <w:numPr>
           <w:ilvl w:val="0"/>
-          <w:numId w:val="1007"/>
+          <w:numId w:val="1027"/>
         </w:numPr>
       </w:pPr>
       <w:r>
@@ -4678,7 +5871,7 @@
         <w:pStyle w:val="Compact"/>
         <w:numPr>
           <w:ilvl w:val="0"/>
-          <w:numId w:val="1007"/>
+          <w:numId w:val="1027"/>
         </w:numPr>
       </w:pPr>
       <w:r>
@@ -4714,7 +5907,7 @@
         <w:pStyle w:val="Compact"/>
         <w:numPr>
           <w:ilvl w:val="0"/>
-          <w:numId w:val="1007"/>
+          <w:numId w:val="1027"/>
         </w:numPr>
       </w:pPr>
       <w:r>
@@ -4759,7 +5952,7 @@
         <w:pStyle w:val="Compact"/>
         <w:numPr>
           <w:ilvl w:val="0"/>
-          <w:numId w:val="1007"/>
+          <w:numId w:val="1027"/>
         </w:numPr>
       </w:pPr>
       <w:r>
@@ -4793,7 +5986,7 @@
         <w:t xml:space="preserve">.</w:t>
       </w:r>
     </w:p>
-    <w:bookmarkEnd w:id="40"/>
+    <w:bookmarkEnd w:id="41"/>
     <w:sectPr>
       <w:pgMar w:bottom="720" w:footer="432" w:gutter="0" w:header="432" w:left="720" w:right="720" w:top="720"/>
     </w:sectPr>
@@ -5070,34 +6263,7 @@
     <w:abstractNumId w:val="991"/>
   </w:num>
   <w:num w:numId="1002">
-    <w:abstractNumId w:val="99411"/>
-    <w:lvlOverride w:ilvl="0">
-      <w:startOverride w:val="1"/>
-    </w:lvlOverride>
-    <w:lvlOverride w:ilvl="1">
-      <w:startOverride w:val="1"/>
-    </w:lvlOverride>
-    <w:lvlOverride w:ilvl="2">
-      <w:startOverride w:val="1"/>
-    </w:lvlOverride>
-    <w:lvlOverride w:ilvl="3">
-      <w:startOverride w:val="1"/>
-    </w:lvlOverride>
-    <w:lvlOverride w:ilvl="4">
-      <w:startOverride w:val="1"/>
-    </w:lvlOverride>
-    <w:lvlOverride w:ilvl="5">
-      <w:startOverride w:val="1"/>
-    </w:lvlOverride>
-    <w:lvlOverride w:ilvl="6">
-      <w:startOverride w:val="1"/>
-    </w:lvlOverride>
-    <w:lvlOverride w:ilvl="7">
-      <w:startOverride w:val="1"/>
-    </w:lvlOverride>
-    <w:lvlOverride w:ilvl="8">
-      <w:startOverride w:val="1"/>
-    </w:lvlOverride>
+    <w:abstractNumId w:val="991"/>
   </w:num>
   <w:num w:numId="1003">
     <w:abstractNumId w:val="991"/>
@@ -5139,6 +6305,93 @@
     </w:lvlOverride>
   </w:num>
   <w:num w:numId="1007">
+    <w:abstractNumId w:val="991"/>
+  </w:num>
+  <w:num w:numId="1008">
+    <w:abstractNumId w:val="991"/>
+  </w:num>
+  <w:num w:numId="1009">
+    <w:abstractNumId w:val="991"/>
+  </w:num>
+  <w:num w:numId="1010">
+    <w:abstractNumId w:val="991"/>
+  </w:num>
+  <w:num w:numId="1011">
+    <w:abstractNumId w:val="991"/>
+  </w:num>
+  <w:num w:numId="1012">
+    <w:abstractNumId w:val="991"/>
+  </w:num>
+  <w:num w:numId="1013">
+    <w:abstractNumId w:val="991"/>
+  </w:num>
+  <w:num w:numId="1014">
+    <w:abstractNumId w:val="991"/>
+  </w:num>
+  <w:num w:numId="1015">
+    <w:abstractNumId w:val="991"/>
+  </w:num>
+  <w:num w:numId="1016">
+    <w:abstractNumId w:val="991"/>
+  </w:num>
+  <w:num w:numId="1017">
+    <w:abstractNumId w:val="991"/>
+  </w:num>
+  <w:num w:numId="1018">
+    <w:abstractNumId w:val="991"/>
+  </w:num>
+  <w:num w:numId="1019">
+    <w:abstractNumId w:val="991"/>
+  </w:num>
+  <w:num w:numId="1020">
+    <w:abstractNumId w:val="991"/>
+  </w:num>
+  <w:num w:numId="1021">
+    <w:abstractNumId w:val="991"/>
+  </w:num>
+  <w:num w:numId="1022">
+    <w:abstractNumId w:val="991"/>
+  </w:num>
+  <w:num w:numId="1023">
+    <w:abstractNumId w:val="991"/>
+  </w:num>
+  <w:num w:numId="1024">
+    <w:abstractNumId w:val="991"/>
+  </w:num>
+  <w:num w:numId="1025">
+    <w:abstractNumId w:val="991"/>
+  </w:num>
+  <w:num w:numId="1026">
+    <w:abstractNumId w:val="99411"/>
+    <w:lvlOverride w:ilvl="0">
+      <w:startOverride w:val="1"/>
+    </w:lvlOverride>
+    <w:lvlOverride w:ilvl="1">
+      <w:startOverride w:val="1"/>
+    </w:lvlOverride>
+    <w:lvlOverride w:ilvl="2">
+      <w:startOverride w:val="1"/>
+    </w:lvlOverride>
+    <w:lvlOverride w:ilvl="3">
+      <w:startOverride w:val="1"/>
+    </w:lvlOverride>
+    <w:lvlOverride w:ilvl="4">
+      <w:startOverride w:val="1"/>
+    </w:lvlOverride>
+    <w:lvlOverride w:ilvl="5">
+      <w:startOverride w:val="1"/>
+    </w:lvlOverride>
+    <w:lvlOverride w:ilvl="6">
+      <w:startOverride w:val="1"/>
+    </w:lvlOverride>
+    <w:lvlOverride w:ilvl="7">
+      <w:startOverride w:val="1"/>
+    </w:lvlOverride>
+    <w:lvlOverride w:ilvl="8">
+      <w:startOverride w:val="1"/>
+    </w:lvlOverride>
+  </w:num>
+  <w:num w:numId="1027">
     <w:abstractNumId w:val="991"/>
   </w:num>
 </w:numbering>

</xml_diff>